<commit_message>
Restructure draft 5 selection-index text around one storyline
The author found the index Methods/Results too intricate and abstract. The
section now makes one argument throughout: selecting on any methane trait as
it stands, absolute or alternative, is not favourable; a favourable region
does exist; reaching it needs careful weighting of MBW and CO2. Supporting
detail that did not serve that argument (b-window, information-trait and
rg-sensitivity results, supplementary S3/S4) is removed.

Co-Authored-By: Claude Opus 5.5 <noreply@anthropic.com>
Claude-Session: https://claude.ai/code/session_01DZKgRF7U89yEwDoqLzVxjA
</commit_message>
<xml_diff>
--- a/manuscript/revised/Methane_manuscript_draft5.docx
+++ b/manuscript/revised/Methane_manuscript_draft5.docx
@@ -163,7 +163,15 @@
           <w:i w:val="0"/>
           <w:highlight w:val="cyan"/>
         </w:rPr>
-        <w:t xml:space="preserve">Heritability estimates ranged from 0.10 to 0.46. Daily methane was positively genetically correlated with MBW (rg = 0.72), live weight (0.71) and ADG (0.51). Ratio and residual definitions were negatively genetically correlated with their denominator or adjustment traits, while the residual traits remained strongly genetically correlated with absolute methane (rg = 0.78–1.00). In a selection index of CH4, MBW and CO2, methane could be reduced by up to 0.63 g day⁻¹ per generation (selection intensity of 1) without undesirable responses in MBW or CO2. This was achievable both with a linear index of the three traits and with the residual methane traits, when combined with appropriate index weights on MBW and CO2.</w:t>
+        <w:t xml:space="preserve">Heritability estimates ranged from 0.10 to 0.46. Daily methane was positively genetically correlated with MBW (rg = 0.72), live weight (0.71) and ADG (0.51). Ratio and residual definitions were negatively genetically correlated with their denominator or adjustment traits, while the residual traits remained strongly genetically correlated with absolute methane (rg = 0.78–1.00). </w:t>
+      </w:r>
+      <w:r>
+        <w:rPr>
+          <w:b w:val="0"/>
+          <w:i w:val="0"/>
+          <w:highlight w:val="cyan"/>
+        </w:rPr>
+        <w:t xml:space="preserve">In a selection index of CH4, MBW and CO2, selecting on any methane trait as it stands, including alternative traits, reduced MBW or, for the CH4/CO2 ratio, increased methane. A favourable region existed, reducing methane by up to 0.63 g day⁻¹ per generation (selection intensity 1) without undesirable MBW or CO2 responses, but reaching it required appropriate index weights on MBW and CO2 alongside absolute or residual methane.</w:t>
       </w:r>
     </w:p>
     <w:p>
@@ -191,7 +199,15 @@
           <w:i w:val="0"/>
           <w:highlight w:val="cyan"/>
         </w:rPr>
-        <w:t xml:space="preserve">Ratio and residual methane traits remained strongly genetically correlated with absolute methane but differed in their genetic relationships with body size and growth, and therefore in the correlated responses expected in production traits. When these relationships are understood and accounted for, alternative methane traits can be used within a selection index to reduce methane without undesirable responses in body size or CO2 production.</w:t>
+        <w:t xml:space="preserve">Ratio and residual methane traits remained strongly genetically correlated with absolute methane but differed in their genetic relationships with body size and growth, and therefore in the correlated responses expected in production traits. </w:t>
+      </w:r>
+      <w:r>
+        <w:rPr>
+          <w:b w:val="0"/>
+          <w:i w:val="0"/>
+          <w:highlight w:val="cyan"/>
+        </w:rPr>
+        <w:t xml:space="preserve">When these relationships are understood and accounted for, methane can be reduced within a selection index without undesirable responses in body size or CO2 production, although this requires careful weighting, even with alternative methane traits.</w:t>
       </w:r>
     </w:p>
     <w:p>
@@ -1502,17 +1518,9 @@
         <w:rPr>
           <w:b w:val="0"/>
           <w:i w:val="0"/>
-          <w:highlight w:val="green"/>
-        </w:rPr>
-        <w:t xml:space="preserve">The selection index analysis was designed to compare how the absolute, ratio and residual definitions of methane behave when each is used as the methane trait in an index. It was deliberately restricted to methane, metabolic body weight (MBW) and CO2. </w:t>
-      </w:r>
-      <w:r>
-        <w:rPr>
-          <w:b w:val="0"/>
-          <w:i w:val="0"/>
           <w:highlight w:val="cyan"/>
         </w:rPr>
-        <w:t xml:space="preserve">The aim was to understand how alternative methane traits operate within an index, not to estimate the response to selection under a national breeding index.</w:t>
+        <w:t xml:space="preserve">Alternative methane traits are increasingly proposed for use in breeding programmes. The selection index analysis therefore examined how absolute, ratio and residual methane traits themselves operate within an index restricted to methane, metabolic body weight (MBW) and CO2. The aim was to understand the behaviour of these traits, not to estimate the response to selection under a national breeding index.</w:t>
       </w:r>
     </w:p>
     <w:p>
@@ -1536,9 +1544,9 @@
         <w:rPr>
           <w:b w:val="0"/>
           <w:i w:val="0"/>
-          <w:highlight w:val="green"/>
-        </w:rPr>
-        <w:t xml:space="preserve">A Smith–Hazel selection index [44, 21] was used. For information traits CH4, MBW and CO2 recorded on the candidate, index weights are b = P⁻¹Ga, where P and G are the phenotypic and additive genetic (co)variance matrices and a defines the aggregate genotype (the methane goal). The predicted response is ΔG = i·Gb/√(b′Pb), where i is the selection intensity. Responses are reported per generation at i = 1, so that goals can be compared without an assumption about intensity; they scale linearly with i. Values for i = 1.7 and per year (generation interval 2.8 years) are given, for illustration, in Supplementary Table S2.</w:t>
+          <w:highlight w:val="cyan"/>
+        </w:rPr>
+        <w:t xml:space="preserve">Index weights were derived using Smith–Hazel selection index theory [44, 21], with CH4, MBW and CO2 recorded on each selection candidate. The index weights are b = P⁻¹Ga, where P and G are the phenotypic and additive genetic (co)variance matrices of the three traits and a contains the weight on each trait in the breeding goal. The predicted response in each trait is ΔG = i·Gb/√(b′Pb), where i is the selection intensity. Responses are reported per generation at i = 1; values for i = 1.7 and per year (generation interval of 2.8 years) are given in Supplementary Table S2.</w:t>
       </w:r>
     </w:p>
     <w:p>
@@ -1549,9 +1557,9 @@
         <w:rPr>
           <w:b w:val="0"/>
           <w:i w:val="0"/>
-          <w:highlight w:val="green"/>
-        </w:rPr>
-        <w:t xml:space="preserve">Each methane definition was expressed as a goal with coefficients on the breeding values of (CH4, MBW, CO2). Absolute methane was CH4 alone. The genetic residual was CH4 adjusted for MBW and CO2 using the genetic regression (coefficients 0.833 per kg⁰·⁷⁵ and −6.09×10⁻⁵ per g day⁻¹), and the phenotypic residual was the same adjustment using the phenotypic regression (0.423 per kg⁰·⁷⁵ and 0.00371 per g day⁻¹), corresponding to RMTMBW+CO2 in Table 1. Ratio traits were linearised around the trait means: CH4/MBW is proportional to CH4 − (μCH4/μMBW)·MBW, a weight on MBW of 0.810, and CH4/CO2 to CH4 − (μCH4/μCO2)·CO2, a weight on CO2 of 0.0151 per g day⁻¹. In all cases the index was built from the phenotypes of CH4, MBW and CO2.</w:t>
+          <w:highlight w:val="cyan"/>
+        </w:rPr>
+        <w:t xml:space="preserve">Each methane trait was expressed as a breeding goal with weights on CH4, MBW and CO2. Absolute methane placed a weight on CH4 only. The residual traits deducted MBW and CO2 from CH4 using either the genetic regression coefficients (genetic residual; 0.833 per kg⁰·⁷⁵ and −6.09×10⁻⁵ per g day⁻¹) or the phenotypic regression coefficients (phenotypic residual, corresponding to RMTMBW+CO2; 0.423 per kg⁰·⁷⁵ and 0.00371 per g day⁻¹). The ratio traits CH4/MBW and CH4/CO2 were linearised around the trait means, which is equivalent to deducting 0.810 × MBW and 0.0151 × CO2 from CH4, respectively.</w:t>
       </w:r>
     </w:p>
     <w:p>
@@ -1564,7 +1572,7 @@
           <w:i w:val="0"/>
           <w:highlight w:val="cyan"/>
         </w:rPr>
-        <w:t xml:space="preserve">A response was defined as biologically favourable when CH4 declined and neither MBW nor CO2 declined. The responses attainable by any index of the three traits, and the favourable region within them, are shown in Figure 1.</w:t>
+        <w:t xml:space="preserve">Each methane trait was evaluated in two ways. First, it was used as the breeding goal as it stands, with no additional weight on MBW or CO2, which corresponds to selecting on that trait alone. Second, additional weights on MBW and CO2 were added to the goal to determine whether, and with what weights, a favourable response could be reached. A response was defined as favourable when CH4 declined and neither MBW nor CO2 declined. The responses attainable by any index of the three traits, and the favourable region within them, are shown in Figure 1.</w:t>
       </w:r>
     </w:p>
     <w:p>
@@ -8940,9 +8948,9 @@
       </w:pPr>
       <w:r>
         <w:rPr>
-          <w:highlight w:val="green"/>
-        </w:rPr>
-        <w:t xml:space="preserve">Predicted responses when each methane definition is the index goal</w:t>
+          <w:highlight w:val="cyan"/>
+        </w:rPr>
+        <w:t xml:space="preserve">Selecting on each methane trait as it stands</w:t>
       </w:r>
     </w:p>
     <w:p>
@@ -8953,9 +8961,811 @@
         <w:rPr>
           <w:b w:val="0"/>
           <w:i w:val="0"/>
-          <w:highlight w:val="green"/>
-        </w:rPr>
-        <w:t xml:space="preserve">Figure 1 shows the responses in CH4 and MBW that can be attained by any index of CH4, MBW and CO2 at a selection intensity of 1, with the correlated CO2 response shown by colour. The favourable region, in which CH4 falls and MBW does not, is small: it covers about 6.5% of the area enclosed by the ellipse, because CH4 is strongly genetically correlated with both MBW and CO2. Its corners are a CH4 reduction of 0.63 g day⁻¹ with no change in MBW, and an MBW increase of 0.65 kg⁰·⁷⁵ with no change in CH4. Along the frontier bounding the region, the correlated CO2 response was positive, ranging from +10.1 to +64.5 g day⁻¹.</w:t>
+          <w:highlight w:val="cyan"/>
+        </w:rPr>
+        <w:t xml:space="preserve">When each methane trait was used as the breeding goal as it stands, none gave a favourable response (Table 7). Selecting on absolute CH4 gave the largest methane reduction (−1.34 g day⁻¹), but with correlated reductions in MBW (−1.21 kg⁰·⁷⁵) and CO2 (−99.6 g day⁻¹). The residual traits and the CH4/MBW ratio reduced methane by less (−0.71 to −0.87 g day⁻¹), with smaller but still unfavourable declines in MBW (−0.09 to −0.31 kg⁰·⁷⁵). The CH4/CO2 ratio was predicted to increase methane (+0.19 g day⁻¹).</w:t>
+      </w:r>
+    </w:p>
+    <w:p>
+      <w:pPr>
+        <w:keepNext/>
+        <w:jc w:val="both"/>
+      </w:pPr>
+      <w:r>
+        <w:rPr>
+          <w:b/>
+          <w:i w:val="0"/>
+          <w:highlight w:val="cyan"/>
+        </w:rPr>
+        <w:t xml:space="preserve">Table 7. Predicted responses per generation (selection intensity 1) when each methane trait is used as the breeding goal as it stands.</w:t>
+      </w:r>
+    </w:p>
+    <w:tbl>
+      <w:tblPr>
+        <w:tblStyle w:val="PlainTable2"/>
+        <w:tblW w:type="auto" w:w="0"/>
+        <w:tblLook w:firstColumn="1" w:firstRow="1" w:lastColumn="0" w:lastRow="0" w:noHBand="0" w:noVBand="1" w:val="04A0"/>
+      </w:tblPr>
+      <w:tblGrid>
+        <w:gridCol w:w="3900"/>
+        <w:gridCol w:w="1300"/>
+        <w:gridCol w:w="1400"/>
+        <w:gridCol w:w="1300"/>
+        <w:gridCol w:w="1400"/>
+      </w:tblGrid>
+      <w:tr>
+        <w:trPr>
+          <w:cantSplit/>
+        </w:trPr>
+        <w:tc>
+          <w:tcPr>
+            <w:tcW w:type="dxa" w:w="3900"/>
+          </w:tcPr>
+          <w:p>
+            <w:pPr>
+              <w:jc w:val="both"/>
+            </w:pPr>
+            <w:r/>
+            <w:r>
+              <w:rPr>
+                <w:b w:val="0"/>
+                <w:i w:val="0"/>
+                <w:sz w:val="19"/>
+                <w:highlight w:val="green"/>
+              </w:rPr>
+              <w:t xml:space="preserve">Methane goal</w:t>
+            </w:r>
+          </w:p>
+        </w:tc>
+        <w:tc>
+          <w:tcPr>
+            <w:tcW w:type="dxa" w:w="1300"/>
+          </w:tcPr>
+          <w:p>
+            <w:pPr>
+              <w:jc w:val="center"/>
+            </w:pPr>
+            <w:r/>
+            <w:r>
+              <w:rPr>
+                <w:b w:val="0"/>
+                <w:i w:val="0"/>
+                <w:sz w:val="19"/>
+                <w:highlight w:val="green"/>
+              </w:rPr>
+              <w:t xml:space="preserve">ΔCH4 (g day⁻¹)</w:t>
+            </w:r>
+          </w:p>
+        </w:tc>
+        <w:tc>
+          <w:tcPr>
+            <w:tcW w:type="dxa" w:w="1400"/>
+          </w:tcPr>
+          <w:p>
+            <w:pPr>
+              <w:jc w:val="center"/>
+            </w:pPr>
+            <w:r/>
+            <w:r>
+              <w:rPr>
+                <w:b w:val="0"/>
+                <w:i w:val="0"/>
+                <w:sz w:val="19"/>
+                <w:highlight w:val="green"/>
+              </w:rPr>
+              <w:t xml:space="preserve">ΔMBW (kg⁰·⁷⁵)</w:t>
+            </w:r>
+          </w:p>
+        </w:tc>
+        <w:tc>
+          <w:tcPr>
+            <w:tcW w:type="dxa" w:w="1300"/>
+          </w:tcPr>
+          <w:p>
+            <w:pPr>
+              <w:jc w:val="center"/>
+            </w:pPr>
+            <w:r/>
+            <w:r>
+              <w:rPr>
+                <w:b w:val="0"/>
+                <w:i w:val="0"/>
+                <w:sz w:val="19"/>
+                <w:highlight w:val="green"/>
+              </w:rPr>
+              <w:t xml:space="preserve">ΔCO2 (g day⁻¹)</w:t>
+            </w:r>
+          </w:p>
+        </w:tc>
+        <w:tc>
+          <w:tcPr>
+            <w:tcW w:type="dxa" w:w="1400"/>
+          </w:tcPr>
+          <w:p>
+            <w:pPr>
+              <w:jc w:val="center"/>
+            </w:pPr>
+            <w:r/>
+            <w:r>
+              <w:rPr>
+                <w:b w:val="0"/>
+                <w:i w:val="0"/>
+                <w:sz w:val="19"/>
+                <w:highlight w:val="green"/>
+              </w:rPr>
+              <w:t xml:space="preserve">In favourable region</w:t>
+            </w:r>
+          </w:p>
+        </w:tc>
+      </w:tr>
+      <w:tr>
+        <w:trPr>
+          <w:cantSplit/>
+        </w:trPr>
+        <w:tc>
+          <w:tcPr>
+            <w:tcW w:type="dxa" w:w="3900"/>
+          </w:tcPr>
+          <w:p>
+            <w:pPr>
+              <w:jc w:val="both"/>
+            </w:pPr>
+            <w:r/>
+            <w:r>
+              <w:rPr>
+                <w:b w:val="0"/>
+                <w:i w:val="0"/>
+                <w:sz w:val="19"/>
+                <w:highlight w:val="green"/>
+              </w:rPr>
+              <w:t xml:space="preserve">Absolute CH4</w:t>
+            </w:r>
+          </w:p>
+        </w:tc>
+        <w:tc>
+          <w:tcPr>
+            <w:tcW w:type="dxa" w:w="1300"/>
+          </w:tcPr>
+          <w:p>
+            <w:pPr>
+              <w:jc w:val="center"/>
+            </w:pPr>
+            <w:r/>
+            <w:r>
+              <w:rPr>
+                <w:b w:val="0"/>
+                <w:i w:val="0"/>
+                <w:sz w:val="19"/>
+                <w:highlight w:val="green"/>
+              </w:rPr>
+              <w:t xml:space="preserve">−1.34</w:t>
+            </w:r>
+          </w:p>
+        </w:tc>
+        <w:tc>
+          <w:tcPr>
+            <w:tcW w:type="dxa" w:w="1400"/>
+          </w:tcPr>
+          <w:p>
+            <w:pPr>
+              <w:jc w:val="center"/>
+            </w:pPr>
+            <w:r/>
+            <w:r>
+              <w:rPr>
+                <w:b w:val="0"/>
+                <w:i w:val="0"/>
+                <w:sz w:val="19"/>
+                <w:highlight w:val="green"/>
+              </w:rPr>
+              <w:t xml:space="preserve">−1.21</w:t>
+            </w:r>
+          </w:p>
+        </w:tc>
+        <w:tc>
+          <w:tcPr>
+            <w:tcW w:type="dxa" w:w="1300"/>
+          </w:tcPr>
+          <w:p>
+            <w:pPr>
+              <w:jc w:val="center"/>
+            </w:pPr>
+            <w:r/>
+            <w:r>
+              <w:rPr>
+                <w:b w:val="0"/>
+                <w:i w:val="0"/>
+                <w:sz w:val="19"/>
+                <w:highlight w:val="green"/>
+              </w:rPr>
+              <w:t xml:space="preserve">−99.6</w:t>
+            </w:r>
+          </w:p>
+        </w:tc>
+        <w:tc>
+          <w:tcPr>
+            <w:tcW w:type="dxa" w:w="1400"/>
+          </w:tcPr>
+          <w:p>
+            <w:pPr>
+              <w:jc w:val="center"/>
+            </w:pPr>
+            <w:r/>
+            <w:r>
+              <w:rPr>
+                <w:b w:val="0"/>
+                <w:i w:val="0"/>
+                <w:sz w:val="19"/>
+                <w:highlight w:val="green"/>
+              </w:rPr>
+              <w:t xml:space="preserve">No</w:t>
+            </w:r>
+          </w:p>
+        </w:tc>
+      </w:tr>
+      <w:tr>
+        <w:trPr>
+          <w:cantSplit/>
+        </w:trPr>
+        <w:tc>
+          <w:tcPr>
+            <w:tcW w:type="dxa" w:w="3900"/>
+          </w:tcPr>
+          <w:p>
+            <w:pPr>
+              <w:jc w:val="both"/>
+            </w:pPr>
+            <w:r/>
+            <w:r>
+              <w:rPr>
+                <w:b w:val="0"/>
+                <w:i w:val="0"/>
+                <w:sz w:val="19"/>
+                <w:highlight w:val="green"/>
+              </w:rPr>
+              <w:t xml:space="preserve">Genetic residual (CH4 on MBW and CO2)</w:t>
+            </w:r>
+          </w:p>
+        </w:tc>
+        <w:tc>
+          <w:tcPr>
+            <w:tcW w:type="dxa" w:w="1300"/>
+          </w:tcPr>
+          <w:p>
+            <w:pPr>
+              <w:jc w:val="center"/>
+            </w:pPr>
+            <w:r/>
+            <w:r>
+              <w:rPr>
+                <w:b w:val="0"/>
+                <w:i w:val="0"/>
+                <w:sz w:val="19"/>
+                <w:highlight w:val="green"/>
+              </w:rPr>
+              <w:t xml:space="preserve">−0.71</w:t>
+            </w:r>
+          </w:p>
+        </w:tc>
+        <w:tc>
+          <w:tcPr>
+            <w:tcW w:type="dxa" w:w="1400"/>
+          </w:tcPr>
+          <w:p>
+            <w:pPr>
+              <w:jc w:val="center"/>
+            </w:pPr>
+            <w:r/>
+            <w:r>
+              <w:rPr>
+                <w:b w:val="0"/>
+                <w:i w:val="0"/>
+                <w:sz w:val="19"/>
+                <w:highlight w:val="green"/>
+              </w:rPr>
+              <w:t xml:space="preserve">−0.09</w:t>
+            </w:r>
+          </w:p>
+        </w:tc>
+        <w:tc>
+          <w:tcPr>
+            <w:tcW w:type="dxa" w:w="1300"/>
+          </w:tcPr>
+          <w:p>
+            <w:pPr>
+              <w:jc w:val="center"/>
+            </w:pPr>
+            <w:r/>
+            <w:r>
+              <w:rPr>
+                <w:b w:val="0"/>
+                <w:i w:val="0"/>
+                <w:sz w:val="19"/>
+                <w:highlight w:val="green"/>
+              </w:rPr>
+              <w:t xml:space="preserve">+2.0</w:t>
+            </w:r>
+          </w:p>
+        </w:tc>
+        <w:tc>
+          <w:tcPr>
+            <w:tcW w:type="dxa" w:w="1400"/>
+          </w:tcPr>
+          <w:p>
+            <w:pPr>
+              <w:jc w:val="center"/>
+            </w:pPr>
+            <w:r/>
+            <w:r>
+              <w:rPr>
+                <w:b w:val="0"/>
+                <w:i w:val="0"/>
+                <w:sz w:val="19"/>
+                <w:highlight w:val="green"/>
+              </w:rPr>
+              <w:t xml:space="preserve">No</w:t>
+            </w:r>
+          </w:p>
+        </w:tc>
+      </w:tr>
+      <w:tr>
+        <w:trPr>
+          <w:cantSplit/>
+        </w:trPr>
+        <w:tc>
+          <w:tcPr>
+            <w:tcW w:type="dxa" w:w="3900"/>
+          </w:tcPr>
+          <w:p>
+            <w:pPr>
+              <w:jc w:val="both"/>
+            </w:pPr>
+            <w:r/>
+            <w:r>
+              <w:rPr>
+                <w:b w:val="0"/>
+                <w:i w:val="0"/>
+                <w:sz w:val="19"/>
+                <w:highlight w:val="green"/>
+              </w:rPr>
+              <w:t xml:space="preserve">Phenotypic residual (CH4 on MBW and CO2)</w:t>
+            </w:r>
+          </w:p>
+        </w:tc>
+        <w:tc>
+          <w:tcPr>
+            <w:tcW w:type="dxa" w:w="1300"/>
+          </w:tcPr>
+          <w:p>
+            <w:pPr>
+              <w:jc w:val="center"/>
+            </w:pPr>
+            <w:r/>
+            <w:r>
+              <w:rPr>
+                <w:b w:val="0"/>
+                <w:i w:val="0"/>
+                <w:sz w:val="19"/>
+                <w:highlight w:val="green"/>
+              </w:rPr>
+              <w:t xml:space="preserve">−0.87</w:t>
+            </w:r>
+          </w:p>
+        </w:tc>
+        <w:tc>
+          <w:tcPr>
+            <w:tcW w:type="dxa" w:w="1400"/>
+          </w:tcPr>
+          <w:p>
+            <w:pPr>
+              <w:jc w:val="center"/>
+            </w:pPr>
+            <w:r/>
+            <w:r>
+              <w:rPr>
+                <w:b w:val="0"/>
+                <w:i w:val="0"/>
+                <w:sz w:val="19"/>
+                <w:highlight w:val="green"/>
+              </w:rPr>
+              <w:t xml:space="preserve">−0.31</w:t>
+            </w:r>
+          </w:p>
+        </w:tc>
+        <w:tc>
+          <w:tcPr>
+            <w:tcW w:type="dxa" w:w="1300"/>
+          </w:tcPr>
+          <w:p>
+            <w:pPr>
+              <w:jc w:val="center"/>
+            </w:pPr>
+            <w:r/>
+            <w:r>
+              <w:rPr>
+                <w:b w:val="0"/>
+                <w:i w:val="0"/>
+                <w:sz w:val="19"/>
+                <w:highlight w:val="green"/>
+              </w:rPr>
+              <w:t xml:space="preserve">−9.8</w:t>
+            </w:r>
+          </w:p>
+        </w:tc>
+        <w:tc>
+          <w:tcPr>
+            <w:tcW w:type="dxa" w:w="1400"/>
+          </w:tcPr>
+          <w:p>
+            <w:pPr>
+              <w:jc w:val="center"/>
+            </w:pPr>
+            <w:r/>
+            <w:r>
+              <w:rPr>
+                <w:b w:val="0"/>
+                <w:i w:val="0"/>
+                <w:sz w:val="19"/>
+                <w:highlight w:val="green"/>
+              </w:rPr>
+              <w:t xml:space="preserve">No</w:t>
+            </w:r>
+          </w:p>
+        </w:tc>
+      </w:tr>
+      <w:tr>
+        <w:trPr>
+          <w:cantSplit/>
+        </w:trPr>
+        <w:tc>
+          <w:tcPr>
+            <w:tcW w:type="dxa" w:w="3900"/>
+          </w:tcPr>
+          <w:p>
+            <w:pPr>
+              <w:jc w:val="both"/>
+            </w:pPr>
+            <w:r/>
+            <w:r>
+              <w:rPr>
+                <w:b w:val="0"/>
+                <w:i w:val="0"/>
+                <w:sz w:val="19"/>
+                <w:highlight w:val="green"/>
+              </w:rPr>
+              <w:t xml:space="preserve">Ratio CH4/MBW (linearised)</w:t>
+            </w:r>
+          </w:p>
+        </w:tc>
+        <w:tc>
+          <w:tcPr>
+            <w:tcW w:type="dxa" w:w="1300"/>
+          </w:tcPr>
+          <w:p>
+            <w:pPr>
+              <w:jc w:val="center"/>
+            </w:pPr>
+            <w:r/>
+            <w:r>
+              <w:rPr>
+                <w:b w:val="0"/>
+                <w:i w:val="0"/>
+                <w:sz w:val="19"/>
+                <w:highlight w:val="green"/>
+              </w:rPr>
+              <w:t xml:space="preserve">−0.75</w:t>
+            </w:r>
+          </w:p>
+        </w:tc>
+        <w:tc>
+          <w:tcPr>
+            <w:tcW w:type="dxa" w:w="1400"/>
+          </w:tcPr>
+          <w:p>
+            <w:pPr>
+              <w:jc w:val="center"/>
+            </w:pPr>
+            <w:r/>
+            <w:r>
+              <w:rPr>
+                <w:b w:val="0"/>
+                <w:i w:val="0"/>
+                <w:sz w:val="19"/>
+                <w:highlight w:val="green"/>
+              </w:rPr>
+              <w:t xml:space="preserve">−0.14</w:t>
+            </w:r>
+          </w:p>
+        </w:tc>
+        <w:tc>
+          <w:tcPr>
+            <w:tcW w:type="dxa" w:w="1300"/>
+          </w:tcPr>
+          <w:p>
+            <w:pPr>
+              <w:jc w:val="center"/>
+            </w:pPr>
+            <w:r/>
+            <w:r>
+              <w:rPr>
+                <w:b w:val="0"/>
+                <w:i w:val="0"/>
+                <w:sz w:val="19"/>
+                <w:highlight w:val="green"/>
+              </w:rPr>
+              <w:t xml:space="preserve">−2.4</w:t>
+            </w:r>
+          </w:p>
+        </w:tc>
+        <w:tc>
+          <w:tcPr>
+            <w:tcW w:type="dxa" w:w="1400"/>
+          </w:tcPr>
+          <w:p>
+            <w:pPr>
+              <w:jc w:val="center"/>
+            </w:pPr>
+            <w:r/>
+            <w:r>
+              <w:rPr>
+                <w:b w:val="0"/>
+                <w:i w:val="0"/>
+                <w:sz w:val="19"/>
+                <w:highlight w:val="green"/>
+              </w:rPr>
+              <w:t xml:space="preserve">No</w:t>
+            </w:r>
+          </w:p>
+        </w:tc>
+      </w:tr>
+      <w:tr>
+        <w:trPr>
+          <w:cantSplit/>
+        </w:trPr>
+        <w:tc>
+          <w:tcPr>
+            <w:tcW w:type="dxa" w:w="3900"/>
+          </w:tcPr>
+          <w:p>
+            <w:pPr>
+              <w:jc w:val="both"/>
+            </w:pPr>
+            <w:r/>
+            <w:r>
+              <w:rPr>
+                <w:b w:val="0"/>
+                <w:i w:val="0"/>
+                <w:sz w:val="19"/>
+                <w:highlight w:val="green"/>
+              </w:rPr>
+              <w:t xml:space="preserve">Ratio CH4/CO2 (linearised)</w:t>
+            </w:r>
+          </w:p>
+        </w:tc>
+        <w:tc>
+          <w:tcPr>
+            <w:tcW w:type="dxa" w:w="1300"/>
+          </w:tcPr>
+          <w:p>
+            <w:pPr>
+              <w:jc w:val="center"/>
+            </w:pPr>
+            <w:r/>
+            <w:r>
+              <w:rPr>
+                <w:b w:val="0"/>
+                <w:i w:val="0"/>
+                <w:sz w:val="19"/>
+                <w:highlight w:val="green"/>
+              </w:rPr>
+              <w:t xml:space="preserve">+0.19</w:t>
+            </w:r>
+          </w:p>
+        </w:tc>
+        <w:tc>
+          <w:tcPr>
+            <w:tcW w:type="dxa" w:w="1400"/>
+          </w:tcPr>
+          <w:p>
+            <w:pPr>
+              <w:jc w:val="center"/>
+            </w:pPr>
+            <w:r/>
+            <w:r>
+              <w:rPr>
+                <w:b w:val="0"/>
+                <w:i w:val="0"/>
+                <w:sz w:val="19"/>
+                <w:highlight w:val="green"/>
+              </w:rPr>
+              <w:t xml:space="preserve">+0.72</w:t>
+            </w:r>
+          </w:p>
+        </w:tc>
+        <w:tc>
+          <w:tcPr>
+            <w:tcW w:type="dxa" w:w="1300"/>
+          </w:tcPr>
+          <w:p>
+            <w:pPr>
+              <w:jc w:val="center"/>
+            </w:pPr>
+            <w:r/>
+            <w:r>
+              <w:rPr>
+                <w:b w:val="0"/>
+                <w:i w:val="0"/>
+                <w:sz w:val="19"/>
+                <w:highlight w:val="green"/>
+              </w:rPr>
+              <w:t xml:space="preserve">+88.3</w:t>
+            </w:r>
+          </w:p>
+        </w:tc>
+        <w:tc>
+          <w:tcPr>
+            <w:tcW w:type="dxa" w:w="1400"/>
+          </w:tcPr>
+          <w:p>
+            <w:pPr>
+              <w:jc w:val="center"/>
+            </w:pPr>
+            <w:r/>
+            <w:r>
+              <w:rPr>
+                <w:b w:val="0"/>
+                <w:i w:val="0"/>
+                <w:sz w:val="19"/>
+                <w:highlight w:val="green"/>
+              </w:rPr>
+              <w:t xml:space="preserve">No</w:t>
+            </w:r>
+          </w:p>
+        </w:tc>
+      </w:tr>
+      <w:tr>
+        <w:trPr>
+          <w:cantSplit/>
+        </w:trPr>
+        <w:tc>
+          <w:tcPr>
+            <w:tcW w:type="dxa" w:w="3900"/>
+          </w:tcPr>
+          <w:p>
+            <w:pPr>
+              <w:jc w:val="both"/>
+            </w:pPr>
+            <w:r/>
+            <w:r>
+              <w:rPr>
+                <w:b/>
+                <w:i w:val="0"/>
+                <w:sz w:val="19"/>
+                <w:highlight w:val="green"/>
+              </w:rPr>
+              <w:t xml:space="preserve">Reference: CH4 reduced with MBW held at zero (restricted index)</w:t>
+            </w:r>
+          </w:p>
+        </w:tc>
+        <w:tc>
+          <w:tcPr>
+            <w:tcW w:type="dxa" w:w="1300"/>
+          </w:tcPr>
+          <w:p>
+            <w:pPr>
+              <w:jc w:val="center"/>
+            </w:pPr>
+            <w:r/>
+            <w:r>
+              <w:rPr>
+                <w:b/>
+                <w:i w:val="0"/>
+                <w:sz w:val="19"/>
+                <w:highlight w:val="green"/>
+              </w:rPr>
+              <w:t xml:space="preserve">−0.63</w:t>
+            </w:r>
+          </w:p>
+        </w:tc>
+        <w:tc>
+          <w:tcPr>
+            <w:tcW w:type="dxa" w:w="1400"/>
+          </w:tcPr>
+          <w:p>
+            <w:pPr>
+              <w:jc w:val="center"/>
+            </w:pPr>
+            <w:r/>
+            <w:r>
+              <w:rPr>
+                <w:b/>
+                <w:i w:val="0"/>
+                <w:sz w:val="19"/>
+                <w:highlight w:val="green"/>
+              </w:rPr>
+              <w:t xml:space="preserve">0.00</w:t>
+            </w:r>
+          </w:p>
+        </w:tc>
+        <w:tc>
+          <w:tcPr>
+            <w:tcW w:type="dxa" w:w="1300"/>
+          </w:tcPr>
+          <w:p>
+            <w:pPr>
+              <w:jc w:val="center"/>
+            </w:pPr>
+            <w:r/>
+            <w:r>
+              <w:rPr>
+                <w:b/>
+                <w:i w:val="0"/>
+                <w:sz w:val="19"/>
+                <w:highlight w:val="green"/>
+              </w:rPr>
+              <w:t xml:space="preserve">+10.0</w:t>
+            </w:r>
+          </w:p>
+        </w:tc>
+        <w:tc>
+          <w:tcPr>
+            <w:tcW w:type="dxa" w:w="1400"/>
+          </w:tcPr>
+          <w:p>
+            <w:pPr>
+              <w:jc w:val="center"/>
+            </w:pPr>
+            <w:r/>
+            <w:r>
+              <w:rPr>
+                <w:b/>
+                <w:i w:val="0"/>
+                <w:sz w:val="19"/>
+                <w:highlight w:val="green"/>
+              </w:rPr>
+              <w:t xml:space="preserve">Yes (boundary)</w:t>
+            </w:r>
+          </w:p>
+        </w:tc>
+      </w:tr>
+    </w:tbl>
+    <w:p/>
+    <w:p>
+      <w:pPr>
+        <w:jc w:val="both"/>
+      </w:pPr>
+      <w:r>
+        <w:rPr>
+          <w:b w:val="0"/>
+          <w:i/>
+          <w:sz w:val="20"/>
+          <w:highlight w:val="cyan"/>
+        </w:rPr>
+        <w:t xml:space="preserve">Indices used the phenotypes of CH4, MBW and CO2. Favourable: CH4 reduced, MBW and CO2 not reduced. Ratios are linearised around the trait means. The final row is the largest favourable response, for comparison (Figure 1; Table 8).</w:t>
+      </w:r>
+    </w:p>
+    <w:p>
+      <w:pPr>
+        <w:pStyle w:val="Sub-subheading"/>
+      </w:pPr>
+      <w:r>
+        <w:rPr>
+          <w:highlight w:val="cyan"/>
+        </w:rPr>
+        <w:t xml:space="preserve">Reaching the favourable region</w:t>
+      </w:r>
+    </w:p>
+    <w:p>
+      <w:pPr>
+        <w:jc w:val="both"/>
+      </w:pPr>
+      <w:r>
+        <w:rPr>
+          <w:b w:val="0"/>
+          <w:i w:val="0"/>
+          <w:highlight w:val="cyan"/>
+        </w:rPr>
+        <w:t xml:space="preserve">A favourable region, in which CH4 is reduced without a decline in MBW, does exist (Figure 1), and along its boundary the correlated CO2 response was also positive (+10.1 to +64.5 g day⁻¹). The region is small, covering about 6.5% of the area of attainable responses in Figure 1, because CH4 is strongly genetically correlated with both MBW and CO2. The largest favourable methane reduction was −0.63 g day⁻¹, 47% of the response to selection on absolute CH4, obtained from an index restricted to zero MBW response (Kempthorne and Nordskog [43]; related to the desired-gains approach [41]), with a CO2 increase of 10.0 g day⁻¹.</w:t>
       </w:r>
     </w:p>
     <w:p>
@@ -9006,20 +9816,9 @@
         <w:rPr>
           <w:b/>
           <w:i w:val="0"/>
-          <w:highlight w:val="green"/>
-        </w:rPr>
-        <w:t xml:space="preserve">Figure 1.</w:t>
-      </w:r>
-      <w:r>
-        <w:t xml:space="preserve"> </w:t>
-      </w:r>
-      <w:r>
-        <w:rPr>
-          <w:b w:val="0"/>
-          <w:i w:val="0"/>
-          <w:highlight w:val="green"/>
-        </w:rPr>
-        <w:t xml:space="preserve">Frontier of attainable responses in methane (CH4) and metabolic body weight (MBW) under a Smith–Hazel index of CH4, MBW and CO2, per generation at selection intensity 1. Each point on the ellipse is the response to the index that is optimal for one goal in the CH4–MBW plane; colour shows the correlated response in CO2 (g day⁻¹). The shaded area is the favourable region (CH4 reduced, MBW not reduced); the correlated CO2 response along the frontier bounding it is +10.1 to +64.5 g day⁻¹.</w:t>
+          <w:highlight w:val="cyan"/>
+        </w:rPr>
+        <w:t xml:space="preserve">Figure 1. Responses in methane (CH4) and metabolic body weight (MBW) attainable per generation (selection intensity 1) by any index of CH4, MBW and CO2. Colour shows the correlated response in CO2 (g day⁻¹). The shaded area is the favourable region, in which CH4 is reduced and MBW is not; the CO2 response along its boundary is positive (+10.1 to +64.5 g day⁻¹).</w:t>
       </w:r>
     </w:p>
     <w:p>
@@ -9030,25 +9829,9 @@
         <w:rPr>
           <w:b w:val="0"/>
           <w:i w:val="0"/>
-          <w:highlight w:val="green"/>
-        </w:rPr>
-        <w:t xml:space="preserve">Table 7 gives the predicted responses when each methane definition, as defined, is the index goal. Selecting on absolute CH4 gave the largest methane reduction (−1.34 g day⁻¹) but with correlated reductions in MBW (−1.21 kg⁰·⁷⁵) and CO2 (−99.6 g day⁻¹). The genetic-residual and CH4/MBW ratio definitions reduced methane less (−0.71 and −0.75 g day⁻¹) but with a much smaller decline in MBW (−0.09 and −0.14 kg⁰·⁷⁵) and little change in CO2 (+2.0 and −2.4 g day⁻¹). The phenotypic residual reduced CH4 by 0.87 g day⁻¹ with declines of 0.31 kg⁰·⁷⁵ in MBW and 9.8 g day⁻¹ in CO2. The CH4/CO2 ratio was predicted to increase methane (+0.19 g day⁻¹) while raising MBW (+0.72) and CO2 (+88.3). None of the definitions, as defined, fell in the favourable region. The largest favourable methane reduction, −0.63 g day⁻¹ (47% of the unconstrained response), </w:t>
-      </w:r>
-      <w:r>
-        <w:rPr>
-          <w:b w:val="0"/>
-          <w:i w:val="0"/>
           <w:highlight w:val="cyan"/>
         </w:rPr>
-        <w:t xml:space="preserve">was obtained from an index restricted to zero MBW response (Kempthorne and Nordskog [43]; related to the desired-gains approach [41]),</w:t>
-      </w:r>
-      <w:r>
-        <w:rPr>
-          <w:b w:val="0"/>
-          <w:i w:val="0"/>
-          <w:highlight w:val="green"/>
-        </w:rPr>
-        <w:t xml:space="preserve"> and was accompanied by a CO2 increase of 10.0 g day⁻¹.</w:t>
+        <w:t xml:space="preserve">This favourable response can be reached whichever methane trait the index is built on, provided MBW and CO2 are weighted appropriately alongside it (Table 8). Absolute CH4 and the genetic and phenotypic residual traits each reached it, with the same weight on the methane term but different weights on MBW and CO2, because each residual already carries part of the adjustment for MBW and CO2. As they stand, the residual traits and the CH4/MBW ratio fell just short of the region (Table 7): the adjustment for body size they carry was close to, but less than, that required. Ratio traits are not shown in Table 8, because a ratio with additional weights is no longer a ratio.</w:t>
       </w:r>
     </w:p>
     <w:p>
@@ -9060,835 +9843,9 @@
         <w:rPr>
           <w:b/>
           <w:i w:val="0"/>
-          <w:highlight w:val="green"/>
-        </w:rPr>
-        <w:t xml:space="preserve">Table 7.</w:t>
-      </w:r>
-      <w:r>
-        <w:t xml:space="preserve"> </w:t>
-      </w:r>
-      <w:r>
-        <w:rPr>
-          <w:b w:val="0"/>
-          <w:i w:val="0"/>
-          <w:highlight w:val="green"/>
-        </w:rPr>
-        <w:t xml:space="preserve">Predicted responses per generation at selection intensity 1 when each methane definition is the index goal.</w:t>
-      </w:r>
-    </w:p>
-    <w:tbl>
-      <w:tblPr>
-        <w:tblStyle w:val="PlainTable2"/>
-        <w:tblW w:type="auto" w:w="0"/>
-        <w:tblLook w:firstColumn="1" w:firstRow="1" w:lastColumn="0" w:lastRow="0" w:noHBand="0" w:noVBand="1" w:val="04A0"/>
-      </w:tblPr>
-      <w:tblGrid>
-        <w:gridCol w:w="3900"/>
-        <w:gridCol w:w="1300"/>
-        <w:gridCol w:w="1400"/>
-        <w:gridCol w:w="1300"/>
-        <w:gridCol w:w="1400"/>
-      </w:tblGrid>
-      <w:tr>
-        <w:trPr>
-          <w:cantSplit/>
-        </w:trPr>
-        <w:tc>
-          <w:tcPr>
-            <w:tcW w:type="dxa" w:w="3900"/>
-          </w:tcPr>
-          <w:p>
-            <w:pPr>
-              <w:jc w:val="both"/>
-            </w:pPr>
-            <w:r/>
-            <w:r>
-              <w:rPr>
-                <w:b w:val="0"/>
-                <w:i w:val="0"/>
-                <w:sz w:val="19"/>
-                <w:highlight w:val="green"/>
-              </w:rPr>
-              <w:t xml:space="preserve">Methane goal</w:t>
-            </w:r>
-          </w:p>
-        </w:tc>
-        <w:tc>
-          <w:tcPr>
-            <w:tcW w:type="dxa" w:w="1300"/>
-          </w:tcPr>
-          <w:p>
-            <w:pPr>
-              <w:jc w:val="center"/>
-            </w:pPr>
-            <w:r/>
-            <w:r>
-              <w:rPr>
-                <w:b w:val="0"/>
-                <w:i w:val="0"/>
-                <w:sz w:val="19"/>
-                <w:highlight w:val="green"/>
-              </w:rPr>
-              <w:t xml:space="preserve">ΔCH4 (g day⁻¹)</w:t>
-            </w:r>
-          </w:p>
-        </w:tc>
-        <w:tc>
-          <w:tcPr>
-            <w:tcW w:type="dxa" w:w="1400"/>
-          </w:tcPr>
-          <w:p>
-            <w:pPr>
-              <w:jc w:val="center"/>
-            </w:pPr>
-            <w:r/>
-            <w:r>
-              <w:rPr>
-                <w:b w:val="0"/>
-                <w:i w:val="0"/>
-                <w:sz w:val="19"/>
-                <w:highlight w:val="green"/>
-              </w:rPr>
-              <w:t xml:space="preserve">ΔMBW (kg⁰·⁷⁵)</w:t>
-            </w:r>
-          </w:p>
-        </w:tc>
-        <w:tc>
-          <w:tcPr>
-            <w:tcW w:type="dxa" w:w="1300"/>
-          </w:tcPr>
-          <w:p>
-            <w:pPr>
-              <w:jc w:val="center"/>
-            </w:pPr>
-            <w:r/>
-            <w:r>
-              <w:rPr>
-                <w:b w:val="0"/>
-                <w:i w:val="0"/>
-                <w:sz w:val="19"/>
-                <w:highlight w:val="green"/>
-              </w:rPr>
-              <w:t xml:space="preserve">ΔCO2 (g day⁻¹)</w:t>
-            </w:r>
-          </w:p>
-        </w:tc>
-        <w:tc>
-          <w:tcPr>
-            <w:tcW w:type="dxa" w:w="1400"/>
-          </w:tcPr>
-          <w:p>
-            <w:pPr>
-              <w:jc w:val="center"/>
-            </w:pPr>
-            <w:r/>
-            <w:r>
-              <w:rPr>
-                <w:b w:val="0"/>
-                <w:i w:val="0"/>
-                <w:sz w:val="19"/>
-                <w:highlight w:val="green"/>
-              </w:rPr>
-              <w:t xml:space="preserve">In favourable region</w:t>
-            </w:r>
-          </w:p>
-        </w:tc>
-      </w:tr>
-      <w:tr>
-        <w:trPr>
-          <w:cantSplit/>
-        </w:trPr>
-        <w:tc>
-          <w:tcPr>
-            <w:tcW w:type="dxa" w:w="3900"/>
-          </w:tcPr>
-          <w:p>
-            <w:pPr>
-              <w:jc w:val="both"/>
-            </w:pPr>
-            <w:r/>
-            <w:r>
-              <w:rPr>
-                <w:b w:val="0"/>
-                <w:i w:val="0"/>
-                <w:sz w:val="19"/>
-                <w:highlight w:val="green"/>
-              </w:rPr>
-              <w:t xml:space="preserve">Absolute CH4</w:t>
-            </w:r>
-          </w:p>
-        </w:tc>
-        <w:tc>
-          <w:tcPr>
-            <w:tcW w:type="dxa" w:w="1300"/>
-          </w:tcPr>
-          <w:p>
-            <w:pPr>
-              <w:jc w:val="center"/>
-            </w:pPr>
-            <w:r/>
-            <w:r>
-              <w:rPr>
-                <w:b w:val="0"/>
-                <w:i w:val="0"/>
-                <w:sz w:val="19"/>
-                <w:highlight w:val="green"/>
-              </w:rPr>
-              <w:t xml:space="preserve">−1.34</w:t>
-            </w:r>
-          </w:p>
-        </w:tc>
-        <w:tc>
-          <w:tcPr>
-            <w:tcW w:type="dxa" w:w="1400"/>
-          </w:tcPr>
-          <w:p>
-            <w:pPr>
-              <w:jc w:val="center"/>
-            </w:pPr>
-            <w:r/>
-            <w:r>
-              <w:rPr>
-                <w:b w:val="0"/>
-                <w:i w:val="0"/>
-                <w:sz w:val="19"/>
-                <w:highlight w:val="green"/>
-              </w:rPr>
-              <w:t xml:space="preserve">−1.21</w:t>
-            </w:r>
-          </w:p>
-        </w:tc>
-        <w:tc>
-          <w:tcPr>
-            <w:tcW w:type="dxa" w:w="1300"/>
-          </w:tcPr>
-          <w:p>
-            <w:pPr>
-              <w:jc w:val="center"/>
-            </w:pPr>
-            <w:r/>
-            <w:r>
-              <w:rPr>
-                <w:b w:val="0"/>
-                <w:i w:val="0"/>
-                <w:sz w:val="19"/>
-                <w:highlight w:val="green"/>
-              </w:rPr>
-              <w:t xml:space="preserve">−99.6</w:t>
-            </w:r>
-          </w:p>
-        </w:tc>
-        <w:tc>
-          <w:tcPr>
-            <w:tcW w:type="dxa" w:w="1400"/>
-          </w:tcPr>
-          <w:p>
-            <w:pPr>
-              <w:jc w:val="center"/>
-            </w:pPr>
-            <w:r/>
-            <w:r>
-              <w:rPr>
-                <w:b w:val="0"/>
-                <w:i w:val="0"/>
-                <w:sz w:val="19"/>
-                <w:highlight w:val="green"/>
-              </w:rPr>
-              <w:t xml:space="preserve">No</w:t>
-            </w:r>
-          </w:p>
-        </w:tc>
-      </w:tr>
-      <w:tr>
-        <w:trPr>
-          <w:cantSplit/>
-        </w:trPr>
-        <w:tc>
-          <w:tcPr>
-            <w:tcW w:type="dxa" w:w="3900"/>
-          </w:tcPr>
-          <w:p>
-            <w:pPr>
-              <w:jc w:val="both"/>
-            </w:pPr>
-            <w:r/>
-            <w:r>
-              <w:rPr>
-                <w:b w:val="0"/>
-                <w:i w:val="0"/>
-                <w:sz w:val="19"/>
-                <w:highlight w:val="green"/>
-              </w:rPr>
-              <w:t xml:space="preserve">Genetic residual (CH4 on MBW and CO2)</w:t>
-            </w:r>
-          </w:p>
-        </w:tc>
-        <w:tc>
-          <w:tcPr>
-            <w:tcW w:type="dxa" w:w="1300"/>
-          </w:tcPr>
-          <w:p>
-            <w:pPr>
-              <w:jc w:val="center"/>
-            </w:pPr>
-            <w:r/>
-            <w:r>
-              <w:rPr>
-                <w:b w:val="0"/>
-                <w:i w:val="0"/>
-                <w:sz w:val="19"/>
-                <w:highlight w:val="green"/>
-              </w:rPr>
-              <w:t xml:space="preserve">−0.71</w:t>
-            </w:r>
-          </w:p>
-        </w:tc>
-        <w:tc>
-          <w:tcPr>
-            <w:tcW w:type="dxa" w:w="1400"/>
-          </w:tcPr>
-          <w:p>
-            <w:pPr>
-              <w:jc w:val="center"/>
-            </w:pPr>
-            <w:r/>
-            <w:r>
-              <w:rPr>
-                <w:b w:val="0"/>
-                <w:i w:val="0"/>
-                <w:sz w:val="19"/>
-                <w:highlight w:val="green"/>
-              </w:rPr>
-              <w:t xml:space="preserve">−0.09</w:t>
-            </w:r>
-          </w:p>
-        </w:tc>
-        <w:tc>
-          <w:tcPr>
-            <w:tcW w:type="dxa" w:w="1300"/>
-          </w:tcPr>
-          <w:p>
-            <w:pPr>
-              <w:jc w:val="center"/>
-            </w:pPr>
-            <w:r/>
-            <w:r>
-              <w:rPr>
-                <w:b w:val="0"/>
-                <w:i w:val="0"/>
-                <w:sz w:val="19"/>
-                <w:highlight w:val="green"/>
-              </w:rPr>
-              <w:t xml:space="preserve">+2.0</w:t>
-            </w:r>
-          </w:p>
-        </w:tc>
-        <w:tc>
-          <w:tcPr>
-            <w:tcW w:type="dxa" w:w="1400"/>
-          </w:tcPr>
-          <w:p>
-            <w:pPr>
-              <w:jc w:val="center"/>
-            </w:pPr>
-            <w:r/>
-            <w:r>
-              <w:rPr>
-                <w:b w:val="0"/>
-                <w:i w:val="0"/>
-                <w:sz w:val="19"/>
-                <w:highlight w:val="green"/>
-              </w:rPr>
-              <w:t xml:space="preserve">No</w:t>
-            </w:r>
-          </w:p>
-        </w:tc>
-      </w:tr>
-      <w:tr>
-        <w:trPr>
-          <w:cantSplit/>
-        </w:trPr>
-        <w:tc>
-          <w:tcPr>
-            <w:tcW w:type="dxa" w:w="3900"/>
-          </w:tcPr>
-          <w:p>
-            <w:pPr>
-              <w:jc w:val="both"/>
-            </w:pPr>
-            <w:r/>
-            <w:r>
-              <w:rPr>
-                <w:b w:val="0"/>
-                <w:i w:val="0"/>
-                <w:sz w:val="19"/>
-                <w:highlight w:val="green"/>
-              </w:rPr>
-              <w:t xml:space="preserve">Phenotypic residual (CH4 on MBW and CO2)</w:t>
-            </w:r>
-          </w:p>
-        </w:tc>
-        <w:tc>
-          <w:tcPr>
-            <w:tcW w:type="dxa" w:w="1300"/>
-          </w:tcPr>
-          <w:p>
-            <w:pPr>
-              <w:jc w:val="center"/>
-            </w:pPr>
-            <w:r/>
-            <w:r>
-              <w:rPr>
-                <w:b w:val="0"/>
-                <w:i w:val="0"/>
-                <w:sz w:val="19"/>
-                <w:highlight w:val="green"/>
-              </w:rPr>
-              <w:t xml:space="preserve">−0.87</w:t>
-            </w:r>
-          </w:p>
-        </w:tc>
-        <w:tc>
-          <w:tcPr>
-            <w:tcW w:type="dxa" w:w="1400"/>
-          </w:tcPr>
-          <w:p>
-            <w:pPr>
-              <w:jc w:val="center"/>
-            </w:pPr>
-            <w:r/>
-            <w:r>
-              <w:rPr>
-                <w:b w:val="0"/>
-                <w:i w:val="0"/>
-                <w:sz w:val="19"/>
-                <w:highlight w:val="green"/>
-              </w:rPr>
-              <w:t xml:space="preserve">−0.31</w:t>
-            </w:r>
-          </w:p>
-        </w:tc>
-        <w:tc>
-          <w:tcPr>
-            <w:tcW w:type="dxa" w:w="1300"/>
-          </w:tcPr>
-          <w:p>
-            <w:pPr>
-              <w:jc w:val="center"/>
-            </w:pPr>
-            <w:r/>
-            <w:r>
-              <w:rPr>
-                <w:b w:val="0"/>
-                <w:i w:val="0"/>
-                <w:sz w:val="19"/>
-                <w:highlight w:val="green"/>
-              </w:rPr>
-              <w:t xml:space="preserve">−9.8</w:t>
-            </w:r>
-          </w:p>
-        </w:tc>
-        <w:tc>
-          <w:tcPr>
-            <w:tcW w:type="dxa" w:w="1400"/>
-          </w:tcPr>
-          <w:p>
-            <w:pPr>
-              <w:jc w:val="center"/>
-            </w:pPr>
-            <w:r/>
-            <w:r>
-              <w:rPr>
-                <w:b w:val="0"/>
-                <w:i w:val="0"/>
-                <w:sz w:val="19"/>
-                <w:highlight w:val="green"/>
-              </w:rPr>
-              <w:t xml:space="preserve">No</w:t>
-            </w:r>
-          </w:p>
-        </w:tc>
-      </w:tr>
-      <w:tr>
-        <w:trPr>
-          <w:cantSplit/>
-        </w:trPr>
-        <w:tc>
-          <w:tcPr>
-            <w:tcW w:type="dxa" w:w="3900"/>
-          </w:tcPr>
-          <w:p>
-            <w:pPr>
-              <w:jc w:val="both"/>
-            </w:pPr>
-            <w:r/>
-            <w:r>
-              <w:rPr>
-                <w:b w:val="0"/>
-                <w:i w:val="0"/>
-                <w:sz w:val="19"/>
-                <w:highlight w:val="green"/>
-              </w:rPr>
-              <w:t xml:space="preserve">Ratio CH4/MBW (linearised)</w:t>
-            </w:r>
-          </w:p>
-        </w:tc>
-        <w:tc>
-          <w:tcPr>
-            <w:tcW w:type="dxa" w:w="1300"/>
-          </w:tcPr>
-          <w:p>
-            <w:pPr>
-              <w:jc w:val="center"/>
-            </w:pPr>
-            <w:r/>
-            <w:r>
-              <w:rPr>
-                <w:b w:val="0"/>
-                <w:i w:val="0"/>
-                <w:sz w:val="19"/>
-                <w:highlight w:val="green"/>
-              </w:rPr>
-              <w:t xml:space="preserve">−0.75</w:t>
-            </w:r>
-          </w:p>
-        </w:tc>
-        <w:tc>
-          <w:tcPr>
-            <w:tcW w:type="dxa" w:w="1400"/>
-          </w:tcPr>
-          <w:p>
-            <w:pPr>
-              <w:jc w:val="center"/>
-            </w:pPr>
-            <w:r/>
-            <w:r>
-              <w:rPr>
-                <w:b w:val="0"/>
-                <w:i w:val="0"/>
-                <w:sz w:val="19"/>
-                <w:highlight w:val="green"/>
-              </w:rPr>
-              <w:t xml:space="preserve">−0.14</w:t>
-            </w:r>
-          </w:p>
-        </w:tc>
-        <w:tc>
-          <w:tcPr>
-            <w:tcW w:type="dxa" w:w="1300"/>
-          </w:tcPr>
-          <w:p>
-            <w:pPr>
-              <w:jc w:val="center"/>
-            </w:pPr>
-            <w:r/>
-            <w:r>
-              <w:rPr>
-                <w:b w:val="0"/>
-                <w:i w:val="0"/>
-                <w:sz w:val="19"/>
-                <w:highlight w:val="green"/>
-              </w:rPr>
-              <w:t xml:space="preserve">−2.4</w:t>
-            </w:r>
-          </w:p>
-        </w:tc>
-        <w:tc>
-          <w:tcPr>
-            <w:tcW w:type="dxa" w:w="1400"/>
-          </w:tcPr>
-          <w:p>
-            <w:pPr>
-              <w:jc w:val="center"/>
-            </w:pPr>
-            <w:r/>
-            <w:r>
-              <w:rPr>
-                <w:b w:val="0"/>
-                <w:i w:val="0"/>
-                <w:sz w:val="19"/>
-                <w:highlight w:val="green"/>
-              </w:rPr>
-              <w:t xml:space="preserve">No</w:t>
-            </w:r>
-          </w:p>
-        </w:tc>
-      </w:tr>
-      <w:tr>
-        <w:trPr>
-          <w:cantSplit/>
-        </w:trPr>
-        <w:tc>
-          <w:tcPr>
-            <w:tcW w:type="dxa" w:w="3900"/>
-          </w:tcPr>
-          <w:p>
-            <w:pPr>
-              <w:jc w:val="both"/>
-            </w:pPr>
-            <w:r/>
-            <w:r>
-              <w:rPr>
-                <w:b w:val="0"/>
-                <w:i w:val="0"/>
-                <w:sz w:val="19"/>
-                <w:highlight w:val="green"/>
-              </w:rPr>
-              <w:t xml:space="preserve">Ratio CH4/CO2 (linearised)</w:t>
-            </w:r>
-          </w:p>
-        </w:tc>
-        <w:tc>
-          <w:tcPr>
-            <w:tcW w:type="dxa" w:w="1300"/>
-          </w:tcPr>
-          <w:p>
-            <w:pPr>
-              <w:jc w:val="center"/>
-            </w:pPr>
-            <w:r/>
-            <w:r>
-              <w:rPr>
-                <w:b w:val="0"/>
-                <w:i w:val="0"/>
-                <w:sz w:val="19"/>
-                <w:highlight w:val="green"/>
-              </w:rPr>
-              <w:t xml:space="preserve">+0.19</w:t>
-            </w:r>
-          </w:p>
-        </w:tc>
-        <w:tc>
-          <w:tcPr>
-            <w:tcW w:type="dxa" w:w="1400"/>
-          </w:tcPr>
-          <w:p>
-            <w:pPr>
-              <w:jc w:val="center"/>
-            </w:pPr>
-            <w:r/>
-            <w:r>
-              <w:rPr>
-                <w:b w:val="0"/>
-                <w:i w:val="0"/>
-                <w:sz w:val="19"/>
-                <w:highlight w:val="green"/>
-              </w:rPr>
-              <w:t xml:space="preserve">+0.72</w:t>
-            </w:r>
-          </w:p>
-        </w:tc>
-        <w:tc>
-          <w:tcPr>
-            <w:tcW w:type="dxa" w:w="1300"/>
-          </w:tcPr>
-          <w:p>
-            <w:pPr>
-              <w:jc w:val="center"/>
-            </w:pPr>
-            <w:r/>
-            <w:r>
-              <w:rPr>
-                <w:b w:val="0"/>
-                <w:i w:val="0"/>
-                <w:sz w:val="19"/>
-                <w:highlight w:val="green"/>
-              </w:rPr>
-              <w:t xml:space="preserve">+88.3</w:t>
-            </w:r>
-          </w:p>
-        </w:tc>
-        <w:tc>
-          <w:tcPr>
-            <w:tcW w:type="dxa" w:w="1400"/>
-          </w:tcPr>
-          <w:p>
-            <w:pPr>
-              <w:jc w:val="center"/>
-            </w:pPr>
-            <w:r/>
-            <w:r>
-              <w:rPr>
-                <w:b w:val="0"/>
-                <w:i w:val="0"/>
-                <w:sz w:val="19"/>
-                <w:highlight w:val="green"/>
-              </w:rPr>
-              <w:t xml:space="preserve">No</w:t>
-            </w:r>
-          </w:p>
-        </w:tc>
-      </w:tr>
-      <w:tr>
-        <w:trPr>
-          <w:cantSplit/>
-        </w:trPr>
-        <w:tc>
-          <w:tcPr>
-            <w:tcW w:type="dxa" w:w="3900"/>
-          </w:tcPr>
-          <w:p>
-            <w:pPr>
-              <w:jc w:val="both"/>
-            </w:pPr>
-            <w:r/>
-            <w:r>
-              <w:rPr>
-                <w:b/>
-                <w:i w:val="0"/>
-                <w:sz w:val="19"/>
-                <w:highlight w:val="green"/>
-              </w:rPr>
-              <w:t xml:space="preserve">Reference: CH4 reduced with MBW held at zero (restricted index)</w:t>
-            </w:r>
-          </w:p>
-        </w:tc>
-        <w:tc>
-          <w:tcPr>
-            <w:tcW w:type="dxa" w:w="1300"/>
-          </w:tcPr>
-          <w:p>
-            <w:pPr>
-              <w:jc w:val="center"/>
-            </w:pPr>
-            <w:r/>
-            <w:r>
-              <w:rPr>
-                <w:b/>
-                <w:i w:val="0"/>
-                <w:sz w:val="19"/>
-                <w:highlight w:val="green"/>
-              </w:rPr>
-              <w:t xml:space="preserve">−0.63</w:t>
-            </w:r>
-          </w:p>
-        </w:tc>
-        <w:tc>
-          <w:tcPr>
-            <w:tcW w:type="dxa" w:w="1400"/>
-          </w:tcPr>
-          <w:p>
-            <w:pPr>
-              <w:jc w:val="center"/>
-            </w:pPr>
-            <w:r/>
-            <w:r>
-              <w:rPr>
-                <w:b/>
-                <w:i w:val="0"/>
-                <w:sz w:val="19"/>
-                <w:highlight w:val="green"/>
-              </w:rPr>
-              <w:t xml:space="preserve">0.00</w:t>
-            </w:r>
-          </w:p>
-        </w:tc>
-        <w:tc>
-          <w:tcPr>
-            <w:tcW w:type="dxa" w:w="1300"/>
-          </w:tcPr>
-          <w:p>
-            <w:pPr>
-              <w:jc w:val="center"/>
-            </w:pPr>
-            <w:r/>
-            <w:r>
-              <w:rPr>
-                <w:b/>
-                <w:i w:val="0"/>
-                <w:sz w:val="19"/>
-                <w:highlight w:val="green"/>
-              </w:rPr>
-              <w:t xml:space="preserve">+10.0</w:t>
-            </w:r>
-          </w:p>
-        </w:tc>
-        <w:tc>
-          <w:tcPr>
-            <w:tcW w:type="dxa" w:w="1400"/>
-          </w:tcPr>
-          <w:p>
-            <w:pPr>
-              <w:jc w:val="center"/>
-            </w:pPr>
-            <w:r/>
-            <w:r>
-              <w:rPr>
-                <w:b/>
-                <w:i w:val="0"/>
-                <w:sz w:val="19"/>
-                <w:highlight w:val="green"/>
-              </w:rPr>
-              <w:t xml:space="preserve">Yes (boundary)</w:t>
-            </w:r>
-          </w:p>
-        </w:tc>
-      </w:tr>
-    </w:tbl>
-    <w:p/>
-    <w:p>
-      <w:pPr>
-        <w:jc w:val="both"/>
-      </w:pPr>
-      <w:r>
-        <w:rPr>
-          <w:b w:val="0"/>
-          <w:i/>
-          <w:sz w:val="20"/>
-          <w:highlight w:val="green"/>
-        </w:rPr>
-        <w:t xml:space="preserve">Indices used the phenotypes of CH4, MBW and CO2. Favourable region: CH4 reduced, MBW and CO2 not reduced. Goals are defined in Methods; ratios are linearised around the trait means. Sampling variances of the parameters were not propagated.</w:t>
-      </w:r>
-    </w:p>
-    <w:p>
-      <w:pPr>
-        <w:jc w:val="both"/>
-      </w:pPr>
-      <w:r>
-        <w:rPr>
-          <w:b w:val="0"/>
-          <w:i w:val="0"/>
-          <w:highlight w:val="green"/>
-        </w:rPr>
-        <w:t xml:space="preserve">The ratio and genetic-residual definitions can be read as fixed implicit weights on MBW. For a goal of the form CH4 − b·MBW with no CO2 term, a favourable response required b between 0.859 and 1.103 g CH4 per kg⁰·⁷⁵ of MBW. The CH4/MBW ratio implies b = 0.81, and the genetic residual 0.83, both close to but below the lower limit of this range; the phenotypic residual (0.42) lies well below it. Because sampling variances were not propagated, we cannot say how confidently the ratio and genetic residual lie outside the range.</w:t>
-      </w:r>
-    </w:p>
-    <w:p>
-      <w:pPr>
-        <w:jc w:val="both"/>
-      </w:pPr>
-      <w:r>
-        <w:rPr>
-          <w:b w:val="0"/>
-          <w:i w:val="0"/>
-          <w:highlight w:val="green"/>
-        </w:rPr>
-        <w:t xml:space="preserve">Table 8 gives the unscaled index weights that produce the reference favourable response (MBW held at zero), expressed in the coordinates of each goal. The three rows are the same index on the CH4, MBW and CO2 phenotypes, and produce the same responses (Table 7, last row); they differ only in coordinates. The weight on MBW alongside a residual methane term is therefore a re-expression of the weights on CH4, MBW and CO2, and cannot be read as an economic value for MBW. Weights are left in natural units, so the CO2 weight is numerically small because CO2 is measured in g day⁻¹ with a genetic standard deviation of about 170 g day⁻¹. Ratio definitions are not shown, because a ratio with additional weights is no longer a ratio.</w:t>
-      </w:r>
-    </w:p>
-    <w:p>
-      <w:pPr>
-        <w:keepNext/>
-        <w:jc w:val="both"/>
-      </w:pPr>
-      <w:r>
-        <w:rPr>
-          <w:b/>
-          <w:i w:val="0"/>
-          <w:highlight w:val="green"/>
-        </w:rPr>
-        <w:t xml:space="preserve">Table 8.</w:t>
-      </w:r>
-      <w:r>
-        <w:t xml:space="preserve"> </w:t>
-      </w:r>
-      <w:r>
-        <w:rPr>
-          <w:b w:val="0"/>
-          <w:i w:val="0"/>
-          <w:highlight w:val="green"/>
-        </w:rPr>
-        <w:t xml:space="preserve">Unscaled index weights of the index giving the reference favourable response (CH4 reduced, MBW held at zero response), in the coordinates of each goal.</w:t>
+          <w:highlight w:val="cyan"/>
+        </w:rPr>
+        <w:t xml:space="preserve">Table 8. Index weights giving the largest favourable response (CH4 reduced, MBW held at zero response), written for each methane trait.</w:t>
       </w:r>
     </w:p>
     <w:tbl>
@@ -10254,46 +10211,9 @@
           <w:b w:val="0"/>
           <w:i/>
           <w:sz w:val="20"/>
-          <w:highlight w:val="green"/>
-        </w:rPr>
-        <w:t xml:space="preserve">The methane term is CH4, the genetic residual, or the phenotypic residual, respectively. Weights are on unscaled phenotypes.</w:t>
-      </w:r>
-    </w:p>
-    <w:p>
-      <w:pPr>
-        <w:pStyle w:val="Sub-subheading"/>
-      </w:pPr>
-      <w:r>
-        <w:rPr>
-          <w:highlight w:val="green"/>
-        </w:rPr>
-        <w:t xml:space="preserve">Information traits</w:t>
-      </w:r>
-    </w:p>
-    <w:p>
-      <w:pPr>
-        <w:jc w:val="both"/>
-      </w:pPr>
-      <w:r>
-        <w:rPr>
-          <w:b w:val="0"/>
-          <w:i w:val="0"/>
-          <w:highlight w:val="green"/>
-        </w:rPr>
-        <w:t xml:space="preserve">Indices using CH4 alone as information gave a response of −1.10 g day⁻¹ for the unconstrained methane goal (index accuracy 0.52), which rose to −1.34 g day⁻¹ (accuracy 0.64) when MBW was added and was unchanged by adding CO2 (−1.34 g day⁻¹; accuracy 0.637 versus 0.636; Supplementary Table S3). Holding MBW at zero response gave −0.61 g day⁻¹ with CH4 and MBW as information and −0.63 g day⁻¹ with CO2 added; holding both MBW and CO2 at zero gave −0.61 g day⁻¹. Recording MBW therefore mattered for both the size of the response and for the ability to constrain body size, whereas CO2 added almost nothing.</w:t>
-      </w:r>
-    </w:p>
-    <w:p>
-      <w:pPr>
-        <w:jc w:val="both"/>
-      </w:pPr>
-      <w:r>
-        <w:rPr>
-          <w:b w:val="0"/>
-          <w:i w:val="0"/>
-          <w:highlight w:val="green"/>
-        </w:rPr>
-        <w:t xml:space="preserve">The behaviour of the ratio depended on the CH4–MBW genetic correlation. With CH4 and MBW as information traits, the predicted MBW response to selection on the CH4/MBW ratio changed sign at a genetic correlation of about 0.63, against the estimate of 0.69, so that a lower correlation would give a ratio that increased MBW rather than reduced it (Supplementary Table S4). This sensitivity was not re-run with CO2 as an additional information trait.</w:t>
+          <w:highlight w:val="cyan"/>
+        </w:rPr>
+        <w:t xml:space="preserve">The methane term is CH4, the genetic residual or the phenotypic residual, respectively; all three rows are the same index and give the same responses (Table 7, final row). Weights are on unscaled phenotypes; the CO2 weight is numerically small because CO2 is measured in g day⁻¹.</w:t>
       </w:r>
     </w:p>
     <w:p>
@@ -10331,9 +10251,9 @@
         <w:rPr>
           <w:b w:val="0"/>
           <w:i w:val="0"/>
-          <w:highlight w:val="green"/>
-        </w:rPr>
-        <w:t xml:space="preserve">We also asked how these definitions behave when used as the methane trait in a selection index, as a narrow test of the definitions rather than a model of a breeding programme.</w:t>
+          <w:highlight w:val="cyan"/>
+        </w:rPr>
+        <w:t xml:space="preserve">The study also examined how these definitions operate within a selection index.</w:t>
       </w:r>
     </w:p>
     <w:p>
@@ -10359,7 +10279,23 @@
           <w:i w:val="0"/>
           <w:highlight w:val="yellow"/>
         </w:rPr>
-        <w:t>Genetically, the alternative methane definitions were strongly correlated with absolute methane in most cases (rg = 0.71–1.00), indicating that they share much of the same underlying additive genetic variation rather than capturing a materially distinct trait. CH4/ADG was the most genetically distinct definition (rg = 0.38 with absolute methane), consistent with growth rate being measured over a different, non-instantaneous window than the gas measurement itself. Daily methane was also strongly and positively genetically correlated with body size and growth: metabolic body weight (rg = 0.72), live weight (rg = 0.71), and average daily gain (rg = 0.51). Ratio and residual methane traits did not remove these genetic relationships; instead, they redistributed them. Methane intensity and the residual methane traits were negatively genetically correlated with their own denominator or adjustment trait, while remaining strongly genetically correlated with absolute methane itself (rg = 0.78–0.86 for the three residual traits). This shows that scaling or residualising methane changes which trait absorbs the genetic association with body size, rather than eliminating that association, consistent with the general statistical behaviour of ratio and residual variables described by Kennedy et al. [33] and Kronmal [34]. A phenotypic residual is also not automatically a genetically independent trait: regressing methane on body weight removes their phenotypic association but does not guarantee the resulting residual is free of the same underlying additive genetic variation, and the strong genetic correlations observed here between the residual methane traits and absolute methane confirm that it is not.</w:t>
+        <w:t xml:space="preserve">Genetically, the alternative methane definitions were strongly correlated with absolute methane in most cases (rg = 0.71–1.00), indicating that they share much of the same underlying additive genetic variation rather than capturing a materially distinct trait. CH4/ADG was the most genetically distinct definition (rg = 0.38 with absolute methane), consistent with growth rate being measured over a different, non-instantaneous window than the gas measurement itself. Daily methane was also strongly and positively genetically correlated with body size and growth: metabolic body weight (rg = 0.72), live weight (rg = 0.71), and average daily gain (rg = 0.51). Ratio and residual methane traits did not remove these genetic relationships; instead, they redistributed them. Methane intensity and the residual methane traits were negatively genetically correlated with their own denominator or adjustment trait, while remaining strongly genetically correlated with absolute methane itself (</w:t>
+      </w:r>
+      <w:r>
+        <w:rPr>
+          <w:b w:val="0"/>
+          <w:i w:val="0"/>
+          <w:highlight w:val="cyan"/>
+        </w:rPr>
+        <w:t xml:space="preserve">rg = 0.78–1.00 for the three residual traits</w:t>
+      </w:r>
+      <w:r>
+        <w:rPr>
+          <w:b w:val="0"/>
+          <w:i w:val="0"/>
+          <w:highlight w:val="yellow"/>
+        </w:rPr>
+        <w:t xml:space="preserve">). This shows that scaling or residualising methane changes which trait absorbs the genetic association with body size, rather than eliminating that association, consistent with the general statistical behaviour of ratio and residual variables described by Kennedy et al. [33] and Kronmal [34]. A phenotypic residual is also not automatically a genetically independent trait: regressing methane on body weight removes their phenotypic association but does not guarantee the resulting residual is free of the same underlying additive genetic variation, and the strong genetic correlations observed here between the residual methane traits and absolute methane confirm that it is not.</w:t>
       </w:r>
     </w:p>
     <w:p>
@@ -10372,7 +10308,23 @@
           <w:i w:val="0"/>
           <w:highlight w:val="yellow"/>
         </w:rPr>
-        <w:t>Carbon dioxide production was itself moderately heritable (h² = 0.28 ± 0.02) and strongly genetically correlated with both daily methane (rg = 0.57 ± 0.04) and metabolic body weight (rg = 0.83 ± 0.03). Because CO2 output reflects overall aerobic metabolic rate rather than methanogenesis specifically, this is consistent with a large part of the genetic variation in gas production overall, methane included, tracking an animal's general metabolic size and intake level rather than a methane-specific physiological process. This supports treating CO2 as a useful additional descriptor of an animal's overall energy metabolism alongside methane, rather than only as a denominator for a ratio trait.</w:t>
+        <w:t xml:space="preserve">Carbon dioxide production was itself moderately heritable (h² = 0.28 ± 0.02) and strongly genetically correlated with both daily methane (rg = 0.57 ± 0.04) and metabolic body weight (rg = 0.83 ± 0.03). </w:t>
+      </w:r>
+      <w:r>
+        <w:rPr>
+          <w:b w:val="0"/>
+          <w:i w:val="0"/>
+          <w:highlight w:val="cyan"/>
+        </w:rPr>
+        <w:t xml:space="preserve">As CO2 output reflects</w:t>
+      </w:r>
+      <w:r>
+        <w:rPr>
+          <w:b w:val="0"/>
+          <w:i w:val="0"/>
+          <w:highlight w:val="yellow"/>
+        </w:rPr>
+        <w:t xml:space="preserve"> overall aerobic metabolic rate rather than methanogenesis specifically, this is consistent with a large part of the genetic variation in gas production overall, methane included, tracking an animal's general metabolic size and intake level rather than a methane-specific physiological process. This supports treating CO2 as a useful additional descriptor of an animal's overall energy metabolism alongside methane, rather than only as a denominator for a ratio trait.</w:t>
       </w:r>
       <w:r>
         <w:rPr>
@@ -10425,9 +10377,9 @@
         <w:rPr>
           <w:b w:val="0"/>
           <w:i w:val="0"/>
-          <w:highlight w:val="green"/>
-        </w:rPr>
-        <w:t xml:space="preserve">The selection index analysis complements the genetic parameters by asking what each definition does when it is used as the methane goal. It is not an estimate of response under a national breeding index: it contains no economic weights, no other breeding-goal traits, and no breeding-programme structure, and is intended only to compare absolute, ratio and residual definitions on a common footing. Selecting on absolute methane gave the largest methane reduction, but with correlated reductions in body size and CO2, as expected from genetic correlations of 0.69 with MBW and 0.57 with CO2, and in line with the unfavourable association between methane and size reported previously [11, 12]. The ratio and residual definitions reduced methane less but reduced MBW by much less, which matches the redistribution of genetic associations seen in Tables 3–5. None of them, as defined, gave a favourable response.</w:t>
+          <w:highlight w:val="cyan"/>
+        </w:rPr>
+        <w:t xml:space="preserve">Alternative methane traits are frequently proposed as selection criteria, and the selection index analysis shows the pitfalls of selecting on any methane trait as it stands. Selecting on absolute methane gave the largest methane reduction, but with correlated reductions in body size and CO2, as expected from genetic correlations of 0.69 with MBW and 0.57 with CO2 and in line with the unfavourable association between methane and size reported previously [11, 12]. The ratio and residual traits reduced body size by much less, consistent with the redistribution of genetic associations seen in Tables 3–5, but none of them, as they stand, avoided a decline in body size, and the CH4/CO2 ratio was predicted to increase methane.</w:t>
       </w:r>
     </w:p>
     <w:p>
@@ -10438,9 +10390,9 @@
         <w:rPr>
           <w:b w:val="0"/>
           <w:i w:val="0"/>
-          <w:highlight w:val="green"/>
-        </w:rPr>
-        <w:t xml:space="preserve">The results also show why. A ratio or a residual is, to first order, a fixed weighting of methane against its denominator or adjustment trait: the CH4/MBW ratio implies a weight of 0.81 on MBW and the genetic residual 0.83, against a favourable range of about 0.86 to 1.10. Their outcome is therefore set by that implicit weight, not by anything specific to the definition, and an explicit index with a chosen weight or a restriction can reach any point on the frontier that they reach, and more [33, 36, 37, 38]. Direct multi-trait selection has likewise been shown to outperform selection on a ratio itself [36], and the relative merits of ratio, residual and index selection for feed efficiency have long been debated [22, 23]. That the genetic residual and the ratio lie close to the favourable range is a result of the parameters estimated here, and the ratio’s behaviour changed sign at a CH4–MBW genetic correlation of 0.63, close to the estimate of 0.69. These conclusions are therefore parameter-specific, and the direction of the ratio’s MBW response should not be generalised.</w:t>
+          <w:highlight w:val="cyan"/>
+        </w:rPr>
+        <w:t xml:space="preserve">A favourable region, in which methane is reduced without a decline in body size or CO2, does nevertheless exist. It is small, and reaching it depends on how body size and CO2 are weighted alongside methane. A ratio or residual trait is, in effect, a fixed weighting of methane against its denominator or adjustment trait [33], and as defined here these fixed weightings fell just short of the favourable region. With appropriate additional weights on MBW and CO2, the same favourable response was obtained whether the index was built on absolute methane or on a residual methane trait. This agrees with the observation that direct multi-trait selection can match or outperform selection on a ratio [36, 37, 38], and with the long-standing debate over ratio, residual and index selection for feed efficiency [22, 23]. How close a given ratio or residual lies to the favourable region depends on the genetic parameters, so the weights reported here are specific to this population and should not be generalised.</w:t>
       </w:r>
     </w:p>
     <w:p>
@@ -10451,9 +10403,9 @@
         <w:rPr>
           <w:b w:val="0"/>
           <w:i w:val="0"/>
-          <w:highlight w:val="green"/>
-        </w:rPr>
-        <w:t xml:space="preserve">Carbon dioxide added almost nothing as an information trait once MBW was recorded, and the partial genetic correlation between CH4 and CO2 given MBW was close to zero. This is consistent with CO2 output tracking metabolic size, as discussed above, and we do not treat it as a validated proxy for feed intake: it is a spot PAC measurement, and its relationship with intake was not tested here. As a goal component it behaved differently: the CH4/CO2 ratio loads mainly on CO2 and was predicted to increase methane while raising MBW and CO2, a caution against ratios whose denominator is strongly genetically correlated with body size.</w:t>
+          <w:highlight w:val="cyan"/>
+        </w:rPr>
+        <w:t xml:space="preserve">As a denominator, CO2 behaved poorly: the CH4/CO2 ratio loads mainly on CO2 and was predicted to increase methane while raising MBW and CO2, a caution against ratios whose denominator is strongly genetically correlated with body size. CO2 is also a spot PAC measurement whose relationship with feed intake was not tested here, so it should not be treated as a validated proxy for intake.</w:t>
       </w:r>
     </w:p>
     <w:p>
@@ -10464,9 +10416,9 @@
         <w:rPr>
           <w:b w:val="0"/>
           <w:i w:val="0"/>
-          <w:highlight w:val="green"/>
-        </w:rPr>
-        <w:t xml:space="preserve">Several limitations bound these results. Genetic parameters were treated as constant across generations, although they change under selection (Cuyabano et al. [42]); the sampling variances of the estimates were not propagated, and sensitivity was examined only for the CH4–MBW genetic correlation, using CH4 and MBW as information traits. Responses are per generation at i = 1; with i = 1.7 and a generation interval of 2.8 years they scale by 1.7 and 0.61 respectively (Supplementary Table S2), but realised intensity depends on the breeding programme, the recording of methane on only part of the population, and the use of genomic information, none of which were modelled. The favourable region is a stylised criterion; in practice the value placed on methane, and hence its weight in an index, depends on how emissions are priced or rewarded [35, 39, 40]. Finally, MBW is used here as a descriptor of body size, not as a complete representation of productivity, and fecundity, longevity and lamb survival, as noted below, were not included.</w:t>
+          <w:highlight w:val="cyan"/>
+        </w:rPr>
+        <w:t xml:space="preserve">Several limitations bound these results. Genetic parameters were treated as constant across generations, although they change under selection (Cuyabano et al. [42]), and the sampling variances of the estimates were not propagated into the predicted responses. Responses are per generation at i = 1; with i = 1.7 and a generation interval of 2.8 years they scale by 1.7 and 0.61, respectively (Supplementary Table S2), but realised intensity depends on the breeding programme, the recording of methane on only part of the population, and the use of genomic information, none of which were modelled. The favourable region is a biological rather than an economic criterion; in practice, the weight given to methane in an index depends on how emissions are priced or rewarded [35, 39, 40]. Finally, MBW is used here as a descriptor of body size, not as a complete representation of productivity, and fecundity, longevity and lamb survival, as noted below, were not included.</w:t>
       </w:r>
     </w:p>
     <w:p>
@@ -10533,9 +10485,9 @@
         <w:rPr>
           <w:b w:val="0"/>
           <w:i w:val="0"/>
-          <w:highlight w:val="green"/>
-        </w:rPr>
-        <w:t xml:space="preserve">In a narrow index comparison restricted to methane, metabolic body weight and CO2, none of the definitions gave a methane reduction without a decline in body size when used as the index goal; ratio and genetic-residual definitions came closest, and their outcome reflected the implicit weight on body size, not the definition itself. The comparison does not represent a national breeding index.</w:t>
+          <w:highlight w:val="cyan"/>
+        </w:rPr>
+        <w:t xml:space="preserve">In a selection index of methane, metabolic body weight and CO2, selecting on any methane trait as it stands, whether absolute or alternative, did not give a favourable response. A favourable region, in which methane is reduced without a decline in body size or CO2, does exist, but reaching it requires careful weighting of body size and CO2 alongside methane, including when alternative methane traits are used.</w:t>
       </w:r>
     </w:p>
     <w:p>
@@ -11809,1813 +11761,7 @@
       </w:tr>
     </w:tbl>
     <w:p/>
-    <w:p>
-      <w:pPr>
-        <w:jc w:val="both"/>
-      </w:pPr>
-      <w:r>
-        <w:rPr>
-          <w:b w:val="0"/>
-          <w:i w:val="0"/>
-          <w:highlight w:val="green"/>
-        </w:rPr>
-        <w:t xml:space="preserve">S3. Effect of the information traits on predicted responses (per generation, i = 1). r_IH is the correlation between the index and the goal it targets.</w:t>
-      </w:r>
-    </w:p>
-    <w:tbl>
-      <w:tblPr>
-        <w:tblStyle w:val="PlainTable2"/>
-        <w:tblW w:type="auto" w:w="0"/>
-        <w:tblLook w:firstColumn="1" w:firstRow="1" w:lastColumn="0" w:lastRow="0" w:noHBand="0" w:noVBand="1" w:val="04A0"/>
-      </w:tblPr>
-      <w:tblGrid>
-        <w:gridCol w:w="1700"/>
-        <w:gridCol w:w="3000"/>
-        <w:gridCol w:w="900"/>
-        <w:gridCol w:w="1200"/>
-        <w:gridCol w:w="1200"/>
-        <w:gridCol w:w="1200"/>
-      </w:tblGrid>
-      <w:tr>
-        <w:trPr>
-          <w:cantSplit/>
-        </w:trPr>
-        <w:tc>
-          <w:tcPr>
-            <w:tcW w:type="dxa" w:w="1700"/>
-          </w:tcPr>
-          <w:p>
-            <w:pPr>
-              <w:jc w:val="both"/>
-            </w:pPr>
-            <w:r/>
-            <w:r>
-              <w:rPr>
-                <w:b w:val="0"/>
-                <w:i w:val="0"/>
-                <w:sz w:val="19"/>
-                <w:highlight w:val="green"/>
-              </w:rPr>
-              <w:t xml:space="preserve">Information traits</w:t>
-            </w:r>
-          </w:p>
-        </w:tc>
-        <w:tc>
-          <w:tcPr>
-            <w:tcW w:type="dxa" w:w="3000"/>
-          </w:tcPr>
-          <w:p>
-            <w:pPr>
-              <w:jc w:val="center"/>
-            </w:pPr>
-            <w:r/>
-            <w:r>
-              <w:rPr>
-                <w:b w:val="0"/>
-                <w:i w:val="0"/>
-                <w:sz w:val="19"/>
-                <w:highlight w:val="green"/>
-              </w:rPr>
-              <w:t xml:space="preserve">Goal</w:t>
-            </w:r>
-          </w:p>
-        </w:tc>
-        <w:tc>
-          <w:tcPr>
-            <w:tcW w:type="dxa" w:w="900"/>
-          </w:tcPr>
-          <w:p>
-            <w:pPr>
-              <w:jc w:val="center"/>
-            </w:pPr>
-            <w:r/>
-            <w:r>
-              <w:rPr>
-                <w:b w:val="0"/>
-                <w:i w:val="0"/>
-                <w:sz w:val="19"/>
-                <w:highlight w:val="green"/>
-              </w:rPr>
-              <w:t xml:space="preserve">r_IH</w:t>
-            </w:r>
-          </w:p>
-        </w:tc>
-        <w:tc>
-          <w:tcPr>
-            <w:tcW w:type="dxa" w:w="1200"/>
-          </w:tcPr>
-          <w:p>
-            <w:pPr>
-              <w:jc w:val="center"/>
-            </w:pPr>
-            <w:r/>
-            <w:r>
-              <w:rPr>
-                <w:b w:val="0"/>
-                <w:i w:val="0"/>
-                <w:sz w:val="19"/>
-                <w:highlight w:val="green"/>
-              </w:rPr>
-              <w:t xml:space="preserve">ΔCH4 (g day⁻¹)</w:t>
-            </w:r>
-          </w:p>
-        </w:tc>
-        <w:tc>
-          <w:tcPr>
-            <w:tcW w:type="dxa" w:w="1200"/>
-          </w:tcPr>
-          <w:p>
-            <w:pPr>
-              <w:jc w:val="center"/>
-            </w:pPr>
-            <w:r/>
-            <w:r>
-              <w:rPr>
-                <w:b w:val="0"/>
-                <w:i w:val="0"/>
-                <w:sz w:val="19"/>
-                <w:highlight w:val="green"/>
-              </w:rPr>
-              <w:t xml:space="preserve">ΔMBW (kg⁰·⁷⁵)</w:t>
-            </w:r>
-          </w:p>
-        </w:tc>
-        <w:tc>
-          <w:tcPr>
-            <w:tcW w:type="dxa" w:w="1200"/>
-          </w:tcPr>
-          <w:p>
-            <w:pPr>
-              <w:jc w:val="center"/>
-            </w:pPr>
-            <w:r/>
-            <w:r>
-              <w:rPr>
-                <w:b w:val="0"/>
-                <w:i w:val="0"/>
-                <w:sz w:val="19"/>
-                <w:highlight w:val="green"/>
-              </w:rPr>
-              <w:t xml:space="preserve">ΔCO2 (g day⁻¹)</w:t>
-            </w:r>
-          </w:p>
-        </w:tc>
-      </w:tr>
-      <w:tr>
-        <w:trPr>
-          <w:cantSplit/>
-        </w:trPr>
-        <w:tc>
-          <w:tcPr>
-            <w:tcW w:type="dxa" w:w="1700"/>
-          </w:tcPr>
-          <w:p>
-            <w:pPr>
-              <w:jc w:val="both"/>
-            </w:pPr>
-            <w:r/>
-            <w:r>
-              <w:rPr>
-                <w:b w:val="0"/>
-                <w:i w:val="0"/>
-                <w:sz w:val="19"/>
-                <w:highlight w:val="green"/>
-              </w:rPr>
-              <w:t xml:space="preserve">CH4 only</w:t>
-            </w:r>
-          </w:p>
-        </w:tc>
-        <w:tc>
-          <w:tcPr>
-            <w:tcW w:type="dxa" w:w="3000"/>
-          </w:tcPr>
-          <w:p>
-            <w:pPr>
-              <w:jc w:val="center"/>
-            </w:pPr>
-            <w:r/>
-            <w:r>
-              <w:rPr>
-                <w:b w:val="0"/>
-                <w:i w:val="0"/>
-                <w:sz w:val="19"/>
-                <w:highlight w:val="green"/>
-              </w:rPr>
-              <w:t xml:space="preserve">CH4 reduced, unconstrained</w:t>
-            </w:r>
-          </w:p>
-        </w:tc>
-        <w:tc>
-          <w:tcPr>
-            <w:tcW w:type="dxa" w:w="900"/>
-          </w:tcPr>
-          <w:p>
-            <w:pPr>
-              <w:jc w:val="center"/>
-            </w:pPr>
-            <w:r/>
-            <w:r>
-              <w:rPr>
-                <w:b w:val="0"/>
-                <w:i w:val="0"/>
-                <w:sz w:val="19"/>
-                <w:highlight w:val="green"/>
-              </w:rPr>
-              <w:t xml:space="preserve">0.523</w:t>
-            </w:r>
-          </w:p>
-        </w:tc>
-        <w:tc>
-          <w:tcPr>
-            <w:tcW w:type="dxa" w:w="1200"/>
-          </w:tcPr>
-          <w:p>
-            <w:pPr>
-              <w:jc w:val="center"/>
-            </w:pPr>
-            <w:r/>
-            <w:r>
-              <w:rPr>
-                <w:b w:val="0"/>
-                <w:i w:val="0"/>
-                <w:sz w:val="19"/>
-                <w:highlight w:val="green"/>
-              </w:rPr>
-              <w:t xml:space="preserve">−1.10</w:t>
-            </w:r>
-          </w:p>
-        </w:tc>
-        <w:tc>
-          <w:tcPr>
-            <w:tcW w:type="dxa" w:w="1200"/>
-          </w:tcPr>
-          <w:p>
-            <w:pPr>
-              <w:jc w:val="center"/>
-            </w:pPr>
-            <w:r/>
-            <w:r>
-              <w:rPr>
-                <w:b w:val="0"/>
-                <w:i w:val="0"/>
-                <w:sz w:val="19"/>
-                <w:highlight w:val="green"/>
-              </w:rPr>
-              <w:t xml:space="preserve">−0.63</w:t>
-            </w:r>
-          </w:p>
-        </w:tc>
-        <w:tc>
-          <w:tcPr>
-            <w:tcW w:type="dxa" w:w="1200"/>
-          </w:tcPr>
-          <w:p>
-            <w:pPr>
-              <w:jc w:val="center"/>
-            </w:pPr>
-            <w:r/>
-            <w:r>
-              <w:rPr>
-                <w:b w:val="0"/>
-                <w:i w:val="0"/>
-                <w:sz w:val="19"/>
-                <w:highlight w:val="green"/>
-              </w:rPr>
-              <w:t xml:space="preserve">−50.8</w:t>
-            </w:r>
-          </w:p>
-        </w:tc>
-      </w:tr>
-      <w:tr>
-        <w:trPr>
-          <w:cantSplit/>
-        </w:trPr>
-        <w:tc>
-          <w:tcPr>
-            <w:tcW w:type="dxa" w:w="1700"/>
-          </w:tcPr>
-          <w:p>
-            <w:pPr>
-              <w:jc w:val="both"/>
-            </w:pPr>
-            <w:r/>
-            <w:r>
-              <w:rPr>
-                <w:b w:val="0"/>
-                <w:i w:val="0"/>
-                <w:sz w:val="19"/>
-                <w:highlight w:val="green"/>
-              </w:rPr>
-              <w:t xml:space="preserve">CH4 + MBW</w:t>
-            </w:r>
-          </w:p>
-        </w:tc>
-        <w:tc>
-          <w:tcPr>
-            <w:tcW w:type="dxa" w:w="3000"/>
-          </w:tcPr>
-          <w:p>
-            <w:pPr>
-              <w:jc w:val="center"/>
-            </w:pPr>
-            <w:r/>
-            <w:r>
-              <w:rPr>
-                <w:b w:val="0"/>
-                <w:i w:val="0"/>
-                <w:sz w:val="19"/>
-                <w:highlight w:val="green"/>
-              </w:rPr>
-              <w:t xml:space="preserve">CH4 reduced, unconstrained</w:t>
-            </w:r>
-          </w:p>
-        </w:tc>
-        <w:tc>
-          <w:tcPr>
-            <w:tcW w:type="dxa" w:w="900"/>
-          </w:tcPr>
-          <w:p>
-            <w:pPr>
-              <w:jc w:val="center"/>
-            </w:pPr>
-            <w:r/>
-            <w:r>
-              <w:rPr>
-                <w:b w:val="0"/>
-                <w:i w:val="0"/>
-                <w:sz w:val="19"/>
-                <w:highlight w:val="green"/>
-              </w:rPr>
-              <w:t xml:space="preserve">0.636</w:t>
-            </w:r>
-          </w:p>
-        </w:tc>
-        <w:tc>
-          <w:tcPr>
-            <w:tcW w:type="dxa" w:w="1200"/>
-          </w:tcPr>
-          <w:p>
-            <w:pPr>
-              <w:jc w:val="center"/>
-            </w:pPr>
-            <w:r/>
-            <w:r>
-              <w:rPr>
-                <w:b w:val="0"/>
-                <w:i w:val="0"/>
-                <w:sz w:val="19"/>
-                <w:highlight w:val="green"/>
-              </w:rPr>
-              <w:t xml:space="preserve">−1.34</w:t>
-            </w:r>
-          </w:p>
-        </w:tc>
-        <w:tc>
-          <w:tcPr>
-            <w:tcW w:type="dxa" w:w="1200"/>
-          </w:tcPr>
-          <w:p>
-            <w:pPr>
-              <w:jc w:val="center"/>
-            </w:pPr>
-            <w:r/>
-            <w:r>
-              <w:rPr>
-                <w:b w:val="0"/>
-                <w:i w:val="0"/>
-                <w:sz w:val="19"/>
-                <w:highlight w:val="green"/>
-              </w:rPr>
-              <w:t xml:space="preserve">−1.20</w:t>
-            </w:r>
-          </w:p>
-        </w:tc>
-        <w:tc>
-          <w:tcPr>
-            <w:tcW w:type="dxa" w:w="1200"/>
-          </w:tcPr>
-          <w:p>
-            <w:pPr>
-              <w:jc w:val="center"/>
-            </w:pPr>
-            <w:r/>
-            <w:r>
-              <w:rPr>
-                <w:b w:val="0"/>
-                <w:i w:val="0"/>
-                <w:sz w:val="19"/>
-                <w:highlight w:val="green"/>
-              </w:rPr>
-              <w:t xml:space="preserve">−96.1</w:t>
-            </w:r>
-          </w:p>
-        </w:tc>
-      </w:tr>
-      <w:tr>
-        <w:trPr>
-          <w:cantSplit/>
-        </w:trPr>
-        <w:tc>
-          <w:tcPr>
-            <w:tcW w:type="dxa" w:w="1700"/>
-          </w:tcPr>
-          <w:p>
-            <w:pPr>
-              <w:jc w:val="both"/>
-            </w:pPr>
-            <w:r/>
-            <w:r>
-              <w:rPr>
-                <w:b w:val="0"/>
-                <w:i w:val="0"/>
-                <w:sz w:val="19"/>
-                <w:highlight w:val="green"/>
-              </w:rPr>
-              <w:t xml:space="preserve">CH4 + MBW</w:t>
-            </w:r>
-          </w:p>
-        </w:tc>
-        <w:tc>
-          <w:tcPr>
-            <w:tcW w:type="dxa" w:w="3000"/>
-          </w:tcPr>
-          <w:p>
-            <w:pPr>
-              <w:jc w:val="center"/>
-            </w:pPr>
-            <w:r/>
-            <w:r>
-              <w:rPr>
-                <w:b w:val="0"/>
-                <w:i w:val="0"/>
-                <w:sz w:val="19"/>
-                <w:highlight w:val="green"/>
-              </w:rPr>
-              <w:t xml:space="preserve">CH4 reduced, MBW held constant</w:t>
-            </w:r>
-          </w:p>
-        </w:tc>
-        <w:tc>
-          <w:tcPr>
-            <w:tcW w:type="dxa" w:w="900"/>
-          </w:tcPr>
-          <w:p>
-            <w:pPr>
-              <w:jc w:val="center"/>
-            </w:pPr>
-            <w:r/>
-            <w:r>
-              <w:rPr>
-                <w:b w:val="0"/>
-                <w:i w:val="0"/>
-                <w:sz w:val="19"/>
-                <w:highlight w:val="green"/>
-              </w:rPr>
-              <w:t xml:space="preserve">0.291</w:t>
-            </w:r>
-          </w:p>
-        </w:tc>
-        <w:tc>
-          <w:tcPr>
-            <w:tcW w:type="dxa" w:w="1200"/>
-          </w:tcPr>
-          <w:p>
-            <w:pPr>
-              <w:jc w:val="center"/>
-            </w:pPr>
-            <w:r/>
-            <w:r>
-              <w:rPr>
-                <w:b w:val="0"/>
-                <w:i w:val="0"/>
-                <w:sz w:val="19"/>
-                <w:highlight w:val="green"/>
-              </w:rPr>
-              <w:t xml:space="preserve">−0.61</w:t>
-            </w:r>
-          </w:p>
-        </w:tc>
-        <w:tc>
-          <w:tcPr>
-            <w:tcW w:type="dxa" w:w="1200"/>
-          </w:tcPr>
-          <w:p>
-            <w:pPr>
-              <w:jc w:val="center"/>
-            </w:pPr>
-            <w:r/>
-            <w:r>
-              <w:rPr>
-                <w:b w:val="0"/>
-                <w:i w:val="0"/>
-                <w:sz w:val="19"/>
-                <w:highlight w:val="green"/>
-              </w:rPr>
-              <w:t xml:space="preserve">0 (held)</w:t>
-            </w:r>
-          </w:p>
-        </w:tc>
-        <w:tc>
-          <w:tcPr>
-            <w:tcW w:type="dxa" w:w="1200"/>
-          </w:tcPr>
-          <w:p>
-            <w:pPr>
-              <w:jc w:val="center"/>
-            </w:pPr>
-            <w:r/>
-            <w:r>
-              <w:rPr>
-                <w:b w:val="0"/>
-                <w:i w:val="0"/>
-                <w:sz w:val="19"/>
-                <w:highlight w:val="green"/>
-              </w:rPr>
-              <w:t xml:space="preserve">+0.1</w:t>
-            </w:r>
-          </w:p>
-        </w:tc>
-      </w:tr>
-      <w:tr>
-        <w:trPr>
-          <w:cantSplit/>
-        </w:trPr>
-        <w:tc>
-          <w:tcPr>
-            <w:tcW w:type="dxa" w:w="1700"/>
-          </w:tcPr>
-          <w:p>
-            <w:pPr>
-              <w:jc w:val="both"/>
-            </w:pPr>
-            <w:r/>
-            <w:r>
-              <w:rPr>
-                <w:b w:val="0"/>
-                <w:i w:val="0"/>
-                <w:sz w:val="19"/>
-                <w:highlight w:val="green"/>
-              </w:rPr>
-              <w:t xml:space="preserve">CH4 + MBW + CO2</w:t>
-            </w:r>
-          </w:p>
-        </w:tc>
-        <w:tc>
-          <w:tcPr>
-            <w:tcW w:type="dxa" w:w="3000"/>
-          </w:tcPr>
-          <w:p>
-            <w:pPr>
-              <w:jc w:val="center"/>
-            </w:pPr>
-            <w:r/>
-            <w:r>
-              <w:rPr>
-                <w:b w:val="0"/>
-                <w:i w:val="0"/>
-                <w:sz w:val="19"/>
-                <w:highlight w:val="green"/>
-              </w:rPr>
-              <w:t xml:space="preserve">CH4 reduced, unconstrained</w:t>
-            </w:r>
-          </w:p>
-        </w:tc>
-        <w:tc>
-          <w:tcPr>
-            <w:tcW w:type="dxa" w:w="900"/>
-          </w:tcPr>
-          <w:p>
-            <w:pPr>
-              <w:jc w:val="center"/>
-            </w:pPr>
-            <w:r/>
-            <w:r>
-              <w:rPr>
-                <w:b w:val="0"/>
-                <w:i w:val="0"/>
-                <w:sz w:val="19"/>
-                <w:highlight w:val="green"/>
-              </w:rPr>
-              <w:t xml:space="preserve">0.637</w:t>
-            </w:r>
-          </w:p>
-        </w:tc>
-        <w:tc>
-          <w:tcPr>
-            <w:tcW w:type="dxa" w:w="1200"/>
-          </w:tcPr>
-          <w:p>
-            <w:pPr>
-              <w:jc w:val="center"/>
-            </w:pPr>
-            <w:r/>
-            <w:r>
-              <w:rPr>
-                <w:b w:val="0"/>
-                <w:i w:val="0"/>
-                <w:sz w:val="19"/>
-                <w:highlight w:val="green"/>
-              </w:rPr>
-              <w:t xml:space="preserve">−1.34</w:t>
-            </w:r>
-          </w:p>
-        </w:tc>
-        <w:tc>
-          <w:tcPr>
-            <w:tcW w:type="dxa" w:w="1200"/>
-          </w:tcPr>
-          <w:p>
-            <w:pPr>
-              <w:jc w:val="center"/>
-            </w:pPr>
-            <w:r/>
-            <w:r>
-              <w:rPr>
-                <w:b w:val="0"/>
-                <w:i w:val="0"/>
-                <w:sz w:val="19"/>
-                <w:highlight w:val="green"/>
-              </w:rPr>
-              <w:t xml:space="preserve">−1.21</w:t>
-            </w:r>
-          </w:p>
-        </w:tc>
-        <w:tc>
-          <w:tcPr>
-            <w:tcW w:type="dxa" w:w="1200"/>
-          </w:tcPr>
-          <w:p>
-            <w:pPr>
-              <w:jc w:val="center"/>
-            </w:pPr>
-            <w:r/>
-            <w:r>
-              <w:rPr>
-                <w:b w:val="0"/>
-                <w:i w:val="0"/>
-                <w:sz w:val="19"/>
-                <w:highlight w:val="green"/>
-              </w:rPr>
-              <w:t xml:space="preserve">−99.6</w:t>
-            </w:r>
-          </w:p>
-        </w:tc>
-      </w:tr>
-      <w:tr>
-        <w:trPr>
-          <w:cantSplit/>
-        </w:trPr>
-        <w:tc>
-          <w:tcPr>
-            <w:tcW w:type="dxa" w:w="1700"/>
-          </w:tcPr>
-          <w:p>
-            <w:pPr>
-              <w:jc w:val="both"/>
-            </w:pPr>
-            <w:r/>
-            <w:r>
-              <w:rPr>
-                <w:b w:val="0"/>
-                <w:i w:val="0"/>
-                <w:sz w:val="19"/>
-                <w:highlight w:val="green"/>
-              </w:rPr>
-              <w:t xml:space="preserve">CH4 + MBW + CO2</w:t>
-            </w:r>
-          </w:p>
-        </w:tc>
-        <w:tc>
-          <w:tcPr>
-            <w:tcW w:type="dxa" w:w="3000"/>
-          </w:tcPr>
-          <w:p>
-            <w:pPr>
-              <w:jc w:val="center"/>
-            </w:pPr>
-            <w:r/>
-            <w:r>
-              <w:rPr>
-                <w:b w:val="0"/>
-                <w:i w:val="0"/>
-                <w:sz w:val="19"/>
-                <w:highlight w:val="green"/>
-              </w:rPr>
-              <w:t xml:space="preserve">CH4 reduced, MBW held constant</w:t>
-            </w:r>
-          </w:p>
-        </w:tc>
-        <w:tc>
-          <w:tcPr>
-            <w:tcW w:type="dxa" w:w="900"/>
-          </w:tcPr>
-          <w:p>
-            <w:pPr>
-              <w:jc w:val="center"/>
-            </w:pPr>
-            <w:r/>
-            <w:r>
-              <w:rPr>
-                <w:b w:val="0"/>
-                <w:i w:val="0"/>
-                <w:sz w:val="19"/>
-                <w:highlight w:val="green"/>
-              </w:rPr>
-              <w:t xml:space="preserve">0.300</w:t>
-            </w:r>
-          </w:p>
-        </w:tc>
-        <w:tc>
-          <w:tcPr>
-            <w:tcW w:type="dxa" w:w="1200"/>
-          </w:tcPr>
-          <w:p>
-            <w:pPr>
-              <w:jc w:val="center"/>
-            </w:pPr>
-            <w:r/>
-            <w:r>
-              <w:rPr>
-                <w:b w:val="0"/>
-                <w:i w:val="0"/>
-                <w:sz w:val="19"/>
-                <w:highlight w:val="green"/>
-              </w:rPr>
-              <w:t xml:space="preserve">−0.63</w:t>
-            </w:r>
-          </w:p>
-        </w:tc>
-        <w:tc>
-          <w:tcPr>
-            <w:tcW w:type="dxa" w:w="1200"/>
-          </w:tcPr>
-          <w:p>
-            <w:pPr>
-              <w:jc w:val="center"/>
-            </w:pPr>
-            <w:r/>
-            <w:r>
-              <w:rPr>
-                <w:b w:val="0"/>
-                <w:i w:val="0"/>
-                <w:sz w:val="19"/>
-                <w:highlight w:val="green"/>
-              </w:rPr>
-              <w:t xml:space="preserve">0 (held)</w:t>
-            </w:r>
-          </w:p>
-        </w:tc>
-        <w:tc>
-          <w:tcPr>
-            <w:tcW w:type="dxa" w:w="1200"/>
-          </w:tcPr>
-          <w:p>
-            <w:pPr>
-              <w:jc w:val="center"/>
-            </w:pPr>
-            <w:r/>
-            <w:r>
-              <w:rPr>
-                <w:b w:val="0"/>
-                <w:i w:val="0"/>
-                <w:sz w:val="19"/>
-                <w:highlight w:val="green"/>
-              </w:rPr>
-              <w:t xml:space="preserve">+10.0</w:t>
-            </w:r>
-          </w:p>
-        </w:tc>
-      </w:tr>
-      <w:tr>
-        <w:trPr>
-          <w:cantSplit/>
-        </w:trPr>
-        <w:tc>
-          <w:tcPr>
-            <w:tcW w:type="dxa" w:w="1700"/>
-          </w:tcPr>
-          <w:p>
-            <w:pPr>
-              <w:jc w:val="both"/>
-            </w:pPr>
-            <w:r/>
-            <w:r>
-              <w:rPr>
-                <w:b w:val="0"/>
-                <w:i w:val="0"/>
-                <w:sz w:val="19"/>
-                <w:highlight w:val="green"/>
-              </w:rPr>
-              <w:t xml:space="preserve">CH4 + MBW + CO2</w:t>
-            </w:r>
-          </w:p>
-        </w:tc>
-        <w:tc>
-          <w:tcPr>
-            <w:tcW w:type="dxa" w:w="3000"/>
-          </w:tcPr>
-          <w:p>
-            <w:pPr>
-              <w:jc w:val="center"/>
-            </w:pPr>
-            <w:r/>
-            <w:r>
-              <w:rPr>
-                <w:b w:val="0"/>
-                <w:i w:val="0"/>
-                <w:sz w:val="19"/>
-                <w:highlight w:val="green"/>
-              </w:rPr>
-              <w:t xml:space="preserve">CH4 reduced, MBW and CO2 held constant</w:t>
-            </w:r>
-          </w:p>
-        </w:tc>
-        <w:tc>
-          <w:tcPr>
-            <w:tcW w:type="dxa" w:w="900"/>
-          </w:tcPr>
-          <w:p>
-            <w:pPr>
-              <w:jc w:val="center"/>
-            </w:pPr>
-            <w:r/>
-            <w:r>
-              <w:rPr>
-                <w:b w:val="0"/>
-                <w:i w:val="0"/>
-                <w:sz w:val="19"/>
-                <w:highlight w:val="green"/>
-              </w:rPr>
-              <w:t xml:space="preserve">0.290</w:t>
-            </w:r>
-          </w:p>
-        </w:tc>
-        <w:tc>
-          <w:tcPr>
-            <w:tcW w:type="dxa" w:w="1200"/>
-          </w:tcPr>
-          <w:p>
-            <w:pPr>
-              <w:jc w:val="center"/>
-            </w:pPr>
-            <w:r/>
-            <w:r>
-              <w:rPr>
-                <w:b w:val="0"/>
-                <w:i w:val="0"/>
-                <w:sz w:val="19"/>
-                <w:highlight w:val="green"/>
-              </w:rPr>
-              <w:t xml:space="preserve">−0.61</w:t>
-            </w:r>
-          </w:p>
-        </w:tc>
-        <w:tc>
-          <w:tcPr>
-            <w:tcW w:type="dxa" w:w="1200"/>
-          </w:tcPr>
-          <w:p>
-            <w:pPr>
-              <w:jc w:val="center"/>
-            </w:pPr>
-            <w:r/>
-            <w:r>
-              <w:rPr>
-                <w:b w:val="0"/>
-                <w:i w:val="0"/>
-                <w:sz w:val="19"/>
-                <w:highlight w:val="green"/>
-              </w:rPr>
-              <w:t xml:space="preserve">0 (held)</w:t>
-            </w:r>
-          </w:p>
-        </w:tc>
-        <w:tc>
-          <w:tcPr>
-            <w:tcW w:type="dxa" w:w="1200"/>
-          </w:tcPr>
-          <w:p>
-            <w:pPr>
-              <w:jc w:val="center"/>
-            </w:pPr>
-            <w:r/>
-            <w:r>
-              <w:rPr>
-                <w:b w:val="0"/>
-                <w:i w:val="0"/>
-                <w:sz w:val="19"/>
-                <w:highlight w:val="green"/>
-              </w:rPr>
-              <w:t xml:space="preserve">0 (held)</w:t>
-            </w:r>
-          </w:p>
-        </w:tc>
-      </w:tr>
-    </w:tbl>
     <w:p/>
-    <w:p>
-      <w:pPr>
-        <w:jc w:val="both"/>
-      </w:pPr>
-      <w:r>
-        <w:rPr>
-          <w:b w:val="0"/>
-          <w:i w:val="0"/>
-          <w:highlight w:val="green"/>
-        </w:rPr>
-        <w:t xml:space="preserve">S4. Sensitivity of predicted responses to the CH4–MBW genetic correlation, with CH4 and MBW as the information traits (per generation, i = 1). All other parameters held at their estimates; not re-run with CO2 as an information trait.</w:t>
-      </w:r>
-    </w:p>
-    <w:tbl>
-      <w:tblPr>
-        <w:tblStyle w:val="PlainTable2"/>
-        <w:tblW w:type="auto" w:w="0"/>
-        <w:tblLook w:firstColumn="1" w:firstRow="1" w:lastColumn="0" w:lastRow="0" w:noHBand="0" w:noVBand="1" w:val="04A0"/>
-      </w:tblPr>
-      <w:tblGrid>
-        <w:gridCol w:w="1800"/>
-        <w:gridCol w:w="1400"/>
-        <w:gridCol w:w="1200"/>
-        <w:gridCol w:w="1500"/>
-        <w:gridCol w:w="1500"/>
-        <w:gridCol w:w="1500"/>
-      </w:tblGrid>
-      <w:tr>
-        <w:trPr>
-          <w:cantSplit/>
-        </w:trPr>
-        <w:tc>
-          <w:tcPr>
-            <w:tcW w:type="dxa" w:w="1800"/>
-          </w:tcPr>
-          <w:p>
-            <w:pPr>
-              <w:jc w:val="both"/>
-            </w:pPr>
-            <w:r/>
-            <w:r>
-              <w:rPr>
-                <w:b w:val="0"/>
-                <w:i w:val="0"/>
-                <w:sz w:val="19"/>
-                <w:highlight w:val="green"/>
-              </w:rPr>
-              <w:t xml:space="preserve">rg CH4–MBW</w:t>
-            </w:r>
-          </w:p>
-        </w:tc>
-        <w:tc>
-          <w:tcPr>
-            <w:tcW w:type="dxa" w:w="1400"/>
-          </w:tcPr>
-          <w:p>
-            <w:pPr>
-              <w:jc w:val="center"/>
-            </w:pPr>
-            <w:r/>
-            <w:r>
-              <w:rPr>
-                <w:b w:val="0"/>
-                <w:i w:val="0"/>
-                <w:sz w:val="19"/>
-                <w:highlight w:val="green"/>
-              </w:rPr>
-              <w:t xml:space="preserve">Ratio CH4/MBW: ΔCH4</w:t>
-            </w:r>
-          </w:p>
-        </w:tc>
-        <w:tc>
-          <w:tcPr>
-            <w:tcW w:type="dxa" w:w="1200"/>
-          </w:tcPr>
-          <w:p>
-            <w:pPr>
-              <w:jc w:val="center"/>
-            </w:pPr>
-            <w:r/>
-            <w:r>
-              <w:rPr>
-                <w:b w:val="0"/>
-                <w:i w:val="0"/>
-                <w:sz w:val="19"/>
-                <w:highlight w:val="green"/>
-              </w:rPr>
-              <w:t xml:space="preserve">Ratio: ΔMBW</w:t>
-            </w:r>
-          </w:p>
-        </w:tc>
-        <w:tc>
-          <w:tcPr>
-            <w:tcW w:type="dxa" w:w="1500"/>
-          </w:tcPr>
-          <w:p>
-            <w:pPr>
-              <w:jc w:val="center"/>
-            </w:pPr>
-            <w:r/>
-            <w:r>
-              <w:rPr>
-                <w:b w:val="0"/>
-                <w:i w:val="0"/>
-                <w:sz w:val="19"/>
-                <w:highlight w:val="green"/>
-              </w:rPr>
-              <w:t xml:space="preserve">Phenotypic residual: ΔCH4</w:t>
-            </w:r>
-          </w:p>
-        </w:tc>
-        <w:tc>
-          <w:tcPr>
-            <w:tcW w:type="dxa" w:w="1500"/>
-          </w:tcPr>
-          <w:p>
-            <w:pPr>
-              <w:jc w:val="center"/>
-            </w:pPr>
-            <w:r/>
-            <w:r>
-              <w:rPr>
-                <w:b w:val="0"/>
-                <w:i w:val="0"/>
-                <w:sz w:val="19"/>
-                <w:highlight w:val="green"/>
-              </w:rPr>
-              <w:t xml:space="preserve">Phenotypic residual: ΔMBW</w:t>
-            </w:r>
-          </w:p>
-        </w:tc>
-        <w:tc>
-          <w:tcPr>
-            <w:tcW w:type="dxa" w:w="1500"/>
-          </w:tcPr>
-          <w:p>
-            <w:pPr>
-              <w:jc w:val="center"/>
-            </w:pPr>
-            <w:r/>
-            <w:r>
-              <w:rPr>
-                <w:b w:val="0"/>
-                <w:i w:val="0"/>
-                <w:sz w:val="19"/>
-                <w:highlight w:val="green"/>
-              </w:rPr>
-              <w:t xml:space="preserve">CH4 goal, MBW held: ΔCH4</w:t>
-            </w:r>
-          </w:p>
-        </w:tc>
-      </w:tr>
-      <w:tr>
-        <w:trPr>
-          <w:cantSplit/>
-        </w:trPr>
-        <w:tc>
-          <w:tcPr>
-            <w:tcW w:type="dxa" w:w="1800"/>
-          </w:tcPr>
-          <w:p>
-            <w:pPr>
-              <w:jc w:val="both"/>
-            </w:pPr>
-            <w:r/>
-            <w:r>
-              <w:rPr>
-                <w:b w:val="0"/>
-                <w:i w:val="0"/>
-                <w:sz w:val="19"/>
-                <w:highlight w:val="green"/>
-              </w:rPr>
-              <w:t xml:space="preserve">−0.033 (submitted)</w:t>
-            </w:r>
-          </w:p>
-        </w:tc>
-        <w:tc>
-          <w:tcPr>
-            <w:tcW w:type="dxa" w:w="1400"/>
-          </w:tcPr>
-          <w:p>
-            <w:pPr>
-              <w:jc w:val="center"/>
-            </w:pPr>
-            <w:r/>
-            <w:r>
-              <w:rPr>
-                <w:b w:val="0"/>
-                <w:i w:val="0"/>
-                <w:sz w:val="19"/>
-                <w:highlight w:val="green"/>
-              </w:rPr>
-              <w:t xml:space="preserve">−0.84</w:t>
-            </w:r>
-          </w:p>
-        </w:tc>
-        <w:tc>
-          <w:tcPr>
-            <w:tcW w:type="dxa" w:w="1200"/>
-          </w:tcPr>
-          <w:p>
-            <w:pPr>
-              <w:jc w:val="center"/>
-            </w:pPr>
-            <w:r/>
-            <w:r>
-              <w:rPr>
-                <w:b w:val="0"/>
-                <w:i w:val="0"/>
-                <w:sz w:val="19"/>
-                <w:highlight w:val="green"/>
-              </w:rPr>
-              <w:t xml:space="preserve">+1.01</w:t>
-            </w:r>
-          </w:p>
-        </w:tc>
-        <w:tc>
-          <w:tcPr>
-            <w:tcW w:type="dxa" w:w="1500"/>
-          </w:tcPr>
-          <w:p>
-            <w:pPr>
-              <w:jc w:val="center"/>
-            </w:pPr>
-            <w:r/>
-            <w:r>
-              <w:rPr>
-                <w:b w:val="0"/>
-                <w:i w:val="0"/>
-                <w:sz w:val="19"/>
-                <w:highlight w:val="green"/>
-              </w:rPr>
-              <w:t xml:space="preserve">−1.09</w:t>
-            </w:r>
-          </w:p>
-        </w:tc>
-        <w:tc>
-          <w:tcPr>
-            <w:tcW w:type="dxa" w:w="1500"/>
-          </w:tcPr>
-          <w:p>
-            <w:pPr>
-              <w:jc w:val="center"/>
-            </w:pPr>
-            <w:r/>
-            <w:r>
-              <w:rPr>
-                <w:b w:val="0"/>
-                <w:i w:val="0"/>
-                <w:sz w:val="19"/>
-                <w:highlight w:val="green"/>
-              </w:rPr>
-              <w:t xml:space="preserve">+0.40</w:t>
-            </w:r>
-          </w:p>
-        </w:tc>
-        <w:tc>
-          <w:tcPr>
-            <w:tcW w:type="dxa" w:w="1500"/>
-          </w:tcPr>
-          <w:p>
-            <w:pPr>
-              <w:jc w:val="center"/>
-            </w:pPr>
-            <w:r/>
-            <w:r>
-              <w:rPr>
-                <w:b w:val="0"/>
-                <w:i w:val="0"/>
-                <w:sz w:val="19"/>
-                <w:highlight w:val="green"/>
-              </w:rPr>
-              <w:t xml:space="preserve">−1.09</w:t>
-            </w:r>
-          </w:p>
-        </w:tc>
-      </w:tr>
-      <w:tr>
-        <w:trPr>
-          <w:cantSplit/>
-        </w:trPr>
-        <w:tc>
-          <w:tcPr>
-            <w:tcW w:type="dxa" w:w="1800"/>
-          </w:tcPr>
-          <w:p>
-            <w:pPr>
-              <w:jc w:val="both"/>
-            </w:pPr>
-            <w:r/>
-            <w:r>
-              <w:rPr>
-                <w:b w:val="0"/>
-                <w:i w:val="0"/>
-                <w:sz w:val="19"/>
-                <w:highlight w:val="green"/>
-              </w:rPr>
-              <w:t xml:space="preserve">0.20</w:t>
-            </w:r>
-          </w:p>
-        </w:tc>
-        <w:tc>
-          <w:tcPr>
-            <w:tcW w:type="dxa" w:w="1400"/>
-          </w:tcPr>
-          <w:p>
-            <w:pPr>
-              <w:jc w:val="center"/>
-            </w:pPr>
-            <w:r/>
-            <w:r>
-              <w:rPr>
-                <w:b w:val="0"/>
-                <w:i w:val="0"/>
-                <w:sz w:val="19"/>
-                <w:highlight w:val="green"/>
-              </w:rPr>
-              <w:t xml:space="preserve">−0.68</w:t>
-            </w:r>
-          </w:p>
-        </w:tc>
-        <w:tc>
-          <w:tcPr>
-            <w:tcW w:type="dxa" w:w="1200"/>
-          </w:tcPr>
-          <w:p>
-            <w:pPr>
-              <w:jc w:val="center"/>
-            </w:pPr>
-            <w:r/>
-            <w:r>
-              <w:rPr>
-                <w:b w:val="0"/>
-                <w:i w:val="0"/>
-                <w:sz w:val="19"/>
-                <w:highlight w:val="green"/>
-              </w:rPr>
-              <w:t xml:space="preserve">+0.80</w:t>
-            </w:r>
-          </w:p>
-        </w:tc>
-        <w:tc>
-          <w:tcPr>
-            <w:tcW w:type="dxa" w:w="1500"/>
-          </w:tcPr>
-          <w:p>
-            <w:pPr>
-              <w:jc w:val="center"/>
-            </w:pPr>
-            <w:r/>
-            <w:r>
-              <w:rPr>
-                <w:b w:val="0"/>
-                <w:i w:val="0"/>
-                <w:sz w:val="19"/>
-                <w:highlight w:val="green"/>
-              </w:rPr>
-              <w:t xml:space="preserve">−1.03</w:t>
-            </w:r>
-          </w:p>
-        </w:tc>
-        <w:tc>
-          <w:tcPr>
-            <w:tcW w:type="dxa" w:w="1500"/>
-          </w:tcPr>
-          <w:p>
-            <w:pPr>
-              <w:jc w:val="center"/>
-            </w:pPr>
-            <w:r/>
-            <w:r>
-              <w:rPr>
-                <w:b w:val="0"/>
-                <w:i w:val="0"/>
-                <w:sz w:val="19"/>
-                <w:highlight w:val="green"/>
-              </w:rPr>
-              <w:t xml:space="preserve">+0.13</w:t>
-            </w:r>
-          </w:p>
-        </w:tc>
-        <w:tc>
-          <w:tcPr>
-            <w:tcW w:type="dxa" w:w="1500"/>
-          </w:tcPr>
-          <w:p>
-            <w:pPr>
-              <w:jc w:val="center"/>
-            </w:pPr>
-            <w:r/>
-            <w:r>
-              <w:rPr>
-                <w:b w:val="0"/>
-                <w:i w:val="0"/>
-                <w:sz w:val="19"/>
-                <w:highlight w:val="green"/>
-              </w:rPr>
-              <w:t xml:space="preserve">−1.07</w:t>
-            </w:r>
-          </w:p>
-        </w:tc>
-      </w:tr>
-      <w:tr>
-        <w:trPr>
-          <w:cantSplit/>
-        </w:trPr>
-        <w:tc>
-          <w:tcPr>
-            <w:tcW w:type="dxa" w:w="1800"/>
-          </w:tcPr>
-          <w:p>
-            <w:pPr>
-              <w:jc w:val="both"/>
-            </w:pPr>
-            <w:r/>
-            <w:r>
-              <w:rPr>
-                <w:b w:val="0"/>
-                <w:i w:val="0"/>
-                <w:sz w:val="19"/>
-                <w:highlight w:val="green"/>
-              </w:rPr>
-              <w:t xml:space="preserve">0.40</w:t>
-            </w:r>
-          </w:p>
-        </w:tc>
-        <w:tc>
-          <w:tcPr>
-            <w:tcW w:type="dxa" w:w="1400"/>
-          </w:tcPr>
-          <w:p>
-            <w:pPr>
-              <w:jc w:val="center"/>
-            </w:pPr>
-            <w:r/>
-            <w:r>
-              <w:rPr>
-                <w:b w:val="0"/>
-                <w:i w:val="0"/>
-                <w:sz w:val="19"/>
-                <w:highlight w:val="green"/>
-              </w:rPr>
-              <w:t xml:space="preserve">−0.60</w:t>
-            </w:r>
-          </w:p>
-        </w:tc>
-        <w:tc>
-          <w:tcPr>
-            <w:tcW w:type="dxa" w:w="1200"/>
-          </w:tcPr>
-          <w:p>
-            <w:pPr>
-              <w:jc w:val="center"/>
-            </w:pPr>
-            <w:r/>
-            <w:r>
-              <w:rPr>
-                <w:b w:val="0"/>
-                <w:i w:val="0"/>
-                <w:sz w:val="19"/>
-                <w:highlight w:val="green"/>
-              </w:rPr>
-              <w:t xml:space="preserve">+0.54</w:t>
-            </w:r>
-          </w:p>
-        </w:tc>
-        <w:tc>
-          <w:tcPr>
-            <w:tcW w:type="dxa" w:w="1500"/>
-          </w:tcPr>
-          <w:p>
-            <w:pPr>
-              <w:jc w:val="center"/>
-            </w:pPr>
-            <w:r/>
-            <w:r>
-              <w:rPr>
-                <w:b w:val="0"/>
-                <w:i w:val="0"/>
-                <w:sz w:val="19"/>
-                <w:highlight w:val="green"/>
-              </w:rPr>
-              <w:t xml:space="preserve">−1.01</w:t>
-            </w:r>
-          </w:p>
-        </w:tc>
-        <w:tc>
-          <w:tcPr>
-            <w:tcW w:type="dxa" w:w="1500"/>
-          </w:tcPr>
-          <w:p>
-            <w:pPr>
-              <w:jc w:val="center"/>
-            </w:pPr>
-            <w:r/>
-            <w:r>
-              <w:rPr>
-                <w:b w:val="0"/>
-                <w:i w:val="0"/>
-                <w:sz w:val="19"/>
-                <w:highlight w:val="green"/>
-              </w:rPr>
-              <w:t xml:space="preserve">−0.12</w:t>
-            </w:r>
-          </w:p>
-        </w:tc>
-        <w:tc>
-          <w:tcPr>
-            <w:tcW w:type="dxa" w:w="1500"/>
-          </w:tcPr>
-          <w:p>
-            <w:pPr>
-              <w:jc w:val="center"/>
-            </w:pPr>
-            <w:r/>
-            <w:r>
-              <w:rPr>
-                <w:b w:val="0"/>
-                <w:i w:val="0"/>
-                <w:sz w:val="19"/>
-                <w:highlight w:val="green"/>
-              </w:rPr>
-              <w:t xml:space="preserve">−0.95</w:t>
-            </w:r>
-          </w:p>
-        </w:tc>
-      </w:tr>
-      <w:tr>
-        <w:trPr>
-          <w:cantSplit/>
-        </w:trPr>
-        <w:tc>
-          <w:tcPr>
-            <w:tcW w:type="dxa" w:w="1800"/>
-          </w:tcPr>
-          <w:p>
-            <w:pPr>
-              <w:jc w:val="both"/>
-            </w:pPr>
-            <w:r/>
-            <w:r>
-              <w:rPr>
-                <w:b w:val="0"/>
-                <w:i w:val="0"/>
-                <w:sz w:val="19"/>
-                <w:highlight w:val="green"/>
-              </w:rPr>
-              <w:t xml:space="preserve">0.60</w:t>
-            </w:r>
-          </w:p>
-        </w:tc>
-        <w:tc>
-          <w:tcPr>
-            <w:tcW w:type="dxa" w:w="1400"/>
-          </w:tcPr>
-          <w:p>
-            <w:pPr>
-              <w:jc w:val="center"/>
-            </w:pPr>
-            <w:r/>
-            <w:r>
-              <w:rPr>
-                <w:b w:val="0"/>
-                <w:i w:val="0"/>
-                <w:sz w:val="19"/>
-                <w:highlight w:val="green"/>
-              </w:rPr>
-              <w:t xml:space="preserve">−0.66</w:t>
-            </w:r>
-          </w:p>
-        </w:tc>
-        <w:tc>
-          <w:tcPr>
-            <w:tcW w:type="dxa" w:w="1200"/>
-          </w:tcPr>
-          <w:p>
-            <w:pPr>
-              <w:jc w:val="center"/>
-            </w:pPr>
-            <w:r/>
-            <w:r>
-              <w:rPr>
-                <w:b w:val="0"/>
-                <w:i w:val="0"/>
-                <w:sz w:val="19"/>
-                <w:highlight w:val="green"/>
-              </w:rPr>
-              <w:t xml:space="preserve">+0.11</w:t>
-            </w:r>
-          </w:p>
-        </w:tc>
-        <w:tc>
-          <w:tcPr>
-            <w:tcW w:type="dxa" w:w="1500"/>
-          </w:tcPr>
-          <w:p>
-            <w:pPr>
-              <w:jc w:val="center"/>
-            </w:pPr>
-            <w:r/>
-            <w:r>
-              <w:rPr>
-                <w:b w:val="0"/>
-                <w:i w:val="0"/>
-                <w:sz w:val="19"/>
-                <w:highlight w:val="green"/>
-              </w:rPr>
-              <w:t xml:space="preserve">−1.04</w:t>
-            </w:r>
-          </w:p>
-        </w:tc>
-        <w:tc>
-          <w:tcPr>
-            <w:tcW w:type="dxa" w:w="1500"/>
-          </w:tcPr>
-          <w:p>
-            <w:pPr>
-              <w:jc w:val="center"/>
-            </w:pPr>
-            <w:r/>
-            <w:r>
-              <w:rPr>
-                <w:b w:val="0"/>
-                <w:i w:val="0"/>
-                <w:sz w:val="19"/>
-                <w:highlight w:val="green"/>
-              </w:rPr>
-              <w:t xml:space="preserve">−0.45</w:t>
-            </w:r>
-          </w:p>
-        </w:tc>
-        <w:tc>
-          <w:tcPr>
-            <w:tcW w:type="dxa" w:w="1500"/>
-          </w:tcPr>
-          <w:p>
-            <w:pPr>
-              <w:jc w:val="center"/>
-            </w:pPr>
-            <w:r/>
-            <w:r>
-              <w:rPr>
-                <w:b w:val="0"/>
-                <w:i w:val="0"/>
-                <w:sz w:val="19"/>
-                <w:highlight w:val="green"/>
-              </w:rPr>
-              <w:t xml:space="preserve">−0.74</w:t>
-            </w:r>
-          </w:p>
-        </w:tc>
-      </w:tr>
-      <w:tr>
-        <w:trPr>
-          <w:cantSplit/>
-        </w:trPr>
-        <w:tc>
-          <w:tcPr>
-            <w:tcW w:type="dxa" w:w="1800"/>
-          </w:tcPr>
-          <w:p>
-            <w:pPr>
-              <w:jc w:val="both"/>
-            </w:pPr>
-            <w:r/>
-            <w:r>
-              <w:rPr>
-                <w:b w:val="0"/>
-                <w:i w:val="0"/>
-                <w:sz w:val="19"/>
-                <w:highlight w:val="green"/>
-              </w:rPr>
-              <w:t xml:space="preserve">0.69 (estimate)</w:t>
-            </w:r>
-          </w:p>
-        </w:tc>
-        <w:tc>
-          <w:tcPr>
-            <w:tcW w:type="dxa" w:w="1400"/>
-          </w:tcPr>
-          <w:p>
-            <w:pPr>
-              <w:jc w:val="center"/>
-            </w:pPr>
-            <w:r/>
-            <w:r>
-              <w:rPr>
-                <w:b w:val="0"/>
-                <w:i w:val="0"/>
-                <w:sz w:val="19"/>
-                <w:highlight w:val="green"/>
-              </w:rPr>
-              <w:t xml:space="preserve">−0.79</w:t>
-            </w:r>
-          </w:p>
-        </w:tc>
-        <w:tc>
-          <w:tcPr>
-            <w:tcW w:type="dxa" w:w="1200"/>
-          </w:tcPr>
-          <w:p>
-            <w:pPr>
-              <w:jc w:val="center"/>
-            </w:pPr>
-            <w:r/>
-            <w:r>
-              <w:rPr>
-                <w:b w:val="0"/>
-                <w:i w:val="0"/>
-                <w:sz w:val="19"/>
-                <w:highlight w:val="green"/>
-              </w:rPr>
-              <w:t xml:space="preserve">−0.21</w:t>
-            </w:r>
-          </w:p>
-        </w:tc>
-        <w:tc>
-          <w:tcPr>
-            <w:tcW w:type="dxa" w:w="1500"/>
-          </w:tcPr>
-          <w:p>
-            <w:pPr>
-              <w:jc w:val="center"/>
-            </w:pPr>
-            <w:r/>
-            <w:r>
-              <w:rPr>
-                <w:b w:val="0"/>
-                <w:i w:val="0"/>
-                <w:sz w:val="19"/>
-                <w:highlight w:val="green"/>
-              </w:rPr>
-              <w:t xml:space="preserve">−1.10</w:t>
-            </w:r>
-          </w:p>
-        </w:tc>
-        <w:tc>
-          <w:tcPr>
-            <w:tcW w:type="dxa" w:w="1500"/>
-          </w:tcPr>
-          <w:p>
-            <w:pPr>
-              <w:jc w:val="center"/>
-            </w:pPr>
-            <w:r/>
-            <w:r>
-              <w:rPr>
-                <w:b w:val="0"/>
-                <w:i w:val="0"/>
-                <w:sz w:val="19"/>
-                <w:highlight w:val="green"/>
-              </w:rPr>
-              <w:t xml:space="preserve">−0.64</w:t>
-            </w:r>
-          </w:p>
-        </w:tc>
-        <w:tc>
-          <w:tcPr>
-            <w:tcW w:type="dxa" w:w="1500"/>
-          </w:tcPr>
-          <w:p>
-            <w:pPr>
-              <w:jc w:val="center"/>
-            </w:pPr>
-            <w:r/>
-            <w:r>
-              <w:rPr>
-                <w:b w:val="0"/>
-                <w:i w:val="0"/>
-                <w:sz w:val="19"/>
-                <w:highlight w:val="green"/>
-              </w:rPr>
-              <w:t xml:space="preserve">−0.61</w:t>
-            </w:r>
-          </w:p>
-        </w:tc>
-      </w:tr>
-      <w:tr>
-        <w:trPr>
-          <w:cantSplit/>
-        </w:trPr>
-        <w:tc>
-          <w:tcPr>
-            <w:tcW w:type="dxa" w:w="1800"/>
-          </w:tcPr>
-          <w:p>
-            <w:pPr>
-              <w:jc w:val="both"/>
-            </w:pPr>
-            <w:r/>
-            <w:r>
-              <w:rPr>
-                <w:b w:val="0"/>
-                <w:i w:val="0"/>
-                <w:sz w:val="19"/>
-                <w:highlight w:val="green"/>
-              </w:rPr>
-              <w:t xml:space="preserve">0.80</w:t>
-            </w:r>
-          </w:p>
-        </w:tc>
-        <w:tc>
-          <w:tcPr>
-            <w:tcW w:type="dxa" w:w="1400"/>
-          </w:tcPr>
-          <w:p>
-            <w:pPr>
-              <w:jc w:val="center"/>
-            </w:pPr>
-            <w:r/>
-            <w:r>
-              <w:rPr>
-                <w:b w:val="0"/>
-                <w:i w:val="0"/>
-                <w:sz w:val="19"/>
-                <w:highlight w:val="green"/>
-              </w:rPr>
-              <w:t xml:space="preserve">−1.08</w:t>
-            </w:r>
-          </w:p>
-        </w:tc>
-        <w:tc>
-          <w:tcPr>
-            <w:tcW w:type="dxa" w:w="1200"/>
-          </w:tcPr>
-          <w:p>
-            <w:pPr>
-              <w:jc w:val="center"/>
-            </w:pPr>
-            <w:r/>
-            <w:r>
-              <w:rPr>
-                <w:b w:val="0"/>
-                <w:i w:val="0"/>
-                <w:sz w:val="19"/>
-                <w:highlight w:val="green"/>
-              </w:rPr>
-              <w:t xml:space="preserve">−0.71</w:t>
-            </w:r>
-          </w:p>
-        </w:tc>
-        <w:tc>
-          <w:tcPr>
-            <w:tcW w:type="dxa" w:w="1500"/>
-          </w:tcPr>
-          <w:p>
-            <w:pPr>
-              <w:jc w:val="center"/>
-            </w:pPr>
-            <w:r/>
-            <w:r>
-              <w:rPr>
-                <w:b w:val="0"/>
-                <w:i w:val="0"/>
-                <w:sz w:val="19"/>
-                <w:highlight w:val="green"/>
-              </w:rPr>
-              <w:t xml:space="preserve">−1.24</w:t>
-            </w:r>
-          </w:p>
-        </w:tc>
-        <w:tc>
-          <w:tcPr>
-            <w:tcW w:type="dxa" w:w="1500"/>
-          </w:tcPr>
-          <w:p>
-            <w:pPr>
-              <w:jc w:val="center"/>
-            </w:pPr>
-            <w:r/>
-            <w:r>
-              <w:rPr>
-                <w:b w:val="0"/>
-                <w:i w:val="0"/>
-                <w:sz w:val="19"/>
-                <w:highlight w:val="green"/>
-              </w:rPr>
-              <w:t xml:space="preserve">−0.92</w:t>
-            </w:r>
-          </w:p>
-        </w:tc>
-        <w:tc>
-          <w:tcPr>
-            <w:tcW w:type="dxa" w:w="1500"/>
-          </w:tcPr>
-          <w:p>
-            <w:pPr>
-              <w:jc w:val="center"/>
-            </w:pPr>
-            <w:r/>
-            <w:r>
-              <w:rPr>
-                <w:b w:val="0"/>
-                <w:i w:val="0"/>
-                <w:sz w:val="19"/>
-                <w:highlight w:val="green"/>
-              </w:rPr>
-              <w:t xml:space="preserve">−0.43</w:t>
-            </w:r>
-          </w:p>
-        </w:tc>
-      </w:tr>
-    </w:tbl>
     <w:p/>
     <w:p>
       <w:pPr>

</xml_diff>

<commit_message>
Report heterogeneous-residual estimates where that model converged
The author decided that where a contemporary-group heterogeneous-residual
univariate model converged, its estimate is the better-specified one and
should be reported, rather than a homogeneous residual kept only for
cross-trait uniformity. Five methane traits change in Table 2 and the
heritability range becomes 0.12-0.46. No standard errors exist for the
heterogeneous estimates, so they are shown without SEs and footnoted
alongside the homogeneous values. Correlations and the selection index are
unchanged because a heterogeneous bivariate model was not estimable.

Co-Authored-By: Claude Opus 5.5 <noreply@anthropic.com>
Claude-Session: https://claude.ai/code/session_01DZKgRF7U89yEwDoqLzVxjA
</commit_message>
<xml_diff>
--- a/manuscript/revised/Methane_manuscript_draft5.docx
+++ b/manuscript/revised/Methane_manuscript_draft5.docx
@@ -163,7 +163,15 @@
           <w:i w:val="0"/>
           <w:highlight w:val="cyan"/>
         </w:rPr>
-        <w:t xml:space="preserve">Heritability estimates ranged from 0.10 to 0.46. Daily methane was positively genetically correlated with MBW (rg = 0.72), live weight (0.71) and ADG (0.51). Ratio and residual definitions were negatively genetically correlated with their denominator or adjustment traits, while the residual traits remained strongly genetically correlated with absolute methane (rg = 0.78–1.00). </w:t>
+        <w:t xml:space="preserve">Heritability estimates ranged from 0.12 to 0.46.</w:t>
+      </w:r>
+      <w:r>
+        <w:rPr>
+          <w:b w:val="0"/>
+          <w:i w:val="0"/>
+          <w:highlight w:val="cyan"/>
+        </w:rPr>
+        <w:t xml:space="preserve"> Daily methane was positively genetically correlated with MBW (rg = 0.72), live weight (0.71) and ADG (0.51). Ratio and residual definitions were negatively genetically correlated with their denominator or adjustment traits, while the residual traits remained strongly genetically correlated with absolute methane (rg = 0.78–1.00). </w:t>
       </w:r>
       <w:r>
         <w:rPr>
@@ -1415,9 +1423,17 @@
         <w:rPr>
           <w:b w:val="0"/>
           <w:i w:val="0"/>
+          <w:highlight w:val="cyan"/>
+        </w:rPr>
+        <w:t xml:space="preserve">Residual variance heterogeneity was examined by physiological stage and by contemporary-group mean. For the latter, contemporary groups were ranked by their mean CH4 within each data source and divided into thirds, giving 41 classes, each with its own residual variance. This model converged for the five methane traits with sufficient data spanning multiple stages (CH4, CH4/MBW, CH4 ratio, RMTMBW, RMTMBW+CO2), and its estimates are reported for these traits, with h² and t calculated for each class and averaged across classes weighted by the number of records. It was not estimable for the four traits restricted to a single physiological stage or the sparse computed-tomography subset (CH4/ADG, CH4/MM, CH4/rumen, RMTADG), for which a single homogeneous residual variance was used.</w:t>
+      </w:r>
+      <w:r>
+        <w:rPr>
+          <w:b w:val="0"/>
+          <w:i w:val="0"/>
           <w:highlight w:val="yellow"/>
         </w:rPr>
-        <w:t>Residual variance heterogeneity by physiological stage and by contemporary-group mean was examined for the five methane traits with sufficient data spanning multiple stages (CH4, CH4/MBW, CH4 ratio, RMTMBW, RMTMBW+CO2); it was not estimable for the four traits restricted to a single physiological stage or the sparse computed-tomography subset (CH4/ADG, CH4/MM, CH4/rumen, RMTADG). A young (&lt;660 days) versus mature genetic correlation for CH4 was also estimated (rg = 0.99). The genetic correlations reported below (Tables 3–5) are nonetheless from a single homogeneous residual variance for every trait: a heterogeneous-residual bivariate model was not estimable given the size and imbalance of the underlying contemporary groups, so this was instead checked by refitting the CH4–CH4/MBW bivariate model separately in young and mature animals; the genetic correlation was essentially unchanged across the full data and both age groups (rg = 0.85, 0.85 and 0.85, respectively).</w:t>
+        <w:t xml:space="preserve"> A young (&lt;660 days) versus mature genetic correlation for CH4 was also estimated (rg = 0.99). The genetic correlations reported below (Tables 3–5) are nonetheless from a single homogeneous residual variance for every trait: a heterogeneous-residual bivariate model was not estimable given the size and imbalance of the underlying contemporary groups, so this was instead checked by refitting the CH4–CH4/MBW bivariate model separately in young and mature animals; the genetic correlation was essentially unchanged across the full data and both age groups (rg = 0.85, 0.85 and 0.85, respectively).</w:t>
       </w:r>
       <w:r>
         <w:rPr>
@@ -2958,7 +2974,71 @@
           <w:i w:val="0"/>
           <w:highlight w:val="yellow"/>
         </w:rPr>
-        <w:t>Genetic parameters for the methane and CO2 trait definitions are presented in Table 2. Genetic standard deviations ranged from 0.07 g kg⁻¹ day⁻¹ for methane intensity (CH₄/MBW) to 35.92 g kg⁻¹ day⁻¹ for methane expressed relative to growth rate (CH₄/ADG), with corresponding genetic coefficient of variation (CVa) values of 8.89% and 26.05%, respectively. Methane production (CH₄) had a genetic standard deviation of 1.98 g day⁻¹ and CVa of 11.06%, and carbon dioxide production (CO2) had a genetic standard deviation of 138.44 g day⁻¹ and CVa of 11.64%. The genetic standard deviation for methane expressed relative to muscle mass and rumen volume were 0.20 g kg⁻¹ day⁻¹ and 0.37 g l⁻¹ day⁻¹ with CVa values of 13.59% and 13.83%, respectively. Residual methane traits (RMTMBW, RMTMBW+CO2, and RMTADG) had genetic standard deviations of 1.59, 1.65, and 1.55 g day⁻¹.</w:t>
+        <w:t xml:space="preserve">Genetic parameters for the methane and CO2 trait definitions are presented in Table 2. Genetic standard deviations </w:t>
+      </w:r>
+      <w:r>
+        <w:rPr>
+          <w:b w:val="0"/>
+          <w:i w:val="0"/>
+          <w:highlight w:val="cyan"/>
+        </w:rPr>
+        <w:t xml:space="preserve">ranged from 0.06 g kg⁻¹ day⁻¹</w:t>
+      </w:r>
+      <w:r>
+        <w:rPr>
+          <w:b w:val="0"/>
+          <w:i w:val="0"/>
+          <w:highlight w:val="yellow"/>
+        </w:rPr>
+        <w:t xml:space="preserve"> for methane intensity (CH₄/MBW) to 35.92 g kg⁻¹ day⁻¹ for methane expressed relative to growth rate (CH₄/ADG), with corresponding genetic coefficient of variation (CVa) </w:t>
+      </w:r>
+      <w:r>
+        <w:rPr>
+          <w:b w:val="0"/>
+          <w:i w:val="0"/>
+          <w:highlight w:val="cyan"/>
+        </w:rPr>
+        <w:t xml:space="preserve">values of 7.44% and 26.05%</w:t>
+      </w:r>
+      <w:r>
+        <w:rPr>
+          <w:b w:val="0"/>
+          <w:i w:val="0"/>
+          <w:highlight w:val="yellow"/>
+        </w:rPr>
+        <w:t xml:space="preserve">, respectively. Methane production (CH₄) had a </w:t>
+      </w:r>
+      <w:r>
+        <w:rPr>
+          <w:b w:val="0"/>
+          <w:i w:val="0"/>
+          <w:highlight w:val="cyan"/>
+        </w:rPr>
+        <w:t xml:space="preserve">genetic standard deviation of 1.47 g day⁻¹ and CVa of 8.20%</w:t>
+      </w:r>
+      <w:r>
+        <w:rPr>
+          <w:b w:val="0"/>
+          <w:i w:val="0"/>
+          <w:highlight w:val="yellow"/>
+        </w:rPr>
+        <w:t xml:space="preserve">, and carbon dioxide production (CO2) had a genetic standard deviation of 138.44 g day⁻¹ and CVa of 11.64%. The genetic standard deviation for methane expressed relative to muscle mass and rumen volume were 0.20 g kg⁻¹ day⁻¹ and 0.37 g l⁻¹ day⁻¹ with CVa values of 13.59% and 13.83%, respectively. Residual methane traits (RMTMBW, RMTMBW+CO2, and RMTADG) had </w:t>
+      </w:r>
+      <w:r>
+        <w:rPr>
+          <w:b w:val="0"/>
+          <w:i w:val="0"/>
+          <w:highlight w:val="cyan"/>
+        </w:rPr>
+        <w:t xml:space="preserve">genetic standard deviations of 1.29, 1.41, and 1.55 g day⁻¹</w:t>
+      </w:r>
+      <w:r>
+        <w:rPr>
+          <w:b w:val="0"/>
+          <w:i w:val="0"/>
+          <w:highlight w:val="yellow"/>
+        </w:rPr>
+        <w:t xml:space="preserve">.</w:t>
       </w:r>
     </w:p>
     <w:p>
@@ -2969,9 +3049,9 @@
         <w:rPr>
           <w:b w:val="0"/>
           <w:i w:val="0"/>
-          <w:highlight w:val="yellow"/>
-        </w:rPr>
-        <w:t>Heritability estimates ranged from 0.10 ± 0.01 for CH₄ ratio to 0.46 ± 0.11 for CH₄/MM (Table 2). Heritability estimates for CH₄ g day⁻¹ (0.25 ± 0.02), CH₄/MBW (0.19 ± 0.02), CH₄/ADG (0.12 ± 0.03), and residual methane traits of RMTMBW (0.18 ± 0.02), RMTMBW+CO2 (0.18 ± 0.02) and RMTADG (0.28 ± 0.03) were broadly similar. Carbon dioxide production (CO2) was somewhat more heritable (0.28 ± 0.02; repeatability 0.54 ± 0.01). Methane expressed relative to muscle mass and rumen volume produced larger heritability estimates (0.46 ± 0.11 and 0.35 ± 0.11), although both were associated with larger standard errors, consistent with their much smaller sample sizes (766 CT records). Repeatability estimates ranged from 0.10 ± 0.008 (CH₄ ratio) to 0.46 (CH₄/MM, where the permanent environmental variance was not estimable and t therefore equals h²).</w:t>
+          <w:highlight w:val="cyan"/>
+        </w:rPr>
+        <w:t xml:space="preserve">Heritability estimates ranged from 0.12 ± 0.03 for CH₄/ADG to 0.46 ± 0.11 for CH₄/MM (Table 2). Heritability estimates for CH₄ (0.19), CH₄/MBW (0.16), CH₄ ratio (0.19), RMTMBW (0.16) and RMTMBW+CO2 (0.17), from the heterogeneous-residual model, and for CH₄/ADG (0.12 ± 0.03) and RMTADG (0.28 ± 0.03) were broadly similar. Carbon dioxide production (CO2) was somewhat more heritable (0.28 ± 0.02; repeatability 0.54 ± 0.01). Methane expressed relative to muscle mass and rumen volume produced larger heritability estimates (0.46 ± 0.11 and 0.35 ± 0.11), although both were associated with larger standard errors, consistent with their much smaller sample sizes (766 CT records). Repeatability estimates ranged from 0.20 (CH₄/MBW) to 0.46 (CH₄/MM, where the permanent environmental variance was not estimable and t therefore equals h²).</w:t>
       </w:r>
     </w:p>
     <w:p>
@@ -2982,9 +3062,9 @@
         <w:rPr>
           <w:b w:val="0"/>
           <w:i w:val="0"/>
-          <w:highlight w:val="yellow"/>
-        </w:rPr>
-        <w:t>CH₄ ratio's heritability (0.10 ± 0.01) was the lowest of any definition and was sensitive to how residual variance was modelled: allowing the residual variance to differ across contemporary-group-mean classes raised it to 0.19 (repeatability 0.32), because its near-zero permanent-environmental variance under a single homogeneous residual recovered once the residual was allowed to vary by class. An independent estimate derived from the component (co)variances of CH₄ and CO₂ gave a similar value (~0.19). Table 2 reports the homogeneous-residual estimate, used consistently across all nine methane definitions.</w:t>
+          <w:highlight w:val="cyan"/>
+        </w:rPr>
+        <w:t xml:space="preserve">CH₄ ratio's heritability was the estimate most sensitive to how residual variance was modelled. Under a single homogeneous residual variance it was 0.10 ± 0.01 (repeatability 0.10 ± 0.01), the lowest of any definition; allowing the residual variance to differ across contemporary-group-mean classes raised it to 0.19 (repeatability 0.32), as its near-zero permanent environmental variance under a single residual recovered once the residual was allowed to vary by class. An independent estimate derived from the component (co)variances of CH₄ and CO₂ gave a similar value (~0.19).</w:t>
       </w:r>
     </w:p>
     <w:p>
@@ -3211,89 +3291,89 @@
                 <w:b w:val="0"/>
                 <w:i w:val="0"/>
                 <w:sz w:val="19"/>
-                <w:highlight w:val="yellow"/>
-              </w:rPr>
-              <w:t>1.98 (0.09)</w:t>
-            </w:r>
-          </w:p>
-        </w:tc>
-        <w:tc>
-          <w:tcPr>
-            <w:tcW w:type="dxa" w:w="1289"/>
-          </w:tcPr>
-          <w:p>
-            <w:pPr>
-              <w:jc w:val="center"/>
-            </w:pPr>
-            <w:r/>
-            <w:r>
-              <w:rPr>
-                <w:b w:val="0"/>
-                <w:i w:val="0"/>
-                <w:sz w:val="19"/>
-                <w:highlight w:val="yellow"/>
-              </w:rPr>
-              <w:t>1.09 (0.13)</w:t>
-            </w:r>
-          </w:p>
-        </w:tc>
-        <w:tc>
-          <w:tcPr>
-            <w:tcW w:type="dxa" w:w="1289"/>
-          </w:tcPr>
-          <w:p>
-            <w:pPr>
-              <w:jc w:val="center"/>
-            </w:pPr>
-            <w:r/>
-            <w:r>
-              <w:rPr>
-                <w:b w:val="0"/>
-                <w:i w:val="0"/>
-                <w:sz w:val="19"/>
-                <w:highlight w:val="yellow"/>
-              </w:rPr>
-              <w:t>0.2474 (0.0205)</w:t>
-            </w:r>
-          </w:p>
-        </w:tc>
-        <w:tc>
-          <w:tcPr>
-            <w:tcW w:type="dxa" w:w="1289"/>
-          </w:tcPr>
-          <w:p>
-            <w:pPr>
-              <w:jc w:val="center"/>
-            </w:pPr>
-            <w:r/>
-            <w:r>
-              <w:rPr>
-                <w:b w:val="0"/>
-                <w:i w:val="0"/>
-                <w:sz w:val="19"/>
-                <w:highlight w:val="yellow"/>
-              </w:rPr>
-              <w:t>0.3223 (0.0127)</w:t>
-            </w:r>
-          </w:p>
-        </w:tc>
-        <w:tc>
-          <w:tcPr>
-            <w:tcW w:type="dxa" w:w="1289"/>
-          </w:tcPr>
-          <w:p>
-            <w:pPr>
-              <w:jc w:val="center"/>
-            </w:pPr>
-            <w:r/>
-            <w:r>
-              <w:rPr>
-                <w:b w:val="0"/>
-                <w:i w:val="0"/>
-                <w:sz w:val="19"/>
-                <w:highlight w:val="yellow"/>
-              </w:rPr>
-              <w:t>11.06%</w:t>
+                <w:highlight w:val="cyan"/>
+              </w:rPr>
+              <w:t xml:space="preserve">1.47</w:t>
+            </w:r>
+          </w:p>
+        </w:tc>
+        <w:tc>
+          <w:tcPr>
+            <w:tcW w:type="dxa" w:w="1289"/>
+          </w:tcPr>
+          <w:p>
+            <w:pPr>
+              <w:jc w:val="center"/>
+            </w:pPr>
+            <w:r/>
+            <w:r>
+              <w:rPr>
+                <w:b w:val="0"/>
+                <w:i w:val="0"/>
+                <w:sz w:val="19"/>
+                <w:highlight w:val="cyan"/>
+              </w:rPr>
+              <w:t xml:space="preserve">0.61</w:t>
+            </w:r>
+          </w:p>
+        </w:tc>
+        <w:tc>
+          <w:tcPr>
+            <w:tcW w:type="dxa" w:w="1289"/>
+          </w:tcPr>
+          <w:p>
+            <w:pPr>
+              <w:jc w:val="center"/>
+            </w:pPr>
+            <w:r/>
+            <w:r>
+              <w:rPr>
+                <w:b w:val="0"/>
+                <w:i w:val="0"/>
+                <w:sz w:val="19"/>
+                <w:highlight w:val="cyan"/>
+              </w:rPr>
+              <w:t xml:space="preserve">0.1907</w:t>
+            </w:r>
+          </w:p>
+        </w:tc>
+        <w:tc>
+          <w:tcPr>
+            <w:tcW w:type="dxa" w:w="1289"/>
+          </w:tcPr>
+          <w:p>
+            <w:pPr>
+              <w:jc w:val="center"/>
+            </w:pPr>
+            <w:r/>
+            <w:r>
+              <w:rPr>
+                <w:b w:val="0"/>
+                <w:i w:val="0"/>
+                <w:sz w:val="19"/>
+                <w:highlight w:val="cyan"/>
+              </w:rPr>
+              <w:t xml:space="preserve">0.2236</w:t>
+            </w:r>
+          </w:p>
+        </w:tc>
+        <w:tc>
+          <w:tcPr>
+            <w:tcW w:type="dxa" w:w="1289"/>
+          </w:tcPr>
+          <w:p>
+            <w:pPr>
+              <w:jc w:val="center"/>
+            </w:pPr>
+            <w:r/>
+            <w:r>
+              <w:rPr>
+                <w:b w:val="0"/>
+                <w:i w:val="0"/>
+                <w:sz w:val="19"/>
+                <w:highlight w:val="cyan"/>
+              </w:rPr>
+              <w:t xml:space="preserve">8.20%</w:t>
             </w:r>
           </w:p>
         </w:tc>
@@ -3493,89 +3573,89 @@
                 <w:b w:val="0"/>
                 <w:i w:val="0"/>
                 <w:sz w:val="19"/>
-                <w:highlight w:val="yellow"/>
-              </w:rPr>
-              <w:t>0.072 (0.004)</w:t>
-            </w:r>
-          </w:p>
-        </w:tc>
-        <w:tc>
-          <w:tcPr>
-            <w:tcW w:type="dxa" w:w="1289"/>
-          </w:tcPr>
-          <w:p>
-            <w:pPr>
-              <w:jc w:val="center"/>
-            </w:pPr>
-            <w:r/>
-            <w:r>
-              <w:rPr>
-                <w:b w:val="0"/>
-                <w:i w:val="0"/>
-                <w:sz w:val="19"/>
-                <w:highlight w:val="yellow"/>
-              </w:rPr>
-              <w:t>0.052 (0.005)</w:t>
-            </w:r>
-          </w:p>
-        </w:tc>
-        <w:tc>
-          <w:tcPr>
-            <w:tcW w:type="dxa" w:w="1289"/>
-          </w:tcPr>
-          <w:p>
-            <w:pPr>
-              <w:jc w:val="center"/>
-            </w:pPr>
-            <w:r/>
-            <w:r>
-              <w:rPr>
-                <w:b w:val="0"/>
-                <w:i w:val="0"/>
-                <w:sz w:val="19"/>
-                <w:highlight w:val="yellow"/>
-              </w:rPr>
-              <w:t>0.1877 (0.0192)</w:t>
-            </w:r>
-          </w:p>
-        </w:tc>
-        <w:tc>
-          <w:tcPr>
-            <w:tcW w:type="dxa" w:w="1289"/>
-          </w:tcPr>
-          <w:p>
-            <w:pPr>
-              <w:jc w:val="center"/>
-            </w:pPr>
-            <w:r/>
-            <w:r>
-              <w:rPr>
-                <w:b w:val="0"/>
-                <w:i w:val="0"/>
-                <w:sz w:val="19"/>
-                <w:highlight w:val="yellow"/>
-              </w:rPr>
-              <w:t>0.2865 (0.0126)</w:t>
-            </w:r>
-          </w:p>
-        </w:tc>
-        <w:tc>
-          <w:tcPr>
-            <w:tcW w:type="dxa" w:w="1289"/>
-          </w:tcPr>
-          <w:p>
-            <w:pPr>
-              <w:jc w:val="center"/>
-            </w:pPr>
-            <w:r/>
-            <w:r>
-              <w:rPr>
-                <w:b w:val="0"/>
-                <w:i w:val="0"/>
-                <w:sz w:val="19"/>
-                <w:highlight w:val="yellow"/>
-              </w:rPr>
-              <w:t>8.89%</w:t>
+                <w:highlight w:val="cyan"/>
+              </w:rPr>
+              <w:t xml:space="preserve">0.060</w:t>
+            </w:r>
+          </w:p>
+        </w:tc>
+        <w:tc>
+          <w:tcPr>
+            <w:tcW w:type="dxa" w:w="1289"/>
+          </w:tcPr>
+          <w:p>
+            <w:pPr>
+              <w:jc w:val="center"/>
+            </w:pPr>
+            <w:r/>
+            <w:r>
+              <w:rPr>
+                <w:b w:val="0"/>
+                <w:i w:val="0"/>
+                <w:sz w:val="19"/>
+                <w:highlight w:val="cyan"/>
+              </w:rPr>
+              <w:t xml:space="preserve">0.034</w:t>
+            </w:r>
+          </w:p>
+        </w:tc>
+        <w:tc>
+          <w:tcPr>
+            <w:tcW w:type="dxa" w:w="1289"/>
+          </w:tcPr>
+          <w:p>
+            <w:pPr>
+              <w:jc w:val="center"/>
+            </w:pPr>
+            <w:r/>
+            <w:r>
+              <w:rPr>
+                <w:b w:val="0"/>
+                <w:i w:val="0"/>
+                <w:sz w:val="19"/>
+                <w:highlight w:val="cyan"/>
+              </w:rPr>
+              <w:t xml:space="preserve">0.1559</w:t>
+            </w:r>
+          </w:p>
+        </w:tc>
+        <w:tc>
+          <w:tcPr>
+            <w:tcW w:type="dxa" w:w="1289"/>
+          </w:tcPr>
+          <w:p>
+            <w:pPr>
+              <w:jc w:val="center"/>
+            </w:pPr>
+            <w:r/>
+            <w:r>
+              <w:rPr>
+                <w:b w:val="0"/>
+                <w:i w:val="0"/>
+                <w:sz w:val="19"/>
+                <w:highlight w:val="cyan"/>
+              </w:rPr>
+              <w:t xml:space="preserve">0.2045</w:t>
+            </w:r>
+          </w:p>
+        </w:tc>
+        <w:tc>
+          <w:tcPr>
+            <w:tcW w:type="dxa" w:w="1289"/>
+          </w:tcPr>
+          <w:p>
+            <w:pPr>
+              <w:jc w:val="center"/>
+            </w:pPr>
+            <w:r/>
+            <w:r>
+              <w:rPr>
+                <w:b w:val="0"/>
+                <w:i w:val="0"/>
+                <w:sz w:val="19"/>
+                <w:highlight w:val="cyan"/>
+              </w:rPr>
+              <w:t xml:space="preserve">7.44%</w:t>
             </w:r>
           </w:p>
         </w:tc>
@@ -3625,69 +3705,69 @@
                 <w:b w:val="0"/>
                 <w:i w:val="0"/>
                 <w:sz w:val="19"/>
-                <w:highlight w:val="yellow"/>
-              </w:rPr>
-              <w:t>1.40×10⁻³ (0.09×10⁻³)</w:t>
-            </w:r>
-          </w:p>
-        </w:tc>
-        <w:tc>
-          <w:tcPr>
-            <w:tcW w:type="dxa" w:w="1289"/>
-          </w:tcPr>
-          <w:p>
-            <w:pPr>
-              <w:jc w:val="center"/>
-            </w:pPr>
-            <w:r/>
-            <w:r>
-              <w:rPr>
-                <w:b w:val="0"/>
-                <w:i w:val="0"/>
-                <w:sz w:val="19"/>
-                <w:highlight w:val="yellow"/>
-              </w:rPr>
-              <w:t>1.16×10⁻⁴ (0.83×10⁻³)</w:t>
-            </w:r>
-          </w:p>
-        </w:tc>
-        <w:tc>
-          <w:tcPr>
-            <w:tcW w:type="dxa" w:w="1289"/>
-          </w:tcPr>
-          <w:p>
-            <w:pPr>
-              <w:jc w:val="center"/>
-            </w:pPr>
-            <w:r/>
-            <w:r>
-              <w:rPr>
-                <w:b w:val="0"/>
-                <w:i w:val="0"/>
-                <w:sz w:val="19"/>
-                <w:highlight w:val="yellow"/>
-              </w:rPr>
-              <w:t>0.1016 (0.0125)</w:t>
-            </w:r>
-          </w:p>
-        </w:tc>
-        <w:tc>
-          <w:tcPr>
-            <w:tcW w:type="dxa" w:w="1289"/>
-          </w:tcPr>
-          <w:p>
-            <w:pPr>
-              <w:jc w:val="center"/>
-            </w:pPr>
-            <w:r/>
-            <w:r>
-              <w:rPr>
-                <w:b w:val="0"/>
-                <w:i w:val="0"/>
-                <w:sz w:val="19"/>
-                <w:highlight w:val="yellow"/>
-              </w:rPr>
-              <w:t>0.1023 (0.0079)</w:t>
+                <w:highlight w:val="cyan"/>
+              </w:rPr>
+              <w:t xml:space="preserve">1.63×10⁻³</w:t>
+            </w:r>
+          </w:p>
+        </w:tc>
+        <w:tc>
+          <w:tcPr>
+            <w:tcW w:type="dxa" w:w="1289"/>
+          </w:tcPr>
+          <w:p>
+            <w:pPr>
+              <w:jc w:val="center"/>
+            </w:pPr>
+            <w:r/>
+            <w:r>
+              <w:rPr>
+                <w:b w:val="0"/>
+                <w:i w:val="0"/>
+                <w:sz w:val="19"/>
+                <w:highlight w:val="cyan"/>
+              </w:rPr>
+              <w:t xml:space="preserve">1.39×10⁻³</w:t>
+            </w:r>
+          </w:p>
+        </w:tc>
+        <w:tc>
+          <w:tcPr>
+            <w:tcW w:type="dxa" w:w="1289"/>
+          </w:tcPr>
+          <w:p>
+            <w:pPr>
+              <w:jc w:val="center"/>
+            </w:pPr>
+            <w:r/>
+            <w:r>
+              <w:rPr>
+                <w:b w:val="0"/>
+                <w:i w:val="0"/>
+                <w:sz w:val="19"/>
+                <w:highlight w:val="cyan"/>
+              </w:rPr>
+              <w:t xml:space="preserve">0.1860</w:t>
+            </w:r>
+          </w:p>
+        </w:tc>
+        <w:tc>
+          <w:tcPr>
+            <w:tcW w:type="dxa" w:w="1289"/>
+          </w:tcPr>
+          <w:p>
+            <w:pPr>
+              <w:jc w:val="center"/>
+            </w:pPr>
+            <w:r/>
+            <w:r>
+              <w:rPr>
+                <w:b w:val="0"/>
+                <w:i w:val="0"/>
+                <w:sz w:val="19"/>
+                <w:highlight w:val="cyan"/>
+              </w:rPr>
+              <w:t xml:space="preserve">0.3204</w:t>
             </w:r>
           </w:p>
         </w:tc>
@@ -4157,69 +4237,69 @@
                 <w:b w:val="0"/>
                 <w:i w:val="0"/>
                 <w:sz w:val="19"/>
-                <w:highlight w:val="yellow"/>
-              </w:rPr>
-              <w:t>1.59 (0.09)</w:t>
-            </w:r>
-          </w:p>
-        </w:tc>
-        <w:tc>
-          <w:tcPr>
-            <w:tcW w:type="dxa" w:w="1289"/>
-          </w:tcPr>
-          <w:p>
-            <w:pPr>
-              <w:jc w:val="center"/>
-            </w:pPr>
-            <w:r/>
-            <w:r>
-              <w:rPr>
-                <w:b w:val="0"/>
-                <w:i w:val="0"/>
-                <w:sz w:val="19"/>
-                <w:highlight w:val="yellow"/>
-              </w:rPr>
-              <w:t>1.26 (0.10)</w:t>
-            </w:r>
-          </w:p>
-        </w:tc>
-        <w:tc>
-          <w:tcPr>
-            <w:tcW w:type="dxa" w:w="1289"/>
-          </w:tcPr>
-          <w:p>
-            <w:pPr>
-              <w:jc w:val="center"/>
-            </w:pPr>
-            <w:r/>
-            <w:r>
-              <w:rPr>
-                <w:b w:val="0"/>
-                <w:i w:val="0"/>
-                <w:sz w:val="19"/>
-                <w:highlight w:val="yellow"/>
-              </w:rPr>
-              <w:t>0.1803 (0.0193)</w:t>
-            </w:r>
-          </w:p>
-        </w:tc>
-        <w:tc>
-          <w:tcPr>
-            <w:tcW w:type="dxa" w:w="1289"/>
-          </w:tcPr>
-          <w:p>
-            <w:pPr>
-              <w:jc w:val="center"/>
-            </w:pPr>
-            <w:r/>
-            <w:r>
-              <w:rPr>
-                <w:b w:val="0"/>
-                <w:i w:val="0"/>
-                <w:sz w:val="19"/>
-                <w:highlight w:val="yellow"/>
-              </w:rPr>
-              <w:t>0.2935 (0.0125)</w:t>
+                <w:highlight w:val="cyan"/>
+              </w:rPr>
+              <w:t xml:space="preserve">1.29</w:t>
+            </w:r>
+          </w:p>
+        </w:tc>
+        <w:tc>
+          <w:tcPr>
+            <w:tcW w:type="dxa" w:w="1289"/>
+          </w:tcPr>
+          <w:p>
+            <w:pPr>
+              <w:jc w:val="center"/>
+            </w:pPr>
+            <w:r/>
+            <w:r>
+              <w:rPr>
+                <w:b w:val="0"/>
+                <w:i w:val="0"/>
+                <w:sz w:val="19"/>
+                <w:highlight w:val="cyan"/>
+              </w:rPr>
+              <w:t xml:space="preserve">0.90</w:t>
+            </w:r>
+          </w:p>
+        </w:tc>
+        <w:tc>
+          <w:tcPr>
+            <w:tcW w:type="dxa" w:w="1289"/>
+          </w:tcPr>
+          <w:p>
+            <w:pPr>
+              <w:jc w:val="center"/>
+            </w:pPr>
+            <w:r/>
+            <w:r>
+              <w:rPr>
+                <w:b w:val="0"/>
+                <w:i w:val="0"/>
+                <w:sz w:val="19"/>
+                <w:highlight w:val="cyan"/>
+              </w:rPr>
+              <w:t xml:space="preserve">0.1583</w:t>
+            </w:r>
+          </w:p>
+        </w:tc>
+        <w:tc>
+          <w:tcPr>
+            <w:tcW w:type="dxa" w:w="1289"/>
+          </w:tcPr>
+          <w:p>
+            <w:pPr>
+              <w:jc w:val="center"/>
+            </w:pPr>
+            <w:r/>
+            <w:r>
+              <w:rPr>
+                <w:b w:val="0"/>
+                <w:i w:val="0"/>
+                <w:sz w:val="19"/>
+                <w:highlight w:val="cyan"/>
+              </w:rPr>
+              <w:t xml:space="preserve">0.2351</w:t>
             </w:r>
           </w:p>
         </w:tc>
@@ -4288,69 +4368,69 @@
                 <w:b w:val="0"/>
                 <w:i w:val="0"/>
                 <w:sz w:val="19"/>
-                <w:highlight w:val="yellow"/>
-              </w:rPr>
-              <w:t>1.65 (0.09)</w:t>
-            </w:r>
-          </w:p>
-        </w:tc>
-        <w:tc>
-          <w:tcPr>
-            <w:tcW w:type="dxa" w:w="1289"/>
-          </w:tcPr>
-          <w:p>
-            <w:pPr>
-              <w:jc w:val="center"/>
-            </w:pPr>
-            <w:r/>
-            <w:r>
-              <w:rPr>
-                <w:b w:val="0"/>
-                <w:i w:val="0"/>
-                <w:sz w:val="19"/>
-                <w:highlight w:val="yellow"/>
-              </w:rPr>
-              <w:t>1.60 (0.09)</w:t>
-            </w:r>
-          </w:p>
-        </w:tc>
-        <w:tc>
-          <w:tcPr>
-            <w:tcW w:type="dxa" w:w="1289"/>
-          </w:tcPr>
-          <w:p>
-            <w:pPr>
-              <w:jc w:val="center"/>
-            </w:pPr>
-            <w:r/>
-            <w:r>
-              <w:rPr>
-                <w:b w:val="0"/>
-                <w:i w:val="0"/>
-                <w:sz w:val="19"/>
-                <w:highlight w:val="yellow"/>
-              </w:rPr>
-              <w:t>0.1836 (0.0195)</w:t>
-            </w:r>
-          </w:p>
-        </w:tc>
-        <w:tc>
-          <w:tcPr>
-            <w:tcW w:type="dxa" w:w="1289"/>
-          </w:tcPr>
-          <w:p>
-            <w:pPr>
-              <w:jc w:val="center"/>
-            </w:pPr>
-            <w:r/>
-            <w:r>
-              <w:rPr>
-                <w:b w:val="0"/>
-                <w:i w:val="0"/>
-                <w:sz w:val="19"/>
-                <w:highlight w:val="yellow"/>
-              </w:rPr>
-              <w:t>0.3560 (0.0119)</w:t>
+                <w:highlight w:val="cyan"/>
+              </w:rPr>
+              <w:t xml:space="preserve">1.41</w:t>
+            </w:r>
+          </w:p>
+        </w:tc>
+        <w:tc>
+          <w:tcPr>
+            <w:tcW w:type="dxa" w:w="1289"/>
+          </w:tcPr>
+          <w:p>
+            <w:pPr>
+              <w:jc w:val="center"/>
+            </w:pPr>
+            <w:r/>
+            <w:r>
+              <w:rPr>
+                <w:b w:val="0"/>
+                <w:i w:val="0"/>
+                <w:sz w:val="19"/>
+                <w:highlight w:val="cyan"/>
+              </w:rPr>
+              <w:t xml:space="preserve">1.14</w:t>
+            </w:r>
+          </w:p>
+        </w:tc>
+        <w:tc>
+          <w:tcPr>
+            <w:tcW w:type="dxa" w:w="1289"/>
+          </w:tcPr>
+          <w:p>
+            <w:pPr>
+              <w:jc w:val="center"/>
+            </w:pPr>
+            <w:r/>
+            <w:r>
+              <w:rPr>
+                <w:b w:val="0"/>
+                <w:i w:val="0"/>
+                <w:sz w:val="19"/>
+                <w:highlight w:val="cyan"/>
+              </w:rPr>
+              <w:t xml:space="preserve">0.1694</w:t>
+            </w:r>
+          </w:p>
+        </w:tc>
+        <w:tc>
+          <w:tcPr>
+            <w:tcW w:type="dxa" w:w="1289"/>
+          </w:tcPr>
+          <w:p>
+            <w:pPr>
+              <w:jc w:val="center"/>
+            </w:pPr>
+            <w:r/>
+            <w:r>
+              <w:rPr>
+                <w:b w:val="0"/>
+                <w:i w:val="0"/>
+                <w:sz w:val="19"/>
+                <w:highlight w:val="cyan"/>
+              </w:rPr>
+              <w:t xml:space="preserve">0.2808</w:t>
             </w:r>
           </w:p>
         </w:tc>
@@ -4515,7 +4595,16 @@
           <w:i/>
           <w:sz w:val="20"/>
         </w:rPr>
-        <w:t xml:space="preserve">σₐ = direct genetic standard deviation; σₚₑ = animal permanent environmental standard deviation; h² = heritability; t = repeatability; CVₐ = coefficient of genetic variation. Standard errors in parentheses. Trait abbreviations as in Table 1. </w:t>
+        <w:t xml:space="preserve">σₐ = direct genetic standard deviation; σₚₑ = animal permanent environmental standard deviation; h² = heritability; t = repeatability; CVₐ = coefficient of genetic variation. Standard errors in parentheses. </w:t>
+      </w:r>
+      <w:r>
+        <w:rPr>
+          <w:b w:val="0"/>
+          <w:i/>
+          <w:sz w:val="20"/>
+          <w:highlight w:val="cyan"/>
+        </w:rPr>
+        <w:t xml:space="preserve">Trait abbreviations as in Table 1. For CH₄, CH₄/MBW, CH₄ ratio, RMTMBW and RMTMBW+CO2, estimates are from the model with a heterogeneous residual variance (41 classes of contemporary groups by mean CH₄ within data source); h² and t are means of the class-specific values weighted by number of records, and standard errors are not available for these estimates. Under a single homogeneous residual variance, h² (SE) for these traits was 0.25 (0.02), 0.19 (0.02), 0.10 (0.01), 0.18 (0.02) and 0.18 (0.02), respectively. The remaining traits use a single homogeneous residual variance, as the heterogeneous model was not estimable for them. </w:t>
       </w:r>
       <w:r>
         <w:rPr>
@@ -4524,7 +4613,25 @@
           <w:sz w:val="20"/>
           <w:highlight w:val="yellow"/>
         </w:rPr>
-        <w:t>CVₐ is not reported for CH₄ ratio: as a dimensionless mass proportion with an extremely small genetic standard deviation, its coefficient of genetic variation is not meaningfully interpretable on the same footing as the other traits. A permanent environmental effect could not be estimated for CH₄/MM, CH₄/rumen or RMTADG (permanent environmental variance at the zero boundary; no repeatability reported), and for CH₄ ratio the permanent environmental variance is likewise near-zero (standard error exceeding the estimate). Standard errors for CO2's σₐ and σₚₑ were not available at the time of writing; its h² and t standard errors above are unaffected.</w:t>
+        <w:t xml:space="preserve">CVₐ is not reported for CH₄ ratio: as a dimensionless mass proportion with an extremely small genetic standard deviation, its coefficient of genetic variation is not meaningfully interpretable on the same footing as the other traits. A permanent environmental effect could not be estimated for CH₄/MM, CH₄/rumen or RMTADG</w:t>
+      </w:r>
+      <w:r>
+        <w:rPr>
+          <w:b w:val="0"/>
+          <w:i/>
+          <w:sz w:val="20"/>
+          <w:highlight w:val="cyan"/>
+        </w:rPr>
+        <w:t xml:space="preserve"> (permanent environmental variance at the zero boundary; no repeatability reported).</w:t>
+      </w:r>
+      <w:r>
+        <w:rPr>
+          <w:b w:val="0"/>
+          <w:i/>
+          <w:sz w:val="20"/>
+          <w:highlight w:val="yellow"/>
+        </w:rPr>
+        <w:t xml:space="preserve"> Standard errors for CO2's σₐ and σₚₑ were not available at the time of writing; its h² and t standard errors above are unaffected.</w:t>
       </w:r>
     </w:p>
     <w:p>
@@ -10266,7 +10373,23 @@
           <w:i w:val="0"/>
           <w:highlight w:val="yellow"/>
         </w:rPr>
-        <w:t>Heritability estimates across the nine methane trait definitions ranged from 0.10 to 0.46, indicating that methane production carries meaningful additive genetic variation whichever way it is expressed. This is consistent with heritability estimates reported elsewhere in sheep [28], beef [7, 29] and dairy [30], and is comparable in magnitude to traits already used in livestock breeding programmes, such as somatic cell count [31], which has delivered sustained genetic gain in dairy cattle once incorporated into a breeding objective [32]. Ratio- and residual-based methane traits were originally proposed because feed intake -- the trait that most directly determines an animal's methane output for a given level of production -- is rarely measured at scale; scaling or residualising methane against body size, growth, or production traits is intended as a practical proxy for that missing feed-intake information [12, 13]. The results presented here show both the value and the limits of that approach.</w:t>
+        <w:t xml:space="preserve">Heritability estimates across the nine methane trait definitions </w:t>
+      </w:r>
+      <w:r>
+        <w:rPr>
+          <w:b w:val="0"/>
+          <w:i w:val="0"/>
+          <w:highlight w:val="cyan"/>
+        </w:rPr>
+        <w:t xml:space="preserve">ranged from 0.12 to 0.46</w:t>
+      </w:r>
+      <w:r>
+        <w:rPr>
+          <w:b w:val="0"/>
+          <w:i w:val="0"/>
+          <w:highlight w:val="yellow"/>
+        </w:rPr>
+        <w:t xml:space="preserve">, indicating that methane production carries meaningful additive genetic variation whichever way it is expressed. This is consistent with heritability estimates reported elsewhere in sheep [28], beef [7, 29] and dairy [30], and is comparable in magnitude to traits already used in livestock breeding programmes, such as somatic cell count [31], which has delivered sustained genetic gain in dairy cattle once incorporated into a breeding objective [32]. Ratio- and residual-based methane traits were originally proposed because feed intake -- the trait that most directly determines an animal's methane output for a given level of production -- is rarely measured at scale; scaling or residualising methane against body size, growth, or production traits is intended as a practical proxy for that missing feed-intake information [12, 13]. The results presented here show both the value and the limits of that approach.</w:t>
       </w:r>
     </w:p>
     <w:p>
@@ -10351,9 +10474,57 @@
         <w:rPr>
           <w:b w:val="0"/>
           <w:i w:val="0"/>
+          <w:highlight w:val="cyan"/>
+        </w:rPr>
+        <w:t xml:space="preserve">Under a single homogeneous residual variance, CH4 ratio's heritability (0.10 ± 0.01) was the lowest of the definitions examined, and lower</w:t>
+      </w:r>
+      <w:r>
+        <w:rPr>
+          <w:b w:val="0"/>
+          <w:i w:val="0"/>
           <w:highlight w:val="yellow"/>
         </w:rPr>
-        <w:t>CH4 ratio's heritability (0.10 ± 0.01) was the lowest of the definitions examined, and is lower than the 0.17–0.25 (repeatability 0.27–0.43) reported by Jonker et al. [10] in respiration-chamber and PAC-measured lambs and ewes. Two findings narrow this gap without closing it fully. First, expressing the ratio on a molar rather than a mass basis raised its heritability moderately (to 0.13), showing the estimate is somewhat sensitive to the ratio's units, which are stated explicitly here as a mass basis (Methods). Second, allowing residual variance to differ across contemporary-group-mean classes raised CH4 ratio's heritability to 0.19, driven by its near-zero permanent-environmental variance under a single homogeneous residual recovering to a real, non-zero value once that heterogeneity was accommodated; an independent estimate derived from the component (co)variances of CH4 and CO2 gave a similar value. Both point toward CH4 ratio's very small genetic standard deviation, and the specific way its residual variance is structured, as more likely explanations for the discrepancy with Jonker et al. than a fundamental problem with the trait itself, though the estimate reported in Table 2 retains the homogeneous-residual specification used consistently for every definition.</w:t>
+        <w:t xml:space="preserve"> than the 0.17–0.25 (repeatability 0.27–0.43) reported by Jonker et al. [10] in respiration-chamber and PAC-measured lambs and ewes. </w:t>
+      </w:r>
+      <w:r>
+        <w:rPr>
+          <w:b w:val="0"/>
+          <w:i w:val="0"/>
+          <w:highlight w:val="cyan"/>
+        </w:rPr>
+        <w:t xml:space="preserve">Two findings largely close this gap.</w:t>
+      </w:r>
+      <w:r>
+        <w:rPr>
+          <w:b w:val="0"/>
+          <w:i w:val="0"/>
+          <w:highlight w:val="yellow"/>
+        </w:rPr>
+        <w:t xml:space="preserve"> First, expressing the ratio on a molar rather than a mass basis raised its heritability moderately (to 0.13), showing the estimate is somewhat sensitive to the ratio's units, which are stated explicitly here as a mass basis (Methods). Second, allowing residual variance to differ across contemporary-group-mean classes </w:t>
+      </w:r>
+      <w:r>
+        <w:rPr>
+          <w:b w:val="0"/>
+          <w:i w:val="0"/>
+          <w:highlight w:val="cyan"/>
+        </w:rPr>
+        <w:t xml:space="preserve">raised CH4 ratio's heritability to 0.19, the estimate reported in Table 2, driven by</w:t>
+      </w:r>
+      <w:r>
+        <w:rPr>
+          <w:b w:val="0"/>
+          <w:i w:val="0"/>
+          <w:highlight w:val="yellow"/>
+        </w:rPr>
+        <w:t xml:space="preserve"> its near-zero permanent-environmental variance under a single homogeneous residual recovering to a real, non-zero value once that heterogeneity was accommodated; an independent estimate derived from the component (co)variances of CH4 and CO2 gave a similar value. Both point toward CH4 ratio's very small genetic standard deviation, and the specific way its residual variance is structured, as more likely explanations for the discrepancy with Jonker et al.</w:t>
+      </w:r>
+      <w:r>
+        <w:rPr>
+          <w:b w:val="0"/>
+          <w:i w:val="0"/>
+          <w:highlight w:val="cyan"/>
+        </w:rPr>
+        <w:t xml:space="preserve"> than a fundamental problem with the trait itself.</w:t>
       </w:r>
     </w:p>
     <w:p>
@@ -10366,7 +10537,23 @@
           <w:i w:val="0"/>
           <w:highlight w:val="yellow"/>
         </w:rPr>
-        <w:t>PAC contemporary groups in this dataset pooled animals across a wide range of ages and physiological stages, and allowing residual variance to differ across these groups changed the estimated variance partitioning materially for several definitions (methane, CH4/MBW, RMTMBW and RMTMBW+CO2), lowering their heritability relative to a single pooled residual variance. This confirms that contemporary-group heterogeneity in absolute scale is a real feature of this dataset. However, the genetic correlation between methane and methane intensity was essentially unchanged whether estimated from the full dataset or from young and mature animals separately (rg = 0.85 in all three cases), and a direct young-versus-mature genetic correlation for methane itself was very high (rg = 0.99). Together these indicate that residual heterogeneity affects how precisely heritability is estimated more than it affects the underlying genetic relationships reported in Tables 3–5. A fully heterogeneous-residual bivariate model was attempted but was not estimable given the size and imbalance of the resulting contemporary-group classes; this is reported here as a limitation of the available data structure rather than evidence against the underlying genetic relationships.</w:t>
+        <w:t xml:space="preserve">PAC contemporary groups in this dataset pooled animals across a wide range of ages and physiological stages, and allowing residual variance to differ across these groups changed the estimated variance partitioning materially for several definitions (methane, CH4/MBW, RMTMBW and RMTMBW+CO2), </w:t>
+      </w:r>
+      <w:r>
+        <w:rPr>
+          <w:b w:val="0"/>
+          <w:i w:val="0"/>
+          <w:highlight w:val="cyan"/>
+        </w:rPr>
+        <w:t xml:space="preserve">lowering their heritability relative to a single pooled residual variance; the heterogeneous-residual estimates are therefore the ones reported in Table 2 for these traits and for CH4 ratio.</w:t>
+      </w:r>
+      <w:r>
+        <w:rPr>
+          <w:b w:val="0"/>
+          <w:i w:val="0"/>
+          <w:highlight w:val="yellow"/>
+        </w:rPr>
+        <w:t xml:space="preserve"> This confirms that contemporary-group heterogeneity in absolute scale is a real feature of this dataset. However, the genetic correlation between methane and methane intensity was essentially unchanged whether estimated from the full dataset or from young and mature animals separately (rg = 0.85 in all three cases), and a direct young-versus-mature genetic correlation for methane itself was very high (rg = 0.99). Together these indicate that residual heterogeneity affects how precisely heritability is estimated more than it affects the underlying genetic relationships reported in Tables 3–5. A fully heterogeneous-residual bivariate model was attempted but was not estimable given the size and imbalance of the resulting contemporary-group classes; this is reported here as a limitation of the available data structure rather than evidence against the underlying genetic relationships.</w:t>
       </w:r>
     </w:p>
     <w:p>
@@ -10471,7 +10658,23 @@
           <w:i w:val="0"/>
           <w:highlight w:val="yellow"/>
         </w:rPr>
-        <w:t>This study estimated genetic parameters for nine alternative methane trait definitions in a large, pasture-based sheep population, and shows that these definitions differ meaningfully in their genetic parameters and in their genetic relationships with body size and growth. All definitions were heritable, with estimates ranging from low to moderate (h² = 0.10–0.46). Ratio and residual methane traits remained strongly genetically correlated with absolute daily methane, showing that they share much of the same underlying genetic variation rather than representing a genetically distinct trait. Daily methane itself was strongly and positively genetically correlated with body size and growth, and scaling or residualising methane redistributed this genetic association rather than removing it. The choice of methane trait definition is therefore a substantive genetic decision, not an arbitrary or purely statistical one: it determines the direction and magnitude of the genetic relationship between methane and production. As high-throughput methane phenotyping becomes increasingly routine, characterising these genetic relationships provides a necessary empirical basis for deciding how methane should be defined within pasture-based ruminant breeding objectives.</w:t>
+        <w:t xml:space="preserve">This study estimated genetic parameters for nine alternative methane trait definitions in a large, pasture-based sheep population, and shows that these definitions differ meaningfully in their genetic parameters and in their genetic relationships with body size and growth. All definitions were heritable, with estimates ranging from low to moderate </w:t>
+      </w:r>
+      <w:r>
+        <w:rPr>
+          <w:b w:val="0"/>
+          <w:i w:val="0"/>
+          <w:highlight w:val="cyan"/>
+        </w:rPr>
+        <w:t xml:space="preserve">(h² = 0.12–0.46)</w:t>
+      </w:r>
+      <w:r>
+        <w:rPr>
+          <w:b w:val="0"/>
+          <w:i w:val="0"/>
+          <w:highlight w:val="yellow"/>
+        </w:rPr>
+        <w:t xml:space="preserve">. Ratio and residual methane traits remained strongly genetically correlated with absolute daily methane, showing that they share much of the same underlying genetic variation rather than representing a genetically distinct trait. Daily methane itself was strongly and positively genetically correlated with body size and growth, and scaling or residualising methane redistributed this genetic association rather than removing it. The choice of methane trait definition is therefore a substantive genetic decision, not an arbitrary or purely statistical one: it determines the direction and magnitude of the genetic relationship between methane and production. As high-throughput methane phenotyping becomes increasingly routine, characterising these genetic relationships provides a necessary empirical basis for deciding how methane should be defined within pasture-based ruminant breeding objectives.</w:t>
       </w:r>
       <w:r>
         <w:rPr>

</xml_diff>

<commit_message>
Keep homogeneous-residual heritabilities out of the manuscript
With the heterogeneous-residual estimates now reported for the five traits
where that model converged, the author wants the paper to give one estimate
per trait; quoting the superseded homogeneous values alongside invites
confusion. They move to the response letter so the reviewers can still see
how the estimates changed.

Co-Authored-By: Claude Opus 5.5 <noreply@anthropic.com>
Claude-Session: https://claude.ai/code/session_01DZKgRF7U89yEwDoqLzVxjA
</commit_message>
<xml_diff>
--- a/manuscript/revised/Methane_manuscript_draft5.docx
+++ b/manuscript/revised/Methane_manuscript_draft5.docx
@@ -3064,7 +3064,7 @@
           <w:i w:val="0"/>
           <w:highlight w:val="cyan"/>
         </w:rPr>
-        <w:t xml:space="preserve">CH₄ ratio's heritability was the estimate most sensitive to how residual variance was modelled. Under a single homogeneous residual variance it was 0.10 ± 0.01 (repeatability 0.10 ± 0.01), the lowest of any definition; allowing the residual variance to differ across contemporary-group-mean classes raised it to 0.19 (repeatability 0.32), as its near-zero permanent environmental variance under a single residual recovered once the residual was allowed to vary by class. An independent estimate derived from the component (co)variances of CH₄ and CO₂ gave a similar value (~0.19).</w:t>
+        <w:t xml:space="preserve">CH₄ ratio had a heritability of 0.19 (repeatability 0.32; Table 2), and an independent estimate derived from the component (co)variances of CH₄ and CO₂ gave a similar value (~0.19).</w:t>
       </w:r>
     </w:p>
     <w:p>
@@ -4604,7 +4604,16 @@
           <w:sz w:val="20"/>
           <w:highlight w:val="cyan"/>
         </w:rPr>
-        <w:t xml:space="preserve">Trait abbreviations as in Table 1. For CH₄, CH₄/MBW, CH₄ ratio, RMTMBW and RMTMBW+CO2, estimates are from the model with a heterogeneous residual variance (41 classes of contemporary groups by mean CH₄ within data source); h² and t are means of the class-specific values weighted by number of records, and standard errors are not available for these estimates. Under a single homogeneous residual variance, h² (SE) for these traits was 0.25 (0.02), 0.19 (0.02), 0.10 (0.01), 0.18 (0.02) and 0.18 (0.02), respectively. The remaining traits use a single homogeneous residual variance, as the heterogeneous model was not estimable for them. </w:t>
+        <w:t xml:space="preserve">Trait abbreviations as in Table 1. For CH₄, CH₄/MBW, CH₄ ratio, RMTMBW and RMTMBW+CO2, estimates are from the model with a heterogeneous residual variance (41 classes of contemporary groups by mean CH₄ within data source); h² and t are means of the class-specific values weighted by number of records, and standard errors are not available for these estimates.</w:t>
+      </w:r>
+      <w:r>
+        <w:rPr>
+          <w:b w:val="0"/>
+          <w:i/>
+          <w:sz w:val="20"/>
+          <w:highlight w:val="cyan"/>
+        </w:rPr>
+        <w:t xml:space="preserve"> The remaining traits use a single homogeneous residual variance, as the heterogeneous model was not estimable for them. </w:t>
       </w:r>
       <w:r>
         <w:rPr>
@@ -10476,55 +10485,7 @@
           <w:i w:val="0"/>
           <w:highlight w:val="cyan"/>
         </w:rPr>
-        <w:t xml:space="preserve">Under a single homogeneous residual variance, CH4 ratio's heritability (0.10 ± 0.01) was the lowest of the definitions examined, and lower</w:t>
-      </w:r>
-      <w:r>
-        <w:rPr>
-          <w:b w:val="0"/>
-          <w:i w:val="0"/>
-          <w:highlight w:val="yellow"/>
-        </w:rPr>
-        <w:t xml:space="preserve"> than the 0.17–0.25 (repeatability 0.27–0.43) reported by Jonker et al. [10] in respiration-chamber and PAC-measured lambs and ewes. </w:t>
-      </w:r>
-      <w:r>
-        <w:rPr>
-          <w:b w:val="0"/>
-          <w:i w:val="0"/>
-          <w:highlight w:val="cyan"/>
-        </w:rPr>
-        <w:t xml:space="preserve">Two findings largely close this gap.</w:t>
-      </w:r>
-      <w:r>
-        <w:rPr>
-          <w:b w:val="0"/>
-          <w:i w:val="0"/>
-          <w:highlight w:val="yellow"/>
-        </w:rPr>
-        <w:t xml:space="preserve"> First, expressing the ratio on a molar rather than a mass basis raised its heritability moderately (to 0.13), showing the estimate is somewhat sensitive to the ratio's units, which are stated explicitly here as a mass basis (Methods). Second, allowing residual variance to differ across contemporary-group-mean classes </w:t>
-      </w:r>
-      <w:r>
-        <w:rPr>
-          <w:b w:val="0"/>
-          <w:i w:val="0"/>
-          <w:highlight w:val="cyan"/>
-        </w:rPr>
-        <w:t xml:space="preserve">raised CH4 ratio's heritability to 0.19, the estimate reported in Table 2, driven by</w:t>
-      </w:r>
-      <w:r>
-        <w:rPr>
-          <w:b w:val="0"/>
-          <w:i w:val="0"/>
-          <w:highlight w:val="yellow"/>
-        </w:rPr>
-        <w:t xml:space="preserve"> its near-zero permanent-environmental variance under a single homogeneous residual recovering to a real, non-zero value once that heterogeneity was accommodated; an independent estimate derived from the component (co)variances of CH4 and CO2 gave a similar value. Both point toward CH4 ratio's very small genetic standard deviation, and the specific way its residual variance is structured, as more likely explanations for the discrepancy with Jonker et al.</w:t>
-      </w:r>
-      <w:r>
-        <w:rPr>
-          <w:b w:val="0"/>
-          <w:i w:val="0"/>
-          <w:highlight w:val="cyan"/>
-        </w:rPr>
-        <w:t xml:space="preserve"> than a fundamental problem with the trait itself.</w:t>
+        <w:t xml:space="preserve">CH4 ratio’s heritability (0.19; repeatability 0.32) lies within the 0.17–0.25 (repeatability 0.27–0.43) reported by Jonker et al. [10] in respiration-chamber and PAC-measured lambs and ewes, and an independent estimate derived from the component (co)variances of CH4 and CO2 gave a similar value. This agreement depended on how residual variance was modelled: allowing it to differ across contemporary-group-mean classes allowed the permanent environmental variance of CH4 ratio, a dimensionless proportion with a very small genetic standard deviation, to be estimated as clearly non-zero. CH4 ratio is expressed here on a mass basis (Methods), whereas Jonker et al. used a molar basis; the mass-based ratio is about 0.36 times as large, so its means and variances are not directly comparable between the two studies.</w:t>
       </w:r>
     </w:p>
     <w:p>

</xml_diff>

<commit_message>
Hold both MBW and CO2 at zero in the reference favourable index
CO2 stands in for intake, and higher intake is a feed cost, so the index
should not favour it; the old MBW-only restriction let CO2 rise by 10 g/d.
Holding both at zero costs almost nothing (-0.61 vs -0.63 g/d CH4). Written
around the genetic residual this index needs no extra weights at all, since
that residual is genetically uncorrelated with MBW and CO2, so the text now
says "used alone as the breeding goal" rather than "selected on as it
stands", which that result would contradict.

Co-Authored-By: Claude Opus 5.5 <noreply@anthropic.com>
Claude-Session: https://claude.ai/code/session_01DZKgRF7U89yEwDoqLzVxjA
</commit_message>
<xml_diff>
--- a/manuscript/revised/Methane_manuscript_draft5.docx
+++ b/manuscript/revised/Methane_manuscript_draft5.docx
@@ -179,7 +179,31 @@
           <w:i w:val="0"/>
           <w:highlight w:val="cyan"/>
         </w:rPr>
-        <w:t xml:space="preserve">In a selection index of CH4, MBW and CO2, selecting on any methane trait as it stands, including alternative traits, reduced MBW or, for the CH4/CO2 ratio, increased methane. A favourable region existed, reducing methane by up to 0.63 g day⁻¹ per generation (selection intensity 1) without undesirable MBW or CO2 responses, but reaching it required appropriate index weights on MBW and CO2 alongside absolute or residual methane.</w:t>
+        <w:t xml:space="preserve">In a selection index of CH4, MBW and CO2, using any methane trait alone as the breeding goal reduced MBW or, for the CH4/CO2 ratio, increased methane. A favourable region existed: </w:t>
+      </w:r>
+      <w:r>
+        <w:rPr>
+          <w:b w:val="0"/>
+          <w:i w:val="0"/>
+          <w:highlight w:val="cyan"/>
+        </w:rPr>
+        <w:t xml:space="preserve">holding MBW and CO2 at zero, methane fell by</w:t>
+      </w:r>
+      <w:r>
+        <w:rPr>
+          <w:b w:val="0"/>
+          <w:i w:val="0"/>
+          <w:highlight w:val="cyan"/>
+        </w:rPr>
+        <w:t xml:space="preserve"> 0.61 g day⁻¹ per generation (selection intensity 1), but this required careful weighting of MBW and CO2, </w:t>
+      </w:r>
+      <w:r>
+        <w:rPr>
+          <w:b w:val="0"/>
+          <w:i w:val="0"/>
+          <w:highlight w:val="cyan"/>
+        </w:rPr>
+        <w:t xml:space="preserve">built into the genetic residual or added to other methane traits.</w:t>
       </w:r>
     </w:p>
     <w:p>
@@ -1588,7 +1612,39 @@
           <w:i w:val="0"/>
           <w:highlight w:val="cyan"/>
         </w:rPr>
-        <w:t xml:space="preserve">Each methane trait was evaluated in two ways. First, it was used as the breeding goal as it stands, with no additional weight on MBW or CO2, which corresponds to selecting on that trait alone. Second, additional weights on MBW and CO2 were added to the goal to determine whether, and with what weights, a favourable response could be reached. A response was defined as favourable when CH4 declined and neither MBW nor CO2 declined. The responses attainable by any index of the three traits, and the favourable region within them, are shown in Figure 1.</w:t>
+        <w:t xml:space="preserve">Each methane trait was evaluated in two ways. First, it was used as the breeding goal as it stands, with no additional weight on MBW or CO2, </w:t>
+      </w:r>
+      <w:r>
+        <w:rPr>
+          <w:b w:val="0"/>
+          <w:i w:val="0"/>
+          <w:highlight w:val="cyan"/>
+        </w:rPr>
+        <w:t xml:space="preserve">so that the index aimed to improve that trait alone.</w:t>
+      </w:r>
+      <w:r>
+        <w:rPr>
+          <w:b w:val="0"/>
+          <w:i w:val="0"/>
+          <w:highlight w:val="cyan"/>
+        </w:rPr>
+        <w:t xml:space="preserve"> Second, additional weights on MBW and CO2 were added to the goal to determine whether, and with what weights, a favourable response could be reached. </w:t>
+      </w:r>
+      <w:r>
+        <w:rPr>
+          <w:b w:val="0"/>
+          <w:i w:val="0"/>
+          <w:highlight w:val="cyan"/>
+        </w:rPr>
+        <w:t xml:space="preserve">A response was defined as favourable when CH4 declined and neither MBW nor CO2 declined. CO2 was included as a safeguard against methane reductions achieved through lower intake, not as a trait to increase.</w:t>
+      </w:r>
+      <w:r>
+        <w:rPr>
+          <w:b w:val="0"/>
+          <w:i w:val="0"/>
+          <w:highlight w:val="cyan"/>
+        </w:rPr>
+        <w:t xml:space="preserve"> The responses attainable by any index of the three traits, and the favourable region within them, are shown in Figure 1.</w:t>
       </w:r>
     </w:p>
     <w:p>
@@ -9066,7 +9122,7 @@
         <w:rPr>
           <w:highlight w:val="cyan"/>
         </w:rPr>
-        <w:t xml:space="preserve">Selecting on each methane trait as it stands</w:t>
+        <w:t xml:space="preserve">Each methane trait as the breeding goal</w:t>
       </w:r>
     </w:p>
     <w:p>
@@ -9757,9 +9813,49 @@
                 <w:b/>
                 <w:i w:val="0"/>
                 <w:sz w:val="19"/>
+                <w:highlight w:val="cyan"/>
+              </w:rPr>
+              <w:t xml:space="preserve">Reference: CH4 reduced with MBW and CO2 held at zero (restricted index)</w:t>
+            </w:r>
+          </w:p>
+        </w:tc>
+        <w:tc>
+          <w:tcPr>
+            <w:tcW w:type="dxa" w:w="1300"/>
+          </w:tcPr>
+          <w:p>
+            <w:pPr>
+              <w:jc w:val="center"/>
+            </w:pPr>
+            <w:r/>
+            <w:r>
+              <w:rPr>
+                <w:b/>
+                <w:i w:val="0"/>
+                <w:sz w:val="19"/>
+                <w:highlight w:val="cyan"/>
+              </w:rPr>
+              <w:t xml:space="preserve">−0.61</w:t>
+            </w:r>
+          </w:p>
+        </w:tc>
+        <w:tc>
+          <w:tcPr>
+            <w:tcW w:type="dxa" w:w="1400"/>
+          </w:tcPr>
+          <w:p>
+            <w:pPr>
+              <w:jc w:val="center"/>
+            </w:pPr>
+            <w:r/>
+            <w:r>
+              <w:rPr>
+                <w:b/>
+                <w:i w:val="0"/>
+                <w:sz w:val="19"/>
                 <w:highlight w:val="green"/>
               </w:rPr>
-              <w:t xml:space="preserve">Reference: CH4 reduced with MBW held at zero (restricted index)</w:t>
+              <w:t xml:space="preserve">0.00</w:t>
             </w:r>
           </w:p>
         </w:tc>
@@ -9777,9 +9873,9 @@
                 <w:b/>
                 <w:i w:val="0"/>
                 <w:sz w:val="19"/>
-                <w:highlight w:val="green"/>
-              </w:rPr>
-              <w:t xml:space="preserve">−0.63</w:t>
+                <w:highlight w:val="cyan"/>
+              </w:rPr>
+              <w:t xml:space="preserve">0.0</w:t>
             </w:r>
           </w:p>
         </w:tc>
@@ -9797,49 +9893,9 @@
                 <w:b/>
                 <w:i w:val="0"/>
                 <w:sz w:val="19"/>
-                <w:highlight w:val="green"/>
-              </w:rPr>
-              <w:t xml:space="preserve">0.00</w:t>
-            </w:r>
-          </w:p>
-        </w:tc>
-        <w:tc>
-          <w:tcPr>
-            <w:tcW w:type="dxa" w:w="1300"/>
-          </w:tcPr>
-          <w:p>
-            <w:pPr>
-              <w:jc w:val="center"/>
-            </w:pPr>
-            <w:r/>
-            <w:r>
-              <w:rPr>
-                <w:b/>
-                <w:i w:val="0"/>
-                <w:sz w:val="19"/>
-                <w:highlight w:val="green"/>
-              </w:rPr>
-              <w:t xml:space="preserve">+10.0</w:t>
-            </w:r>
-          </w:p>
-        </w:tc>
-        <w:tc>
-          <w:tcPr>
-            <w:tcW w:type="dxa" w:w="1400"/>
-          </w:tcPr>
-          <w:p>
-            <w:pPr>
-              <w:jc w:val="center"/>
-            </w:pPr>
-            <w:r/>
-            <w:r>
-              <w:rPr>
-                <w:b/>
-                <w:i w:val="0"/>
-                <w:sz w:val="19"/>
-                <w:highlight w:val="green"/>
-              </w:rPr>
-              <w:t xml:space="preserve">Yes (boundary)</w:t>
+                <w:highlight w:val="cyan"/>
+              </w:rPr>
+              <w:t xml:space="preserve">Yes</w:t>
             </w:r>
           </w:p>
         </w:tc>
@@ -9857,7 +9913,7 @@
           <w:sz w:val="20"/>
           <w:highlight w:val="cyan"/>
         </w:rPr>
-        <w:t xml:space="preserve">Indices used the phenotypes of CH4, MBW and CO2. Favourable: CH4 reduced, MBW and CO2 not reduced. Ratios are linearised around the trait means. The final row is the largest favourable response, for comparison (Figure 1; Table 8).</w:t>
+        <w:t xml:space="preserve">Indices used the phenotypes of CH4, MBW and CO2. Favourable: CH4 reduced, MBW and CO2 not reduced. Ratios are linearised around the trait means. The final row is the reference favourable index, which holds MBW and CO2 at zero response (Figure 1; Table 8).</w:t>
       </w:r>
     </w:p>
     <w:p>
@@ -9881,7 +9937,7 @@
           <w:i w:val="0"/>
           <w:highlight w:val="cyan"/>
         </w:rPr>
-        <w:t xml:space="preserve">A favourable region, in which CH4 is reduced without a decline in MBW, does exist (Figure 1), and along its boundary the correlated CO2 response was also positive (+10.1 to +64.5 g day⁻¹). The region is small, covering about 6.5% of the area of attainable responses in Figure 1, because CH4 is strongly genetically correlated with both MBW and CO2. The largest favourable methane reduction was −0.63 g day⁻¹, 47% of the response to selection on absolute CH4, obtained from an index restricted to zero MBW response (Kempthorne and Nordskog [43]; related to the desired-gains approach [41]), with a CO2 increase of 10.0 g day⁻¹.</w:t>
+        <w:t xml:space="preserve">A favourable region, in which CH4 is reduced without a decline in MBW, does exist (Figure 1), and along its boundary the correlated CO2 response was positive (+10.1 to +64.5 g day⁻¹). The region is small, covering about 6.5% of the area of attainable responses in Figure 1, because CH4 is strongly genetically correlated with both MBW and CO2. Holding both MBW and CO2 at zero response (Kempthorne and Nordskog [43]; related to the desired-gains approach [41]) reduced methane by 0.61 g day⁻¹, 46% of the response to selection on absolute CH4. Holding MBW alone at zero gave a similar reduction (0.63 g day⁻¹) but increased CO2 by 10.0 g day⁻¹, so the index holding both at zero is used as the reference favourable response.</w:t>
       </w:r>
     </w:p>
     <w:p>
@@ -9934,7 +9990,15 @@
           <w:i w:val="0"/>
           <w:highlight w:val="cyan"/>
         </w:rPr>
-        <w:t xml:space="preserve">Figure 1. Responses in methane (CH4) and metabolic body weight (MBW) attainable per generation (selection intensity 1) by any index of CH4, MBW and CO2. Colour shows the correlated response in CO2 (g day⁻¹). The shaded area is the favourable region, in which CH4 is reduced and MBW is not; the CO2 response along its boundary is positive (+10.1 to +64.5 g day⁻¹).</w:t>
+        <w:t xml:space="preserve">Figure 1. Responses in methane (CH4) and metabolic body weight (MBW) attainable per generation (selection intensity 1) by any index of CH4, MBW and CO2. Colour shows the correlated response in CO2 (g day⁻¹). The shaded area is the favourable region, in which CH4 is reduced and MBW is not; </w:t>
+      </w:r>
+      <w:r>
+        <w:rPr>
+          <w:b/>
+          <w:i w:val="0"/>
+          <w:highlight w:val="cyan"/>
+        </w:rPr>
+        <w:t xml:space="preserve">the CO2 response along its boundary is positive (+10.1 to +64.5 g day⁻¹). The reference favourable index, with MBW and CO2 held at zero, lies on the region’s MBW = 0 edge at a CH4 response of −0.61 g day⁻¹.</w:t>
       </w:r>
     </w:p>
     <w:p>
@@ -9947,7 +10011,7 @@
           <w:i w:val="0"/>
           <w:highlight w:val="cyan"/>
         </w:rPr>
-        <w:t xml:space="preserve">This favourable response can be reached whichever methane trait the index is built on, provided MBW and CO2 are weighted appropriately alongside it (Table 8). Absolute CH4 and the genetic and phenotypic residual traits each reached it, with the same weight on the methane term but different weights on MBW and CO2, because each residual already carries part of the adjustment for MBW and CO2. As they stand, the residual traits and the CH4/MBW ratio fell just short of the region (Table 7): the adjustment for body size they carry was close to, but less than, that required. Ratio traits are not shown in Table 8, because a ratio with additional weights is no longer a ratio.</w:t>
+        <w:t xml:space="preserve">This favourable response can be reached whichever methane trait the index is built on (Table 8). The three rows of Table 8 are the same index, with the same weight on the methane term; only the weights on MBW and CO2 differ. Written around the genetic residual, the index needs no additional weight on MBW or CO2: as that residual is constructed from the genetic regression of CH4 on MBW and CO2, it is genetically uncorrelated with both, and selecting on it holds both at zero response [33]. Absolute CH4 and the phenotypic residual (RMTMBW+CO2) reach the same response only with additional weights on MBW and CO2. Used instead as breeding goals (Table 7), the residual traits fell just short of the region, as the index that best predicts a residual breeding value also draws on the phenotypic covariances among the three traits. Ratio traits are not shown in Table 8, because a ratio with additional weights is no longer a ratio.</w:t>
       </w:r>
     </w:p>
     <w:p>
@@ -9961,7 +10025,7 @@
           <w:i w:val="0"/>
           <w:highlight w:val="cyan"/>
         </w:rPr>
-        <w:t xml:space="preserve">Table 8. Index weights giving the largest favourable response (CH4 reduced, MBW held at zero response), written for each methane trait.</w:t>
+        <w:t xml:space="preserve">Table 8. Index weights giving the reference favourable response (CH4 reduced, MBW and CO2 held at zero response), written for each methane trait.</w:t>
       </w:r>
     </w:p>
     <w:tbl>
@@ -10099,9 +10163,9 @@
                 <w:b w:val="0"/>
                 <w:i w:val="0"/>
                 <w:sz w:val="19"/>
-                <w:highlight w:val="green"/>
-              </w:rPr>
-              <w:t xml:space="preserve">−0.1727</w:t>
+                <w:highlight w:val="cyan"/>
+              </w:rPr>
+              <w:t xml:space="preserve">−0.1618</w:t>
             </w:r>
           </w:p>
         </w:tc>
@@ -10119,9 +10183,9 @@
                 <w:b w:val="0"/>
                 <w:i w:val="0"/>
                 <w:sz w:val="19"/>
-                <w:highlight w:val="green"/>
-              </w:rPr>
-              <w:t xml:space="preserve">0.0877</w:t>
+                <w:highlight w:val="cyan"/>
+              </w:rPr>
+              <w:t xml:space="preserve">0.1348</w:t>
             </w:r>
           </w:p>
         </w:tc>
@@ -10139,9 +10203,9 @@
                 <w:b w:val="0"/>
                 <w:i w:val="0"/>
                 <w:sz w:val="19"/>
-                <w:highlight w:val="green"/>
-              </w:rPr>
-              <w:t xml:space="preserve">6.901×10⁻⁴</w:t>
+                <w:highlight w:val="cyan"/>
+              </w:rPr>
+              <w:t xml:space="preserve">−9.856×10⁻⁶</w:t>
             </w:r>
           </w:p>
         </w:tc>
@@ -10184,9 +10248,9 @@
                 <w:b w:val="0"/>
                 <w:i w:val="0"/>
                 <w:sz w:val="19"/>
-                <w:highlight w:val="green"/>
-              </w:rPr>
-              <w:t xml:space="preserve">−0.1727</w:t>
+                <w:highlight w:val="cyan"/>
+              </w:rPr>
+              <w:t xml:space="preserve">−0.1618</w:t>
             </w:r>
           </w:p>
         </w:tc>
@@ -10204,9 +10268,9 @@
                 <w:b w:val="0"/>
                 <w:i w:val="0"/>
                 <w:sz w:val="19"/>
-                <w:highlight w:val="green"/>
-              </w:rPr>
-              <w:t xml:space="preserve">−0.0562</w:t>
+                <w:highlight w:val="cyan"/>
+              </w:rPr>
+              <w:t xml:space="preserve">0</w:t>
             </w:r>
           </w:p>
         </w:tc>
@@ -10224,9 +10288,9 @@
                 <w:b w:val="0"/>
                 <w:i w:val="0"/>
                 <w:sz w:val="19"/>
-                <w:highlight w:val="green"/>
-              </w:rPr>
-              <w:t xml:space="preserve">7.006×10⁻⁴</w:t>
+                <w:highlight w:val="cyan"/>
+              </w:rPr>
+              <w:t xml:space="preserve">0</w:t>
             </w:r>
           </w:p>
         </w:tc>
@@ -10269,9 +10333,9 @@
                 <w:b w:val="0"/>
                 <w:i w:val="0"/>
                 <w:sz w:val="19"/>
-                <w:highlight w:val="green"/>
-              </w:rPr>
-              <w:t xml:space="preserve">−0.1727</w:t>
+                <w:highlight w:val="cyan"/>
+              </w:rPr>
+              <w:t xml:space="preserve">−0.1618</w:t>
             </w:r>
           </w:p>
         </w:tc>
@@ -10289,9 +10353,9 @@
                 <w:b w:val="0"/>
                 <w:i w:val="0"/>
                 <w:sz w:val="19"/>
-                <w:highlight w:val="green"/>
-              </w:rPr>
-              <w:t xml:space="preserve">0.0147</w:t>
+                <w:highlight w:val="cyan"/>
+              </w:rPr>
+              <w:t xml:space="preserve">0.0664</w:t>
             </w:r>
           </w:p>
         </w:tc>
@@ -10309,9 +10373,9 @@
                 <w:b w:val="0"/>
                 <w:i w:val="0"/>
                 <w:sz w:val="19"/>
-                <w:highlight w:val="green"/>
-              </w:rPr>
-              <w:t xml:space="preserve">4.979×10⁻⁵</w:t>
+                <w:highlight w:val="cyan"/>
+              </w:rPr>
+              <w:t xml:space="preserve">−6.095×10⁻⁴</w:t>
             </w:r>
           </w:p>
         </w:tc>
@@ -10527,7 +10591,23 @@
           <w:i w:val="0"/>
           <w:highlight w:val="cyan"/>
         </w:rPr>
-        <w:t xml:space="preserve">Alternative methane traits are frequently proposed as selection criteria, and the selection index analysis shows the pitfalls of selecting on any methane trait as it stands. Selecting on absolute methane gave the largest methane reduction, but with correlated reductions in body size and CO2, as expected from genetic correlations of 0.69 with MBW and 0.57 with CO2 and in line with the unfavourable association between methane and size reported previously [11, 12]. The ratio and residual traits reduced body size by much less, consistent with the redistribution of genetic associations seen in Tables 3–5, but none of them, as they stand, avoided a decline in body size, and the CH4/CO2 ratio was predicted to increase methane.</w:t>
+        <w:t xml:space="preserve">Alternative methane traits are frequently proposed as selection criteria, and the selection index analysis </w:t>
+      </w:r>
+      <w:r>
+        <w:rPr>
+          <w:b w:val="0"/>
+          <w:i w:val="0"/>
+          <w:highlight w:val="cyan"/>
+        </w:rPr>
+        <w:t xml:space="preserve">shows the pitfalls of using any methane trait alone as the breeding goal.</w:t>
+      </w:r>
+      <w:r>
+        <w:rPr>
+          <w:b w:val="0"/>
+          <w:i w:val="0"/>
+          <w:highlight w:val="cyan"/>
+        </w:rPr>
+        <w:t xml:space="preserve"> Selecting on absolute methane gave the largest methane reduction, but with correlated reductions in body size and CO2, as expected from genetic correlations of 0.69 with MBW and 0.57 with CO2 and in line with the unfavourable association between methane and size reported previously [11, 12]. The ratio and residual traits reduced body size by much less, consistent with the redistribution of genetic associations seen in Tables 3–5, but none of them, as they stand, avoided a decline in body size, and the CH4/CO2 ratio was predicted to increase methane.</w:t>
       </w:r>
     </w:p>
     <w:p>
@@ -10540,7 +10620,7 @@
           <w:i w:val="0"/>
           <w:highlight w:val="cyan"/>
         </w:rPr>
-        <w:t xml:space="preserve">A favourable region, in which methane is reduced without a decline in body size or CO2, does nevertheless exist. It is small, and reaching it depends on how body size and CO2 are weighted alongside methane. A ratio or residual trait is, in effect, a fixed weighting of methane against its denominator or adjustment trait [33], and as defined here these fixed weightings fell just short of the favourable region. With appropriate additional weights on MBW and CO2, the same favourable response was obtained whether the index was built on absolute methane or on a residual methane trait. This agrees with the observation that direct multi-trait selection can match or outperform selection on a ratio [36, 37, 38], and with the long-standing debate over ratio, residual and index selection for feed efficiency [22, 23]. How close a given ratio or residual lies to the favourable region depends on the genetic parameters, so the weights reported here are specific to this population and should not be generalised.</w:t>
+        <w:t xml:space="preserve">A favourable region, in which methane is reduced without a decline in body size or CO2, does nevertheless exist. It is small, and reaching it depends on how body size and CO2 are weighted alongside methane. A ratio or residual trait is, in effect, a fixed weighting of methane against its denominator or adjustment trait [33], and used alone as breeding goals these fixed weightings fell just short of the favourable region. The genetic residual is the exception when used directly as the selection criterion: constructed from the genetic regression of methane on MBW and CO2, it holds both at zero response and reproduces the restricted index [33]. The weighting is then built into the trait, but it depends on estimated genetic (co)variances. Absolute methane and the phenotypic residual reached the same response only with additional weights on MBW and CO2. This agrees with the observation that direct multi-trait selection can match or outperform selection on a ratio [36, 37, 38], and with the long-standing debate over ratio, residual and index selection for feed efficiency [22, 23]. The weights reported here depend on the genetic parameters, so they are specific to this population and should not be generalised.</w:t>
       </w:r>
     </w:p>
     <w:p>
@@ -10651,7 +10731,7 @@
           <w:i w:val="0"/>
           <w:highlight w:val="cyan"/>
         </w:rPr>
-        <w:t xml:space="preserve">In a selection index of methane, metabolic body weight and CO2, selecting on any methane trait as it stands, whether absolute or alternative, did not give a favourable response. A favourable region, in which methane is reduced without a decline in body size or CO2, does exist, but reaching it requires careful weighting of body size and CO2 alongside methane, including when alternative methane traits are used.</w:t>
+        <w:t xml:space="preserve">In a selection index of methane, metabolic body weight and CO2, using any methane trait alone as the breeding goal, whether absolute or alternative, did not give a favourable response. A favourable region, in which methane is reduced without changing body size or CO2, does exist, but reaching it requires careful weighting of body size and CO2 alongside methane, including when alternative methane traits are used.</w:t>
       </w:r>
     </w:p>
     <w:p>
@@ -11796,9 +11876,49 @@
                 <w:b w:val="0"/>
                 <w:i w:val="0"/>
                 <w:sz w:val="19"/>
+                <w:highlight w:val="cyan"/>
+              </w:rPr>
+              <w:t xml:space="preserve">Reference: CH4 reduced, MBW and CO2 held at zero</w:t>
+            </w:r>
+          </w:p>
+        </w:tc>
+        <w:tc>
+          <w:tcPr>
+            <w:tcW w:type="dxa" w:w="1100"/>
+          </w:tcPr>
+          <w:p>
+            <w:pPr>
+              <w:jc w:val="center"/>
+            </w:pPr>
+            <w:r/>
+            <w:r>
+              <w:rPr>
+                <w:b w:val="0"/>
+                <w:i w:val="0"/>
+                <w:sz w:val="19"/>
+                <w:highlight w:val="cyan"/>
+              </w:rPr>
+              <w:t xml:space="preserve">−1.04</w:t>
+            </w:r>
+          </w:p>
+        </w:tc>
+        <w:tc>
+          <w:tcPr>
+            <w:tcW w:type="dxa" w:w="1000"/>
+          </w:tcPr>
+          <w:p>
+            <w:pPr>
+              <w:jc w:val="center"/>
+            </w:pPr>
+            <w:r/>
+            <w:r>
+              <w:rPr>
+                <w:b w:val="0"/>
+                <w:i w:val="0"/>
+                <w:sz w:val="19"/>
                 <w:highlight w:val="green"/>
               </w:rPr>
-              <w:t xml:space="preserve">Reference: CH4 reduced, MBW held at zero</w:t>
+              <w:t xml:space="preserve">0.00</w:t>
             </w:r>
           </w:p>
         </w:tc>
@@ -11816,9 +11936,49 @@
                 <w:b w:val="0"/>
                 <w:i w:val="0"/>
                 <w:sz w:val="19"/>
+                <w:highlight w:val="cyan"/>
+              </w:rPr>
+              <w:t xml:space="preserve">0.0</w:t>
+            </w:r>
+          </w:p>
+        </w:tc>
+        <w:tc>
+          <w:tcPr>
+            <w:tcW w:type="dxa" w:w="1000"/>
+          </w:tcPr>
+          <w:p>
+            <w:pPr>
+              <w:jc w:val="center"/>
+            </w:pPr>
+            <w:r/>
+            <w:r>
+              <w:rPr>
+                <w:b w:val="0"/>
+                <w:i w:val="0"/>
+                <w:sz w:val="19"/>
+                <w:highlight w:val="cyan"/>
+              </w:rPr>
+              <w:t xml:space="preserve">−0.37</w:t>
+            </w:r>
+          </w:p>
+        </w:tc>
+        <w:tc>
+          <w:tcPr>
+            <w:tcW w:type="dxa" w:w="1000"/>
+          </w:tcPr>
+          <w:p>
+            <w:pPr>
+              <w:jc w:val="center"/>
+            </w:pPr>
+            <w:r/>
+            <w:r>
+              <w:rPr>
+                <w:b w:val="0"/>
+                <w:i w:val="0"/>
+                <w:sz w:val="19"/>
                 <w:highlight w:val="green"/>
               </w:rPr>
-              <w:t xml:space="preserve">−1.07</w:t>
+              <w:t xml:space="preserve">0.00</w:t>
             </w:r>
           </w:p>
         </w:tc>
@@ -11836,89 +11996,9 @@
                 <w:b w:val="0"/>
                 <w:i w:val="0"/>
                 <w:sz w:val="19"/>
-                <w:highlight w:val="green"/>
-              </w:rPr>
-              <w:t xml:space="preserve">0.00</w:t>
-            </w:r>
-          </w:p>
-        </w:tc>
-        <w:tc>
-          <w:tcPr>
-            <w:tcW w:type="dxa" w:w="1100"/>
-          </w:tcPr>
-          <w:p>
-            <w:pPr>
-              <w:jc w:val="center"/>
-            </w:pPr>
-            <w:r/>
-            <w:r>
-              <w:rPr>
-                <w:b w:val="0"/>
-                <w:i w:val="0"/>
-                <w:sz w:val="19"/>
-                <w:highlight w:val="green"/>
-              </w:rPr>
-              <w:t xml:space="preserve">+17.0</w:t>
-            </w:r>
-          </w:p>
-        </w:tc>
-        <w:tc>
-          <w:tcPr>
-            <w:tcW w:type="dxa" w:w="1000"/>
-          </w:tcPr>
-          <w:p>
-            <w:pPr>
-              <w:jc w:val="center"/>
-            </w:pPr>
-            <w:r/>
-            <w:r>
-              <w:rPr>
-                <w:b w:val="0"/>
-                <w:i w:val="0"/>
-                <w:sz w:val="19"/>
-                <w:highlight w:val="green"/>
-              </w:rPr>
-              <w:t xml:space="preserve">−0.38</w:t>
-            </w:r>
-          </w:p>
-        </w:tc>
-        <w:tc>
-          <w:tcPr>
-            <w:tcW w:type="dxa" w:w="1000"/>
-          </w:tcPr>
-          <w:p>
-            <w:pPr>
-              <w:jc w:val="center"/>
-            </w:pPr>
-            <w:r/>
-            <w:r>
-              <w:rPr>
-                <w:b w:val="0"/>
-                <w:i w:val="0"/>
-                <w:sz w:val="19"/>
-                <w:highlight w:val="green"/>
-              </w:rPr>
-              <w:t xml:space="preserve">0.00</w:t>
-            </w:r>
-          </w:p>
-        </w:tc>
-        <w:tc>
-          <w:tcPr>
-            <w:tcW w:type="dxa" w:w="1000"/>
-          </w:tcPr>
-          <w:p>
-            <w:pPr>
-              <w:jc w:val="center"/>
-            </w:pPr>
-            <w:r/>
-            <w:r>
-              <w:rPr>
-                <w:b w:val="0"/>
-                <w:i w:val="0"/>
-                <w:sz w:val="19"/>
-                <w:highlight w:val="green"/>
-              </w:rPr>
-              <w:t xml:space="preserve">+6.1</w:t>
+                <w:highlight w:val="cyan"/>
+              </w:rPr>
+              <w:t xml:space="preserve">0.0</w:t>
             </w:r>
           </w:p>
         </w:tc>

</xml_diff>

<commit_message>
Note that careful weighting can trade methane against MBW and intake
The author wants the paper to make clear that the favourable region is a
range, not one point: weights can reduce methane while also selecting
animals with slightly higher body size or intake, at some cost in methane
reduction. The MBW = CO2 = 0 reference is presented as the neutral choice.

Co-Authored-By: Claude Opus 5.5 <noreply@anthropic.com>
Claude-Session: https://claude.ai/code/session_01DZKgRF7U89yEwDoqLzVxjA
</commit_message>
<xml_diff>
--- a/manuscript/revised/Methane_manuscript_draft5.docx
+++ b/manuscript/revised/Methane_manuscript_draft5.docx
@@ -9937,7 +9937,15 @@
           <w:i w:val="0"/>
           <w:highlight w:val="cyan"/>
         </w:rPr>
-        <w:t xml:space="preserve">A favourable region, in which CH4 is reduced without a decline in MBW, does exist (Figure 1), and along its boundary the correlated CO2 response was positive (+10.1 to +64.5 g day⁻¹). The region is small, covering about 6.5% of the area of attainable responses in Figure 1, because CH4 is strongly genetically correlated with both MBW and CO2. Holding both MBW and CO2 at zero response (Kempthorne and Nordskog [43]; related to the desired-gains approach [41]) reduced methane by 0.61 g day⁻¹, 46% of the response to selection on absolute CH4. Holding MBW alone at zero gave a similar reduction (0.63 g day⁻¹) but increased CO2 by 10.0 g day⁻¹, so the index holding both at zero is used as the reference favourable response.</w:t>
+        <w:t xml:space="preserve">A favourable region, in which CH4 is reduced without a decline in MBW, does exist (Figure 1), and along its boundary the correlated CO2 response was positive (+10.1 to +64.5 g day⁻¹). The region is small, covering about 6.5% of the area of attainable responses in Figure 1, because CH4 is strongly genetically correlated with both MBW and CO2. Holding both MBW and CO2 at zero response (Kempthorne and Nordskog [43]; related to the desired-gains approach [41]) reduced methane by 0.61 g day⁻¹, 46% of the response to selection on absolute CH4. Holding MBW alone at zero gave a similar reduction (0.63 g day⁻¹) but increased CO2 by 10.0 g day⁻¹, </w:t>
+      </w:r>
+      <w:r>
+        <w:rPr>
+          <w:b w:val="0"/>
+          <w:i w:val="0"/>
+          <w:highlight w:val="cyan"/>
+        </w:rPr>
+        <w:t xml:space="preserve">so the index holding both at zero is used as the reference favourable response. Within the region, the weighting sets the balance between the three traits: an index that increased MBW by 0.12 kg⁰·⁷⁵ and CO2 by 20.7 g day⁻¹ still reduced CH4 by 0.52 g day⁻¹, and some methane reduction remained possible up to an MBW increase of about 0.64 kg⁰·⁷⁵ (Figure 1).</w:t>
       </w:r>
     </w:p>
     <w:p>
@@ -10620,7 +10628,23 @@
           <w:i w:val="0"/>
           <w:highlight w:val="cyan"/>
         </w:rPr>
-        <w:t xml:space="preserve">A favourable region, in which methane is reduced without a decline in body size or CO2, does nevertheless exist. It is small, and reaching it depends on how body size and CO2 are weighted alongside methane. A ratio or residual trait is, in effect, a fixed weighting of methane against its denominator or adjustment trait [33], and used alone as breeding goals these fixed weightings fell just short of the favourable region. The genetic residual is the exception when used directly as the selection criterion: constructed from the genetic regression of methane on MBW and CO2, it holds both at zero response and reproduces the restricted index [33]. The weighting is then built into the trait, but it depends on estimated genetic (co)variances. Absolute methane and the phenotypic residual reached the same response only with additional weights on MBW and CO2. This agrees with the observation that direct multi-trait selection can match or outperform selection on a ratio [36, 37, 38], and with the long-standing debate over ratio, residual and index selection for feed efficiency [22, 23]. The weights reported here depend on the genetic parameters, so they are specific to this population and should not be generalised.</w:t>
+        <w:t xml:space="preserve">A favourable region, in which methane is reduced without a decline in body size or CO2, does nevertheless exist. </w:t>
+      </w:r>
+      <w:r>
+        <w:rPr>
+          <w:b w:val="0"/>
+          <w:i w:val="0"/>
+          <w:highlight w:val="cyan"/>
+        </w:rPr>
+        <w:t xml:space="preserve">It is small, and reaching it depends on how body size and CO2 are weighted alongside methane. The region is also not a single point: with careful weighting, methane can be reduced while selecting animals with slightly higher body size or intake, as proxied by CO2, at the cost of a smaller methane reduction. Where an index should sit within the region depends on the value placed on body size, intake and emissions in a given production system [35, 39, 40]; the reference index used here, which holds both at zero response, is the neutral choice.</w:t>
+      </w:r>
+      <w:r>
+        <w:rPr>
+          <w:b w:val="0"/>
+          <w:i w:val="0"/>
+          <w:highlight w:val="cyan"/>
+        </w:rPr>
+        <w:t xml:space="preserve"> A ratio or residual trait is, in effect, a fixed weighting of methane against its denominator or adjustment trait [33], and used alone as breeding goals these fixed weightings fell just short of the favourable region. The genetic residual is the exception when used directly as the selection criterion: constructed from the genetic regression of methane on MBW and CO2, it holds both at zero response and reproduces the restricted index [33]. The weighting is then built into the trait, but it depends on estimated genetic (co)variances. Absolute methane and the phenotypic residual reached the same response only with additional weights on MBW and CO2. This agrees with the observation that direct multi-trait selection can match or outperform selection on a ratio [36, 37, 38], and with the long-standing debate over ratio, residual and index selection for feed efficiency [22, 23]. The weights reported here depend on the genetic parameters, so they are specific to this population and should not be generalised.</w:t>
       </w:r>
     </w:p>
     <w:p>

</xml_diff>